<commit_message>
Parte 3: grabar video de la sesion, subirlo a Storage y verlo el fisioterapeuta
Decision del asesor de tesis: el fisioterapeuta debe poder ver lo que realiza el paciente. CameraX graba (VideoCapture, sin audio, SD) en paralelo al analisis de MediaPipe; al completar la sesion se sube a Storage (sesiones/{pacienteId}/{sesionId}.mp4) y la URL queda en Sesion.videoUrl; el fisio lo reproduce con 'Ver video de la sesion'. Si el dispositivo no soporta la combinacion de casos de uso, la sesion sigue sin video; si se abandona con Salir, el video se descarta.

- Subida en alcance de aplicacion (SubidorVideoSesion) para que sobreviva al cambio de pantalla.
- Cierre seguro: se espera al analizador antes de liberar MediaPipe (evita SIGSEGV) y no se reconfigura la camara mientras se finaliza el archivo.
- Consentimiento informado actualizado (clave aceptado_v2: todos lo vuelven a aceptar), Storage Rules, CLAUDE.md (enmienda a RNF06/HU17-CA02/regla 1) y manual de usuario.
</commit_message>
<xml_diff>
--- a/docs/Manual_Usuario_SANNA.docx
+++ b/docs/Manual_Usuario_SANNA.docx
@@ -229,7 +229,7 @@
           <w:sz w:val="21"/>
           <w:szCs w:val="21"/>
         </w:rPr>
-        <w:t xml:space="preserve">Todo el análisis de la postura se procesa dentro del propio dispositivo del paciente (tecnología conocida como "Edge AI"): en ningún momento se graba ni se envía video o imágenes a internet. Únicamente se guardan datos numéricos (ángulos articulares y porcentajes de ejecución), lo que protege la privacidad del paciente conforme a la Ley N.° 29733 de Protección de Datos Personales.</w:t>
+        <w:t xml:space="preserve">Todo el análisis de la postura se procesa dentro del propio dispositivo del paciente (tecnología conocida como "Edge AI"): el análisis nunca depende de internet. Además de los datos numéricos (ángulos articulares y porcentajes de ejecución), durante cada sesión se graba un video del ejercicio (sin audio) que se guarda de forma segura para que el fisioterapeuta asignado pueda revisar cómo lo realiza el paciente. El paciente es informado de ello y debe aceptarlo mediante el consentimiento informado, conforme a la Ley N.° 29733 de Protección de Datos Personales.</w:t>
       </w:r>
     </w:p>
     <w:p>
@@ -891,7 +891,7 @@
           <w:sz w:val="21"/>
           <w:szCs w:val="21"/>
         </w:rPr>
-        <w:t xml:space="preserve">La primera vez que un paciente o fisioterapeuta inicia sesión, el sistema muestra la pantalla "Consentimiento informado" antes de continuar, explicando que el análisis de postura se procesa en el propio dispositivo, que nunca se graba ni se sube video a internet, que el fisioterapeuta asignado puede ver los resultados de las sesiones, y que la aplicación puede usarse sin conexión sincronizando los datos después. Para continuar, el usuario debe presionar el botón Acepto y quiero continuar.</w:t>
+        <w:t xml:space="preserve">La primera vez que un paciente o fisioterapeuta inicia sesión, el sistema muestra la pantalla "Consentimiento informado" antes de continuar, explicando que el análisis de postura se procesa en el propio dispositivo, que durante cada sesión se graba un video del ejercicio (sin audio) que se guarda de forma segura, que solo el fisioterapeuta asignado puede ver los resultados y el video de las sesiones, y que la aplicación puede usarse sin conexión sincronizando los datos después. Para continuar, el usuario debe presionar el botón Acepto y quiero continuar.</w:t>
       </w:r>
     </w:p>
     <w:p>
@@ -2684,7 +2684,7 @@
           <w:sz w:val="21"/>
           <w:szCs w:val="21"/>
         </w:rPr>
-        <w:t xml:space="preserve">Todo el análisis se procesa dentro del dispositivo: no se graba ni se envía video a ningún servidor (ver sección 1, Introducción).</w:t>
+        <w:t xml:space="preserve">El análisis de postura se procesa dentro del dispositivo. Durante la sesión también se graba un video (sin audio) que se guarda de forma segura para que el fisioterapeuta pueda revisarlo (ver sección 1, Introducción). Si se abandona la sesión con Salir, el video se descarta.</w:t>
       </w:r>
     </w:p>
     <w:p>
@@ -6600,6 +6600,29 @@
           <w:szCs w:val="21"/>
         </w:rPr>
         <w:t xml:space="preserve">Revisar "Ángulos por articulación".</w:t>
+      </w:r>
+    </w:p>
+    <w:p>
+      <w:pPr>
+        <w:spacing w:after="100" w:line="264"/>
+      </w:pPr>
+      <w:r>
+        <w:rPr>
+          <w:b/>
+          <w:bCs/>
+          <w:color w:val="0E7A70"/>
+          <w:sz w:val="21"/>
+          <w:szCs w:val="21"/>
+        </w:rPr>
+        <w:t xml:space="preserve">Paso 5: </w:t>
+      </w:r>
+      <w:r>
+        <w:rPr>
+          <w:color w:val="1F2937"/>
+          <w:sz w:val="21"/>
+          <w:szCs w:val="21"/>
+        </w:rPr>
+        <w:t xml:space="preserve">Presionar Ver video de la sesión para reproducir la grabación del ejercicio realizada por el paciente y presionar Cerrar al terminar.</w:t>
       </w:r>
     </w:p>
     <w:p>
@@ -12923,7 +12946,7 @@
                 <w:sz w:val="19"/>
                 <w:szCs w:val="19"/>
               </w:rPr>
-              <w:t xml:space="preserve">Análisis de la postura que se realiza dentro del propio teléfono del paciente, sin enviar video a internet.</w:t>
+              <w:t xml:space="preserve">Análisis de la postura que se realiza dentro del propio teléfono del paciente, sin depender de internet para el análisis.</w:t>
             </w:r>
           </w:p>
         </w:tc>

</xml_diff>

<commit_message>
Manual de usuario v1.1: pantallas nuevas del paciente, Resultados del fisio y dashboard por paciente del admin
</commit_message>
<xml_diff>
--- a/docs/Manual_Usuario_SANNA.docx
+++ b/docs/Manual_Usuario_SANNA.docx
@@ -95,7 +95,7 @@
           <w:sz w:val="22"/>
           <w:szCs w:val="22"/>
         </w:rPr>
-        <w:t xml:space="preserve">Versión del sistema: 1.0 (rama mejora-videos)</w:t>
+        <w:t>Versión del sistema: 1.1 (rama mejora-videos)</w:t>
       </w:r>
     </w:p>
     <w:p>
@@ -109,7 +109,7 @@
           <w:sz w:val="22"/>
           <w:szCs w:val="22"/>
         </w:rPr>
-        <w:t xml:space="preserve">Fecha de elaboración: 17 de septiembre de 2026</w:t>
+        <w:t>Fecha de elaboración: 17 de septiembre de 2026 · Actualizado: 18 de septiembre de 2026</w:t>
       </w:r>
     </w:p>
     <w:p>
@@ -455,7 +455,7 @@
           <w:sz w:val="21"/>
           <w:szCs w:val="21"/>
         </w:rPr>
-        <w:t xml:space="preserve">Administrador: gestiona las cuentas de pacientes y fisioterapeutas de la clínica, y consulta un panel general de estadísticas.</w:t>
+        <w:t>Administrador: gestiona las cuentas de pacientes y fisioterapeutas de la clínica, y consulta el dashboard de progreso de cada paciente.</w:t>
       </w:r>
     </w:p>
     <w:p>
@@ -1253,7 +1253,7 @@
                 <w:sz w:val="19"/>
                 <w:szCs w:val="19"/>
               </w:rPr>
-              <w:t xml:space="preserve">Ejercicios · Progreso · Perfil</w:t>
+              <w:t>Ejercicios · Resultados · Progreso · Perfil</w:t>
             </w:r>
           </w:p>
         </w:tc>
@@ -1931,7 +1931,7 @@
           <w:sz w:val="21"/>
           <w:szCs w:val="21"/>
         </w:rPr>
-        <w:t xml:space="preserve">Presenta la ficha de un ejercicio asignado, con sus instrucciones y el material audiovisual de apoyo (video o imagen), antes de comenzar a ejecutarlo.</w:t>
+        <w:t xml:space="preserve">Presenta la ficha de un ejercicio asignado: el video o imagen de apoyo, cómo realizarlo, el ángulo objetivo, el número de repeticiones y la nota del fisioterapeuta, antes de comenzar a ejecutarlo.</w:t>
       </w:r>
     </w:p>
     <w:p>
@@ -1961,7 +1961,7 @@
           <w:sz w:val="21"/>
           <w:szCs w:val="21"/>
         </w:rPr>
-        <w:t xml:space="preserve">Desde "Ejercicios", al seleccionar una tarjeta de la lista.</w:t>
+        <w:t xml:space="preserve">Desde "Ejercicios", al seleccionar una tarjeta de la lista o la tarjeta "Próxima sesión".</w:t>
       </w:r>
     </w:p>
     <w:p>
@@ -2001,7 +2001,7 @@
           <w:sz w:val="21"/>
           <w:szCs w:val="21"/>
         </w:rPr>
-        <w:t xml:space="preserve">Seleccionar el ejercicio deseado desde la lista de "Ejercicios".</w:t>
+        <w:t xml:space="preserve">Seleccionar el ejercicio deseado desde la pantalla "Ejercicios".</w:t>
       </w:r>
     </w:p>
     <w:p>
@@ -2024,7 +2024,7 @@
           <w:sz w:val="21"/>
           <w:szCs w:val="21"/>
         </w:rPr>
-        <w:t xml:space="preserve">El sistema muestra el título del ejercicio en la barra superior y, debajo, el material terapéutico (video o imagen) y la sección "Instrucciones".</w:t>
+        <w:t xml:space="preserve">El sistema muestra el nombre del ejercicio en la barra superior, el material terapéutico (video o imagen) y el bloque "Cómo realizar el ejercicio" con las instrucciones.</w:t>
       </w:r>
     </w:p>
     <w:p>
@@ -2047,7 +2047,7 @@
           <w:sz w:val="21"/>
           <w:szCs w:val="21"/>
         </w:rPr>
-        <w:t xml:space="preserve">Si el fisioterapeuta personalizó el ángulo objetivo para este paciente y dejó una nota, el sistema muestra un aviso indicando que el ejercicio fue ajustado para su etapa actual.</w:t>
+        <w:t xml:space="preserve">Revisar las tarjetas "Ángulo objetivo" (el rango que el fisioterapeuta personalizó para esta sesión o, si no lo personalizó, el del ejercicio) y "Repeticiones".</w:t>
       </w:r>
     </w:p>
     <w:p>
@@ -2063,6 +2063,29 @@
           <w:szCs w:val="21"/>
         </w:rPr>
         <w:t xml:space="preserve">Paso 4: </w:t>
+      </w:r>
+      <w:r>
+        <w:rPr>
+          <w:color w:val="1F2937"/>
+          <w:sz w:val="21"/>
+          <w:szCs w:val="21"/>
+        </w:rPr>
+        <w:t xml:space="preserve">Si el fisioterapeuta dejó una indicación para la sesión, leerla en el bloque "Nota de tu fisioterapeuta".</w:t>
+      </w:r>
+    </w:p>
+    <w:p>
+      <w:pPr>
+        <w:spacing w:after="100" w:line="264"/>
+      </w:pPr>
+      <w:r>
+        <w:rPr>
+          <w:b/>
+          <w:bCs/>
+          <w:color w:val="0E7A70"/>
+          <w:sz w:val="21"/>
+          <w:szCs w:val="21"/>
+        </w:rPr>
+        <w:t xml:space="preserve">Paso 5: </w:t>
       </w:r>
       <w:r>
         <w:rPr>
@@ -2138,7 +2161,7 @@
           <w:sz w:val="21"/>
           <w:szCs w:val="21"/>
         </w:rPr>
-        <w:t xml:space="preserve">El paciente conoce cómo debe realizar el ejercicio antes de ponerse frente a la cámara, y accede a la pantalla de ejecución.</w:t>
+        <w:t xml:space="preserve">El paciente conoce cómo debe realizar el ejercicio, qué rango de movimiento se espera y qué indicaciones dejó su fisioterapeuta antes de ponerse frente a la cámara.</w:t>
       </w:r>
     </w:p>
     <w:p>
@@ -2208,7 +2231,25 @@
           <w:sz w:val="21"/>
           <w:szCs w:val="21"/>
         </w:rPr>
-        <w:t xml:space="preserve">El video es siempre referencial: el rango de movimiento real que evalúa el sistema puede estar personalizado para el paciente.</w:t>
+        <w:t xml:space="preserve">El video es siempre referencial: el rango de movimiento que evalúa el sistema puede estar personalizado para el paciente.</w:t>
+      </w:r>
+    </w:p>
+    <w:p>
+      <w:pPr>
+        <w:pStyle w:val="ListParagraph"/>
+        <w:numPr>
+          <w:ilvl w:val="0"/>
+          <w:numId w:val="1"/>
+        </w:numPr>
+        <w:spacing w:after="80" w:line="264"/>
+      </w:pPr>
+      <w:r>
+        <w:rPr>
+          <w:color w:val="1F2937"/>
+          <w:sz w:val="21"/>
+          <w:szCs w:val="21"/>
+        </w:rPr>
+        <w:t xml:space="preserve">La nota del fisioterapeuta aparece siempre que la sesión tenga una indicación, con o sin personalización del ángulo.</w:t>
       </w:r>
     </w:p>
     <w:p>
@@ -2968,7 +3009,7 @@
           <w:sz w:val="23"/>
           <w:szCs w:val="23"/>
         </w:rPr>
-        <w:t xml:space="preserve">7.5 Consultar el resultado de una sesión</w:t>
+        <w:t xml:space="preserve">7.5 Ver el resultado al terminar una sesión</w:t>
       </w:r>
     </w:p>
     <w:p>
@@ -2998,7 +3039,7 @@
           <w:sz w:val="21"/>
           <w:szCs w:val="21"/>
         </w:rPr>
-        <w:t xml:space="preserve">Muestra el detalle de cómo se ejecutó una sesión: porcentaje de acierto, precisión por repetición, ángulos por articulación y observaciones detectadas.</w:t>
+        <w:t xml:space="preserve">Al concluir la sesión, el sistema muestra de inmediato una pantalla de resultado con el resumen de la ejecución y el porcentaje obtenido en cada repetición.</w:t>
       </w:r>
     </w:p>
     <w:p>
@@ -3028,7 +3069,7 @@
           <w:sz w:val="21"/>
           <w:szCs w:val="21"/>
         </w:rPr>
-        <w:t xml:space="preserve">Automáticamente al finalizar una sesión (botón Ver resultado), o desde "Progreso" seleccionando una sesión del historial.</w:t>
+        <w:t xml:space="preserve">Automáticamente al finalizar una sesión (botón Ver resultado).</w:t>
       </w:r>
     </w:p>
     <w:p>
@@ -3068,7 +3109,7 @@
           <w:sz w:val="21"/>
           <w:szCs w:val="21"/>
         </w:rPr>
-        <w:t xml:space="preserve">Acceder al resultado desde el botón Ver resultado (sesión recién terminada) o desde el historial (sección "Progreso").</w:t>
+        <w:t xml:space="preserve">Al terminar la sesión, presionar Ver resultado.</w:t>
       </w:r>
     </w:p>
     <w:p>
@@ -3091,7 +3132,7 @@
           <w:sz w:val="21"/>
           <w:szCs w:val="21"/>
         </w:rPr>
-        <w:t xml:space="preserve">Revisar el resumen de repeticiones (completadas/asignadas, correctas y con errores) y la desviación promedio.</w:t>
+        <w:t xml:space="preserve">Leer el mensaje "¡Ejercicio completado!" y las tarjetas Repeticiones (completadas sobre asignadas) y Promedio (porcentaje general de la sesión).</w:t>
       </w:r>
     </w:p>
     <w:p>
@@ -3114,7 +3155,7 @@
           <w:sz w:val="21"/>
           <w:szCs w:val="21"/>
         </w:rPr>
-        <w:t xml:space="preserve">Revisar el gráfico "Precisión por repetición", que colorea cada repetición según si alcanzó o no el 75 % de ejecución.</w:t>
+        <w:t xml:space="preserve">Revisar la lista con todas las repeticiones y su porcentaje: en verde las de 75 % o más y en ámbar las demás.</w:t>
       </w:r>
     </w:p>
     <w:p>
@@ -3137,53 +3178,7 @@
           <w:sz w:val="21"/>
           <w:szCs w:val="21"/>
         </w:rPr>
-        <w:t xml:space="preserve">Revisar la sección "Ángulos por articulación" y, si existieron, la sección "Observaciones" con el detalle de cada tipo de error detectado.</w:t>
-      </w:r>
-    </w:p>
-    <w:p>
-      <w:pPr>
-        <w:spacing w:after="100" w:line="264"/>
-      </w:pPr>
-      <w:r>
-        <w:rPr>
-          <w:b/>
-          <w:bCs/>
-          <w:color w:val="0E7A70"/>
-          <w:sz w:val="21"/>
-          <w:szCs w:val="21"/>
-        </w:rPr>
-        <w:t xml:space="preserve">Paso 5: </w:t>
-      </w:r>
-      <w:r>
-        <w:rPr>
-          <w:color w:val="1F2937"/>
-          <w:sz w:val="21"/>
-          <w:szCs w:val="21"/>
-        </w:rPr>
-        <w:t xml:space="preserve">Revisar la sección "Recomendaciones de tu fisioterapeuta", si ya se registró alguna.</w:t>
-      </w:r>
-    </w:p>
-    <w:p>
-      <w:pPr>
-        <w:spacing w:after="100" w:line="264"/>
-      </w:pPr>
-      <w:r>
-        <w:rPr>
-          <w:b/>
-          <w:bCs/>
-          <w:color w:val="0E7A70"/>
-          <w:sz w:val="21"/>
-          <w:szCs w:val="21"/>
-        </w:rPr>
-        <w:t xml:space="preserve">Paso 6: </w:t>
-      </w:r>
-      <w:r>
-        <w:rPr>
-          <w:color w:val="1F2937"/>
-          <w:sz w:val="21"/>
-          <w:szCs w:val="21"/>
-        </w:rPr>
-        <w:t xml:space="preserve">Usar los botones Ver mi progreso o Volver al inicio para continuar navegando.</w:t>
+        <w:t xml:space="preserve">Presionar Ir a mi progreso para continuar; el sistema lleva al paciente a "Mis resultados".</w:t>
       </w:r>
     </w:p>
     <w:p>
@@ -3221,7 +3216,7 @@
           <w:sz w:val="19"/>
           <w:szCs w:val="19"/>
         </w:rPr>
-        <w:t xml:space="preserve">Figura 6. Resultado de una sesión completada.</w:t>
+        <w:t xml:space="preserve">Figura 6. Resultado de una sesión recién terminada.</w:t>
       </w:r>
     </w:p>
     <w:p>
@@ -3251,7 +3246,7 @@
           <w:sz w:val="21"/>
           <w:szCs w:val="21"/>
         </w:rPr>
-        <w:t xml:space="preserve">El paciente comprende con claridad su desempeño en la sesión, sin necesidad de interpretar datos técnicos.</w:t>
+        <w:t xml:space="preserve">El paciente comprende de inmediato su desempeño en la sesión, sin necesidad de interpretar datos técnicos.</w:t>
       </w:r>
     </w:p>
     <w:p>
@@ -3291,6 +3286,23 @@
     </w:p>
     <w:p>
       <w:pPr>
+        <w:spacing w:after="80" w:before="160"/>
+      </w:pPr>
+      <w:r>
+        <w:rPr>
+          <w:b/>
+          <w:bCs/>
+          <w:i/>
+          <w:iCs/>
+          <w:color w:val="0E7A70"/>
+          <w:sz w:val="21"/>
+          <w:szCs w:val="21"/>
+        </w:rPr>
+        <w:t xml:space="preserve">Consideraciones</w:t>
+      </w:r>
+    </w:p>
+    <w:p>
+      <w:pPr>
         <w:pStyle w:val="ListParagraph"/>
         <w:numPr>
           <w:ilvl w:val="0"/>
@@ -3304,7 +3316,7 @@
           <w:sz w:val="21"/>
           <w:szCs w:val="21"/>
         </w:rPr>
-        <w:t xml:space="preserve">"Tu fisioterapeuta aún no registró recomendaciones para esta sesión."</w:t>
+        <w:t xml:space="preserve">El porcentaje se calcula según las correcciones detectadas por la tecnología de análisis de movimiento (MediaPipe), como referencia y no como una medición clínica exacta.</w:t>
       </w:r>
     </w:p>
     <w:p>
@@ -3322,42 +3334,7 @@
           <w:sz w:val="21"/>
           <w:szCs w:val="21"/>
         </w:rPr>
-        <w:t xml:space="preserve">"Sesión finalizada — vista de solo lectura" — se muestra cuando se accede al resultado desde el historial, no justo al terminar la sesión.</w:t>
-      </w:r>
-    </w:p>
-    <w:p>
-      <w:pPr>
-        <w:spacing w:after="80" w:before="160"/>
-      </w:pPr>
-      <w:r>
-        <w:rPr>
-          <w:b/>
-          <w:bCs/>
-          <w:i/>
-          <w:iCs/>
-          <w:color w:val="0E7A70"/>
-          <w:sz w:val="21"/>
-          <w:szCs w:val="21"/>
-        </w:rPr>
-        <w:t xml:space="preserve">Consideraciones</w:t>
-      </w:r>
-    </w:p>
-    <w:p>
-      <w:pPr>
-        <w:pStyle w:val="ListParagraph"/>
-        <w:numPr>
-          <w:ilvl w:val="0"/>
-          <w:numId w:val="1"/>
-        </w:numPr>
-        <w:spacing w:after="80" w:line="264"/>
-      </w:pPr>
-      <w:r>
-        <w:rPr>
-          <w:color w:val="1F2937"/>
-          <w:sz w:val="21"/>
-          <w:szCs w:val="21"/>
-        </w:rPr>
-        <w:t xml:space="preserve">El sistema aclara que la precisión se calcula según las correcciones detectadas por la tecnología de análisis de movimiento (MediaPipe), como referencia y no como una medición clínica exacta.</w:t>
+        <w:t xml:space="preserve">Para volver a ver el resultado de esta u otras sesiones y las recomendaciones del fisioterapeuta, usar la opción Resultados del menú lateral (funcionalidad 7.6).</w:t>
       </w:r>
     </w:p>
     <w:p>
@@ -3373,7 +3350,7 @@
           <w:sz w:val="23"/>
           <w:szCs w:val="23"/>
         </w:rPr>
-        <w:t xml:space="preserve">7.6 Consultar mi progreso e historial ("Mi progreso")</w:t>
+        <w:t xml:space="preserve">7.6 Consultar mis resultados y las recomendaciones de mi fisioterapeuta ("Mis resultados")</w:t>
       </w:r>
     </w:p>
     <w:p>
@@ -3403,7 +3380,7 @@
           <w:sz w:val="21"/>
           <w:szCs w:val="21"/>
         </w:rPr>
-        <w:t xml:space="preserve">Presenta un resumen general del avance del paciente y el listado completo de sus sesiones realizadas, ordenadas de la más reciente a la más antigua.</w:t>
+        <w:t xml:space="preserve">Muestra la lista de sesiones realizadas, de la más reciente a la más antigua, y el detalle de la sesión seleccionada: repeticiones, promedio, porcentaje de cada repetición y la recomendación que dejó el fisioterapeuta.</w:t>
       </w:r>
     </w:p>
     <w:p>
@@ -3433,7 +3410,7 @@
           <w:sz w:val="21"/>
           <w:szCs w:val="21"/>
         </w:rPr>
-        <w:t xml:space="preserve">Menú lateral → Progreso.</w:t>
+        <w:t xml:space="preserve">Menú lateral → Resultados.</w:t>
       </w:r>
     </w:p>
     <w:p>
@@ -3473,7 +3450,7 @@
           <w:sz w:val="21"/>
           <w:szCs w:val="21"/>
         </w:rPr>
-        <w:t xml:space="preserve">Seleccionar Progreso en el menú lateral.</w:t>
+        <w:t xml:space="preserve">Seleccionar Resultados en el menú lateral.</w:t>
       </w:r>
     </w:p>
     <w:p>
@@ -3496,7 +3473,7 @@
           <w:sz w:val="21"/>
           <w:szCs w:val="21"/>
         </w:rPr>
-        <w:t xml:space="preserve">Revisar las cifras generales: porcentaje de progreso, sesiones completadas y racha de días consecutivos.</w:t>
+        <w:t xml:space="preserve">En "Sesiones realizadas", revisar la lista; la sesión más reciente aparece seleccionada al abrir la pantalla.</w:t>
       </w:r>
     </w:p>
     <w:p>
@@ -3519,7 +3496,7 @@
           <w:sz w:val="21"/>
           <w:szCs w:val="21"/>
         </w:rPr>
-        <w:t xml:space="preserve">Revisar el gráfico "Evolución de precisión", que muestra el porcentaje de cada sesión completada en orden cronológico.</w:t>
+        <w:t xml:space="preserve">Seleccionar otra sesión para ver su detalle debajo: tarjetas Repeticiones y Promedio y el "Detalle por repetición".</w:t>
       </w:r>
     </w:p>
     <w:p>
@@ -3542,7 +3519,30 @@
           <w:sz w:val="21"/>
           <w:szCs w:val="21"/>
         </w:rPr>
-        <w:t xml:space="preserve">Revisar la lista "Historial de sesiones" y seleccionar cualquier sesión para ver su detalle completo.</w:t>
+        <w:t xml:space="preserve">Alternar entre Mostrar gráfico y Mostrar lista para ver la precisión de cada repetición como barras o como filas.</w:t>
+      </w:r>
+    </w:p>
+    <w:p>
+      <w:pPr>
+        <w:spacing w:after="100" w:line="264"/>
+      </w:pPr>
+      <w:r>
+        <w:rPr>
+          <w:b/>
+          <w:bCs/>
+          <w:color w:val="0E7A70"/>
+          <w:sz w:val="21"/>
+          <w:szCs w:val="21"/>
+        </w:rPr>
+        <w:t xml:space="preserve">Paso 5: </w:t>
+      </w:r>
+      <w:r>
+        <w:rPr>
+          <w:color w:val="1F2937"/>
+          <w:sz w:val="21"/>
+          <w:szCs w:val="21"/>
+        </w:rPr>
+        <w:t xml:space="preserve">Al final del detalle, leer la "Recomendación de tu fisioterapeuta" con su fecha, si ya registró alguna.</w:t>
       </w:r>
     </w:p>
     <w:p>
@@ -3580,7 +3580,7 @@
           <w:sz w:val="19"/>
           <w:szCs w:val="19"/>
         </w:rPr>
-        <w:t xml:space="preserve">Figura 7. Pantalla "Progreso" del paciente.</w:t>
+        <w:t xml:space="preserve">Figura 7. Pantalla "Mis resultados" del paciente.</w:t>
       </w:r>
     </w:p>
     <w:p>
@@ -3610,7 +3610,7 @@
           <w:sz w:val="21"/>
           <w:szCs w:val="21"/>
         </w:rPr>
-        <w:t xml:space="preserve">El paciente conoce su evolución a lo largo del tiempo y puede volver a consultar cualquier sesión pasada.</w:t>
+        <w:t xml:space="preserve">El paciente puede repasar cualquier sesión anterior y conocer las observaciones de su fisioterapeuta sin salir de la misma pantalla.</w:t>
       </w:r>
     </w:p>
     <w:p>
@@ -3663,7 +3663,42 @@
           <w:sz w:val="21"/>
           <w:szCs w:val="21"/>
         </w:rPr>
-        <w:t xml:space="preserve">"No completaste sesiones en este período."</w:t>
+        <w:t xml:space="preserve">"Tu fisioterapeuta aún no registró recomendaciones para esta sesión."</w:t>
+      </w:r>
+    </w:p>
+    <w:p>
+      <w:pPr>
+        <w:spacing w:after="80" w:before="160"/>
+      </w:pPr>
+      <w:r>
+        <w:rPr>
+          <w:b/>
+          <w:bCs/>
+          <w:i/>
+          <w:iCs/>
+          <w:color w:val="0E7A70"/>
+          <w:sz w:val="21"/>
+          <w:szCs w:val="21"/>
+        </w:rPr>
+        <w:t xml:space="preserve">Consideraciones</w:t>
+      </w:r>
+    </w:p>
+    <w:p>
+      <w:pPr>
+        <w:pStyle w:val="ListParagraph"/>
+        <w:numPr>
+          <w:ilvl w:val="0"/>
+          <w:numId w:val="1"/>
+        </w:numPr>
+        <w:spacing w:after="80" w:line="264"/>
+      </w:pPr>
+      <w:r>
+        <w:rPr>
+          <w:color w:val="1F2937"/>
+          <w:sz w:val="21"/>
+          <w:szCs w:val="21"/>
+        </w:rPr>
+        <w:t xml:space="preserve">Solo aparecen las recomendaciones que el fisioterapeuta ya guardó; si registra una nueva, se muestra de inmediato.</w:t>
       </w:r>
     </w:p>
     <w:p>
@@ -3679,7 +3714,7 @@
           <w:sz w:val="23"/>
           <w:szCs w:val="23"/>
         </w:rPr>
-        <w:t xml:space="preserve">7.7 Consultar y editar mi perfil / Cerrar sesión</w:t>
+        <w:t xml:space="preserve">7.7 Consultar mi progreso ("Mi progreso")</w:t>
       </w:r>
     </w:p>
     <w:p>
@@ -3709,7 +3744,7 @@
           <w:sz w:val="21"/>
           <w:szCs w:val="21"/>
         </w:rPr>
-        <w:t xml:space="preserve">Permite al paciente ver su información registrada, actualizar su nombre y cerrar sesión.</w:t>
+        <w:t xml:space="preserve">Presenta un resumen del avance del paciente: cuántas sesiones realizó, su promedio general y un gráfico con la evolución de cada sesión.</w:t>
       </w:r>
     </w:p>
     <w:p>
@@ -3739,7 +3774,7 @@
           <w:sz w:val="21"/>
           <w:szCs w:val="21"/>
         </w:rPr>
-        <w:t xml:space="preserve">Menú lateral → Perfil.</w:t>
+        <w:t xml:space="preserve">Menú lateral → Progreso.</w:t>
       </w:r>
     </w:p>
     <w:p>
@@ -3779,7 +3814,7 @@
           <w:sz w:val="21"/>
           <w:szCs w:val="21"/>
         </w:rPr>
-        <w:t xml:space="preserve">Seleccionar Perfil en el menú lateral.</w:t>
+        <w:t xml:space="preserve">Seleccionar Progreso en el menú lateral.</w:t>
       </w:r>
     </w:p>
     <w:p>
@@ -3802,7 +3837,7 @@
           <w:sz w:val="21"/>
           <w:szCs w:val="21"/>
         </w:rPr>
-        <w:t xml:space="preserve">En la sección "Datos de la cuenta", editar el campo Nombre si se desea, y presionar Guardar cambios.</w:t>
+        <w:t xml:space="preserve">Revisar las tarjetas Sesiones realizadas y Promedio general.</w:t>
       </w:r>
     </w:p>
     <w:p>
@@ -3825,30 +3860,7 @@
           <w:sz w:val="21"/>
           <w:szCs w:val="21"/>
         </w:rPr>
-        <w:t xml:space="preserve">En la sección "Información clínica", revisar en modo de solo lectura el DNI, la edad, el género, el número de contacto, el o los diagnósticos y el fisioterapeuta asignado.</w:t>
-      </w:r>
-    </w:p>
-    <w:p>
-      <w:pPr>
-        <w:spacing w:after="100" w:line="264"/>
-      </w:pPr>
-      <w:r>
-        <w:rPr>
-          <w:b/>
-          <w:bCs/>
-          <w:color w:val="0E7A70"/>
-          <w:sz w:val="21"/>
-          <w:szCs w:val="21"/>
-        </w:rPr>
-        <w:t xml:space="preserve">Paso 4: </w:t>
-      </w:r>
-      <w:r>
-        <w:rPr>
-          <w:color w:val="1F2937"/>
-          <w:sz w:val="21"/>
-          <w:szCs w:val="21"/>
-        </w:rPr>
-        <w:t xml:space="preserve">Para salir del sistema, presionar Cerrar sesión y confirmar en el cuadro de diálogo que aparece.</w:t>
+        <w:t xml:space="preserve">Revisar el gráfico "Evolución por sesión": el eje horizontal muestra el número de sesión y el vertical, el porcentaje de precisión de cada una.</w:t>
       </w:r>
     </w:p>
     <w:p>
@@ -3886,7 +3898,7 @@
           <w:sz w:val="19"/>
           <w:szCs w:val="19"/>
         </w:rPr>
-        <w:t xml:space="preserve">Figura 8. Pantalla "Perfil" del paciente.</w:t>
+        <w:t xml:space="preserve">Figura 8. Pantalla "Progreso" del paciente.</w:t>
       </w:r>
     </w:p>
     <w:p>
@@ -3916,7 +3928,7 @@
           <w:sz w:val="21"/>
           <w:szCs w:val="21"/>
         </w:rPr>
-        <w:t xml:space="preserve">El paciente mantiene actualizado su nombre y puede finalizar su sesión de forma segura.</w:t>
+        <w:t xml:space="preserve">El paciente conoce su evolución a lo largo del tiempo y ve si su precisión mejora sesión a sesión.</w:t>
       </w:r>
     </w:p>
     <w:p>
@@ -3933,7 +3945,7 @@
           <w:sz w:val="21"/>
           <w:szCs w:val="21"/>
         </w:rPr>
-        <w:t xml:space="preserve">Validaciones</w:t>
+        <w:t xml:space="preserve">Mensajes del sistema</w:t>
       </w:r>
     </w:p>
     <w:p>
@@ -3951,134 +3963,7 @@
           <w:sz w:val="21"/>
           <w:szCs w:val="21"/>
         </w:rPr>
-        <w:t xml:space="preserve">Solo el campo Nombre es editable por el paciente; el resto de la información clínica la gestiona el administrador.</w:t>
-      </w:r>
-    </w:p>
-    <w:p>
-      <w:pPr>
-        <w:spacing w:after="80" w:before="160"/>
-      </w:pPr>
-      <w:r>
-        <w:rPr>
-          <w:b/>
-          <w:bCs/>
-          <w:i/>
-          <w:iCs/>
-          <w:color w:val="0E7A70"/>
-          <w:sz w:val="21"/>
-          <w:szCs w:val="21"/>
-        </w:rPr>
-        <w:t xml:space="preserve">Mensajes del sistema</w:t>
-      </w:r>
-    </w:p>
-    <w:p>
-      <w:pPr>
-        <w:pStyle w:val="ListParagraph"/>
-        <w:numPr>
-          <w:ilvl w:val="0"/>
-          <w:numId w:val="1"/>
-        </w:numPr>
-        <w:spacing w:after="80" w:line="264"/>
-      </w:pPr>
-      <w:r>
-        <w:rPr>
-          <w:color w:val="1F2937"/>
-          <w:sz w:val="21"/>
-          <w:szCs w:val="21"/>
-        </w:rPr>
-        <w:t xml:space="preserve">"Nombre actualizado."</w:t>
-      </w:r>
-    </w:p>
-    <w:p>
-      <w:pPr>
-        <w:pStyle w:val="ListParagraph"/>
-        <w:numPr>
-          <w:ilvl w:val="0"/>
-          <w:numId w:val="1"/>
-        </w:numPr>
-        <w:spacing w:after="80" w:line="264"/>
-      </w:pPr>
-      <w:r>
-        <w:rPr>
-          <w:color w:val="1F2937"/>
-          <w:sz w:val="21"/>
-          <w:szCs w:val="21"/>
-        </w:rPr>
-        <w:t xml:space="preserve">"No se pudo actualizar el nombre."</w:t>
-      </w:r>
-    </w:p>
-    <w:p>
-      <w:pPr>
-        <w:pStyle w:val="ListParagraph"/>
-        <w:numPr>
-          <w:ilvl w:val="0"/>
-          <w:numId w:val="1"/>
-        </w:numPr>
-        <w:spacing w:after="80" w:line="264"/>
-      </w:pPr>
-      <w:r>
-        <w:rPr>
-          <w:color w:val="1F2937"/>
-          <w:sz w:val="21"/>
-          <w:szCs w:val="21"/>
-        </w:rPr>
-        <w:t xml:space="preserve">"¿Seguro que deseas cerrar sesión?" — cuadro de confirmación antes de salir.</w:t>
-      </w:r>
-    </w:p>
-    <w:p>
-      <w:pPr>
-        <w:spacing w:after="80" w:before="160"/>
-      </w:pPr>
-      <w:r>
-        <w:rPr>
-          <w:b/>
-          <w:bCs/>
-          <w:i/>
-          <w:iCs/>
-          <w:color w:val="0E7A70"/>
-          <w:sz w:val="21"/>
-          <w:szCs w:val="21"/>
-        </w:rPr>
-        <w:t xml:space="preserve">Consideraciones</w:t>
-      </w:r>
-    </w:p>
-    <w:p>
-      <w:pPr>
-        <w:pStyle w:val="ListParagraph"/>
-        <w:numPr>
-          <w:ilvl w:val="0"/>
-          <w:numId w:val="1"/>
-        </w:numPr>
-        <w:spacing w:after="80" w:line="264"/>
-      </w:pPr>
-      <w:r>
-        <w:rPr>
-          <w:color w:val="1F2937"/>
-          <w:sz w:val="21"/>
-          <w:szCs w:val="21"/>
-        </w:rPr>
-        <w:t xml:space="preserve">Perfil es la única pantalla desde la que el paciente puede cerrar sesión; no existe esta opción en ninguna otra pantalla.</w:t>
-      </w:r>
-    </w:p>
-    <w:p>
-      <w:r>
-        <w:br w:type="page"/>
-      </w:r>
-    </w:p>
-    <w:p>
-      <w:pPr>
-        <w:pStyle w:val="Heading2"/>
-        <w:spacing w:after="160" w:before="360"/>
-      </w:pPr>
-      <w:r>
-        <w:rPr>
-          <w:b/>
-          <w:bCs/>
-          <w:color w:val="0E7A70"/>
-          <w:sz w:val="26"/>
-          <w:szCs w:val="26"/>
-        </w:rPr>
-        <w:t xml:space="preserve">7.B Funcionalidades del rol Fisioterapeuta</w:t>
+        <w:t xml:space="preserve">"Aún no has completado ninguna sesión."</w:t>
       </w:r>
     </w:p>
     <w:p>
@@ -4094,7 +3979,7 @@
           <w:sz w:val="23"/>
           <w:szCs w:val="23"/>
         </w:rPr>
-        <w:t xml:space="preserve">7.8 Consultar y buscar pacientes</w:t>
+        <w:t>7.8 Consultar y editar mi perfil / Cerrar sesión</w:t>
       </w:r>
     </w:p>
     <w:p>
@@ -4124,7 +4009,7 @@
           <w:sz w:val="21"/>
           <w:szCs w:val="21"/>
         </w:rPr>
-        <w:t xml:space="preserve">Muestra la lista de pacientes asignados al fisioterapeuta, con indicadores generales y un buscador.</w:t>
+        <w:t xml:space="preserve">Permite al paciente ver su información registrada, actualizar su nombre y cerrar sesión.</w:t>
       </w:r>
     </w:p>
     <w:p>
@@ -4154,7 +4039,7 @@
           <w:sz w:val="21"/>
           <w:szCs w:val="21"/>
         </w:rPr>
-        <w:t xml:space="preserve">Menú lateral → Pacientes (pantalla de inicio del fisioterapeuta).</w:t>
+        <w:t xml:space="preserve">Menú lateral → Perfil.</w:t>
       </w:r>
     </w:p>
     <w:p>
@@ -4194,7 +4079,7 @@
           <w:sz w:val="21"/>
           <w:szCs w:val="21"/>
         </w:rPr>
-        <w:t xml:space="preserve">Iniciar sesión como fisioterapeuta; el sistema abre directamente la pantalla "Pacientes".</w:t>
+        <w:t xml:space="preserve">Seleccionar Perfil en el menú lateral.</w:t>
       </w:r>
     </w:p>
     <w:p>
@@ -4217,7 +4102,7 @@
           <w:sz w:val="21"/>
           <w:szCs w:val="21"/>
         </w:rPr>
-        <w:t xml:space="preserve">Revisar las cifras superiores: pacientes activos, sesiones del día y ejercicios disponibles en el catálogo.</w:t>
+        <w:t xml:space="preserve">En la sección "Datos de la cuenta", editar el campo Nombre si se desea, y presionar Guardar cambios.</w:t>
       </w:r>
     </w:p>
     <w:p>
@@ -4240,7 +4125,7 @@
           <w:sz w:val="21"/>
           <w:szCs w:val="21"/>
         </w:rPr>
-        <w:t xml:space="preserve">Usar el campo Buscar paciente... para filtrar la lista por nombre.</w:t>
+        <w:t xml:space="preserve">En la sección "Información clínica", revisar en modo de solo lectura el DNI, la edad, el género, el número de contacto, el o los diagnósticos y el fisioterapeuta asignado.</w:t>
       </w:r>
     </w:p>
     <w:p>
@@ -4263,7 +4148,7 @@
           <w:sz w:val="21"/>
           <w:szCs w:val="21"/>
         </w:rPr>
-        <w:t xml:space="preserve">Seleccionar un paciente de la lista para ver su detalle.</w:t>
+        <w:t xml:space="preserve">Para salir del sistema, presionar Cerrar sesión y confirmar en el cuadro de diálogo que aparece.</w:t>
       </w:r>
     </w:p>
     <w:p>
@@ -4301,7 +4186,7 @@
           <w:sz w:val="19"/>
           <w:szCs w:val="19"/>
         </w:rPr>
-        <w:t xml:space="preserve">Figura 9. Pantalla "Pacientes" del fisioterapeuta.</w:t>
+        <w:t>Figura 9. Pantalla "Perfil" del paciente.</w:t>
       </w:r>
     </w:p>
     <w:p>
@@ -4331,7 +4216,7 @@
           <w:sz w:val="21"/>
           <w:szCs w:val="21"/>
         </w:rPr>
-        <w:t xml:space="preserve">El fisioterapeuta identifica rápidamente a sus pacientes y accede al detalle de cualquiera de ellos.</w:t>
+        <w:t xml:space="preserve">El paciente mantiene actualizado su nombre y puede finalizar su sesión de forma segura.</w:t>
       </w:r>
     </w:p>
     <w:p>
@@ -4348,7 +4233,7 @@
           <w:sz w:val="21"/>
           <w:szCs w:val="21"/>
         </w:rPr>
-        <w:t xml:space="preserve">Mensajes del sistema</w:t>
+        <w:t xml:space="preserve">Validaciones</w:t>
       </w:r>
     </w:p>
     <w:p>
@@ -4366,7 +4251,24 @@
           <w:sz w:val="21"/>
           <w:szCs w:val="21"/>
         </w:rPr>
-        <w:t xml:space="preserve">"Aún no tienes pacientes asignados."</w:t>
+        <w:t xml:space="preserve">Solo el campo Nombre es editable por el paciente; el resto de la información clínica la gestiona el administrador.</w:t>
+      </w:r>
+    </w:p>
+    <w:p>
+      <w:pPr>
+        <w:spacing w:after="80" w:before="160"/>
+      </w:pPr>
+      <w:r>
+        <w:rPr>
+          <w:b/>
+          <w:bCs/>
+          <w:i/>
+          <w:iCs/>
+          <w:color w:val="0E7A70"/>
+          <w:sz w:val="21"/>
+          <w:szCs w:val="21"/>
+        </w:rPr>
+        <w:t xml:space="preserve">Mensajes del sistema</w:t>
       </w:r>
     </w:p>
     <w:p>
@@ -4384,7 +4286,99 @@
           <w:sz w:val="21"/>
           <w:szCs w:val="21"/>
         </w:rPr>
-        <w:t xml:space="preserve">"No se encontraron pacientes con ese criterio."</w:t>
+        <w:t xml:space="preserve">"Nombre actualizado."</w:t>
+      </w:r>
+    </w:p>
+    <w:p>
+      <w:pPr>
+        <w:pStyle w:val="ListParagraph"/>
+        <w:numPr>
+          <w:ilvl w:val="0"/>
+          <w:numId w:val="1"/>
+        </w:numPr>
+        <w:spacing w:after="80" w:line="264"/>
+      </w:pPr>
+      <w:r>
+        <w:rPr>
+          <w:color w:val="1F2937"/>
+          <w:sz w:val="21"/>
+          <w:szCs w:val="21"/>
+        </w:rPr>
+        <w:t xml:space="preserve">"No se pudo actualizar el nombre."</w:t>
+      </w:r>
+    </w:p>
+    <w:p>
+      <w:pPr>
+        <w:pStyle w:val="ListParagraph"/>
+        <w:numPr>
+          <w:ilvl w:val="0"/>
+          <w:numId w:val="1"/>
+        </w:numPr>
+        <w:spacing w:after="80" w:line="264"/>
+      </w:pPr>
+      <w:r>
+        <w:rPr>
+          <w:color w:val="1F2937"/>
+          <w:sz w:val="21"/>
+          <w:szCs w:val="21"/>
+        </w:rPr>
+        <w:t xml:space="preserve">"¿Seguro que deseas cerrar sesión?" — cuadro de confirmación antes de salir.</w:t>
+      </w:r>
+    </w:p>
+    <w:p>
+      <w:pPr>
+        <w:spacing w:after="80" w:before="160"/>
+      </w:pPr>
+      <w:r>
+        <w:rPr>
+          <w:b/>
+          <w:bCs/>
+          <w:i/>
+          <w:iCs/>
+          <w:color w:val="0E7A70"/>
+          <w:sz w:val="21"/>
+          <w:szCs w:val="21"/>
+        </w:rPr>
+        <w:t xml:space="preserve">Consideraciones</w:t>
+      </w:r>
+    </w:p>
+    <w:p>
+      <w:pPr>
+        <w:pStyle w:val="ListParagraph"/>
+        <w:numPr>
+          <w:ilvl w:val="0"/>
+          <w:numId w:val="1"/>
+        </w:numPr>
+        <w:spacing w:after="80" w:line="264"/>
+      </w:pPr>
+      <w:r>
+        <w:rPr>
+          <w:color w:val="1F2937"/>
+          <w:sz w:val="21"/>
+          <w:szCs w:val="21"/>
+        </w:rPr>
+        <w:t xml:space="preserve">Perfil es la única pantalla desde la que el paciente puede cerrar sesión; no existe esta opción en ninguna otra pantalla.</w:t>
+      </w:r>
+    </w:p>
+    <w:p>
+      <w:r>
+        <w:br w:type="page"/>
+      </w:r>
+    </w:p>
+    <w:p>
+      <w:pPr>
+        <w:pStyle w:val="Heading2"/>
+        <w:spacing w:after="160" w:before="360"/>
+      </w:pPr>
+      <w:r>
+        <w:rPr>
+          <w:b/>
+          <w:bCs/>
+          <w:color w:val="0E7A70"/>
+          <w:sz w:val="26"/>
+          <w:szCs w:val="26"/>
+        </w:rPr>
+        <w:t xml:space="preserve">7.B Funcionalidades del rol Fisioterapeuta</w:t>
       </w:r>
     </w:p>
     <w:p>
@@ -4400,7 +4394,7 @@
           <w:sz w:val="23"/>
           <w:szCs w:val="23"/>
         </w:rPr>
-        <w:t xml:space="preserve">7.9 Consultar el detalle de un paciente y su progreso</w:t>
+        <w:t>7.9 Consultar y buscar pacientes</w:t>
       </w:r>
     </w:p>
     <w:p>
@@ -4430,7 +4424,7 @@
           <w:sz w:val="21"/>
           <w:szCs w:val="21"/>
         </w:rPr>
-        <w:t xml:space="preserve">Presenta la ficha completa de un paciente: su progreso general, su progreso por ejercicio y el listado de todas sus sesiones.</w:t>
+        <w:t xml:space="preserve">Muestra la lista de pacientes asignados al fisioterapeuta, con indicadores generales y un buscador.</w:t>
       </w:r>
     </w:p>
     <w:p>
@@ -4460,7 +4454,7 @@
           <w:sz w:val="21"/>
           <w:szCs w:val="21"/>
         </w:rPr>
-        <w:t xml:space="preserve">Desde "Pacientes", al seleccionar un paciente de la lista.</w:t>
+        <w:t xml:space="preserve">Menú lateral → Pacientes (pantalla de inicio del fisioterapeuta).</w:t>
       </w:r>
     </w:p>
     <w:p>
@@ -4500,7 +4494,7 @@
           <w:sz w:val="21"/>
           <w:szCs w:val="21"/>
         </w:rPr>
-        <w:t xml:space="preserve">Seleccionar un paciente desde la pantalla "Pacientes".</w:t>
+        <w:t xml:space="preserve">Iniciar sesión como fisioterapeuta; el sistema abre directamente la pantalla "Pacientes".</w:t>
       </w:r>
     </w:p>
     <w:p>
@@ -4523,7 +4517,7 @@
           <w:sz w:val="21"/>
           <w:szCs w:val="21"/>
         </w:rPr>
-        <w:t xml:space="preserve">Revisar la tarjeta "Progreso": sesiones completadas sobre el total y porcentaje general de ejecución.</w:t>
+        <w:t xml:space="preserve">Revisar las cifras superiores: pacientes activos, sesiones del día y ejercicios disponibles en el catálogo.</w:t>
       </w:r>
     </w:p>
     <w:p>
@@ -4546,7 +4540,7 @@
           <w:sz w:val="21"/>
           <w:szCs w:val="21"/>
         </w:rPr>
-        <w:t xml:space="preserve">Revisar la sección "Progreso por ejercicio", que agrupa el promedio de ejecución por cada ejercicio asignado.</w:t>
+        <w:t xml:space="preserve">Usar el campo Buscar paciente... para filtrar la lista por nombre.</w:t>
       </w:r>
     </w:p>
     <w:p>
@@ -4569,30 +4563,7 @@
           <w:sz w:val="21"/>
           <w:szCs w:val="21"/>
         </w:rPr>
-        <w:t xml:space="preserve">Revisar la sección "Sesiones registradas"; cada sesión completada puede seleccionarse para ver su resultado detallado, y cuenta con un ícono directo para Registrar recomendación.</w:t>
-      </w:r>
-    </w:p>
-    <w:p>
-      <w:pPr>
-        <w:spacing w:after="100" w:line="264"/>
-      </w:pPr>
-      <w:r>
-        <w:rPr>
-          <w:b/>
-          <w:bCs/>
-          <w:color w:val="0E7A70"/>
-          <w:sz w:val="21"/>
-          <w:szCs w:val="21"/>
-        </w:rPr>
-        <w:t xml:space="preserve">Paso 5: </w:t>
-      </w:r>
-      <w:r>
-        <w:rPr>
-          <w:color w:val="1F2937"/>
-          <w:sz w:val="21"/>
-          <w:szCs w:val="21"/>
-        </w:rPr>
-        <w:t xml:space="preserve">Presionar el ícono superior Asignar sesión para asignarle un nuevo ejercicio (ver funcionalidad 7.12).</w:t>
+        <w:t xml:space="preserve">Seleccionar un paciente de la lista para ver su detalle.</w:t>
       </w:r>
     </w:p>
     <w:p>
@@ -4630,7 +4601,7 @@
           <w:sz w:val="19"/>
           <w:szCs w:val="19"/>
         </w:rPr>
-        <w:t xml:space="preserve">Figura 10. Detalle de un paciente.</w:t>
+        <w:t>Figura 10. Pantalla "Pacientes" del fisioterapeuta.</w:t>
       </w:r>
     </w:p>
     <w:p>
@@ -4660,7 +4631,7 @@
           <w:sz w:val="21"/>
           <w:szCs w:val="21"/>
         </w:rPr>
-        <w:t xml:space="preserve">El fisioterapeuta obtiene una visión completa del avance del paciente para decidir los siguientes pasos de su tratamiento.</w:t>
+        <w:t xml:space="preserve">El fisioterapeuta identifica rápidamente a sus pacientes y accede al detalle de cualquiera de ellos.</w:t>
       </w:r>
     </w:p>
     <w:p>
@@ -4695,7 +4666,7 @@
           <w:sz w:val="21"/>
           <w:szCs w:val="21"/>
         </w:rPr>
-        <w:t xml:space="preserve">"Este paciente aún no tiene sesiones registradas."</w:t>
+        <w:t xml:space="preserve">"Aún no tienes pacientes asignados."</w:t>
       </w:r>
     </w:p>
     <w:p>
@@ -4713,7 +4684,7 @@
           <w:sz w:val="21"/>
           <w:szCs w:val="21"/>
         </w:rPr>
-        <w:t xml:space="preserve">"No hay sesiones en este período."</w:t>
+        <w:t xml:space="preserve">"No se encontraron pacientes con ese criterio."</w:t>
       </w:r>
     </w:p>
     <w:p>
@@ -4729,7 +4700,7 @@
           <w:sz w:val="23"/>
           <w:szCs w:val="23"/>
         </w:rPr>
-        <w:t xml:space="preserve">7.10 Registrar y editar el diagnóstico de un paciente</w:t>
+        <w:t>7.10 Consultar el detalle de un paciente y su progreso</w:t>
       </w:r>
     </w:p>
     <w:p>
@@ -4759,7 +4730,7 @@
           <w:sz w:val="21"/>
           <w:szCs w:val="21"/>
         </w:rPr>
-        <w:t xml:space="preserve">Permite asociar uno o más diagnósticos, de un catálogo cerrado, al paciente.</w:t>
+        <w:t xml:space="preserve">Presenta la ficha completa de un paciente: su progreso general, su progreso por ejercicio y el listado de todas sus sesiones.</w:t>
       </w:r>
     </w:p>
     <w:p>
@@ -4789,7 +4760,7 @@
           <w:sz w:val="21"/>
           <w:szCs w:val="21"/>
         </w:rPr>
-        <w:t xml:space="preserve">Desde el detalle del paciente, sección "Diagnóstico(s)", ícono Editar diagnóstico.</w:t>
+        <w:t xml:space="preserve">Desde "Pacientes", al seleccionar un paciente de la lista.</w:t>
       </w:r>
     </w:p>
     <w:p>
@@ -4829,7 +4800,7 @@
           <w:sz w:val="21"/>
           <w:szCs w:val="21"/>
         </w:rPr>
-        <w:t xml:space="preserve">En el detalle del paciente, presionar el ícono Editar diagnóstico.</w:t>
+        <w:t xml:space="preserve">Seleccionar un paciente desde la pantalla "Pacientes".</w:t>
       </w:r>
     </w:p>
     <w:p>
@@ -4852,7 +4823,7 @@
           <w:sz w:val="21"/>
           <w:szCs w:val="21"/>
         </w:rPr>
-        <w:t xml:space="preserve">Marcar uno o más diagnósticos del catálogo cerrado (agrupados por región del cuerpo: columna, rodilla u hombro).</w:t>
+        <w:t xml:space="preserve">Revisar la tarjeta "Progreso": sesiones completadas sobre el total y porcentaje general de ejecución.</w:t>
       </w:r>
     </w:p>
     <w:p>
@@ -4875,200 +4846,7 @@
           <w:sz w:val="21"/>
           <w:szCs w:val="21"/>
         </w:rPr>
-        <w:t xml:space="preserve">Presionar Guardar, o Cancelar para descartar los cambios.</w:t>
-      </w:r>
-    </w:p>
-    <w:p>
-      <w:pPr>
-        <w:spacing w:after="80" w:before="160"/>
-      </w:pPr>
-      <w:r>
-        <w:rPr>
-          <w:b/>
-          <w:bCs/>
-          <w:i/>
-          <w:iCs/>
-          <w:color w:val="0E7A70"/>
-          <w:sz w:val="21"/>
-          <w:szCs w:val="21"/>
-        </w:rPr>
-        <w:t xml:space="preserve">Resultado</w:t>
-      </w:r>
-    </w:p>
-    <w:p>
-      <w:pPr>
-        <w:spacing w:after="160" w:line="276"/>
-      </w:pPr>
-      <w:r>
-        <w:rPr>
-          <w:color w:val="1F2937"/>
-          <w:sz w:val="21"/>
-          <w:szCs w:val="21"/>
-        </w:rPr>
-        <w:t xml:space="preserve">El o los diagnósticos quedan asociados al paciente y se usan para sugerir ejercicios relacionados al momento de asignar una sesión (ver funcionalidad 7.12).</w:t>
-      </w:r>
-    </w:p>
-    <w:p>
-      <w:pPr>
-        <w:spacing w:after="80" w:before="160"/>
-      </w:pPr>
-      <w:r>
-        <w:rPr>
-          <w:b/>
-          <w:bCs/>
-          <w:i/>
-          <w:iCs/>
-          <w:color w:val="0E7A70"/>
-          <w:sz w:val="21"/>
-          <w:szCs w:val="21"/>
-        </w:rPr>
-        <w:t xml:space="preserve">Mensajes del sistema</w:t>
-      </w:r>
-    </w:p>
-    <w:p>
-      <w:pPr>
-        <w:pStyle w:val="ListParagraph"/>
-        <w:numPr>
-          <w:ilvl w:val="0"/>
-          <w:numId w:val="1"/>
-        </w:numPr>
-        <w:spacing w:after="80" w:line="264"/>
-      </w:pPr>
-      <w:r>
-        <w:rPr>
-          <w:color w:val="1F2937"/>
-          <w:sz w:val="21"/>
-          <w:szCs w:val="21"/>
-        </w:rPr>
-        <w:t xml:space="preserve">"Sin diagnóstico registrado." — se muestra si el paciente todavía no tiene ninguno.</w:t>
-      </w:r>
-    </w:p>
-    <w:p>
-      <w:pPr>
-        <w:spacing w:after="80" w:before="160"/>
-      </w:pPr>
-      <w:r>
-        <w:rPr>
-          <w:b/>
-          <w:bCs/>
-          <w:i/>
-          <w:iCs/>
-          <w:color w:val="0E7A70"/>
-          <w:sz w:val="21"/>
-          <w:szCs w:val="21"/>
-        </w:rPr>
-        <w:t xml:space="preserve">Consideraciones</w:t>
-      </w:r>
-    </w:p>
-    <w:p>
-      <w:pPr>
-        <w:pStyle w:val="ListParagraph"/>
-        <w:numPr>
-          <w:ilvl w:val="0"/>
-          <w:numId w:val="1"/>
-        </w:numPr>
-        <w:spacing w:after="80" w:line="264"/>
-      </w:pPr>
-      <w:r>
-        <w:rPr>
-          <w:color w:val="1F2937"/>
-          <w:sz w:val="21"/>
-          <w:szCs w:val="21"/>
-        </w:rPr>
-        <w:t xml:space="preserve">El diagnóstico se selecciona de una lista cerrada; no se redacta como texto libre. El sistema no diagnostica por sí mismo: solo registra lo que el fisioterapeuta indica.</w:t>
-      </w:r>
-    </w:p>
-    <w:p>
-      <w:pPr>
-        <w:pStyle w:val="Heading3"/>
-        <w:spacing w:after="120" w:before="240"/>
-      </w:pPr>
-      <w:r>
-        <w:rPr>
-          <w:b/>
-          <w:bCs/>
-          <w:color w:val="1F2937"/>
-          <w:sz w:val="23"/>
-          <w:szCs w:val="23"/>
-        </w:rPr>
-        <w:t xml:space="preserve">7.11 Gestionar el catálogo de ejercicios</w:t>
-      </w:r>
-    </w:p>
-    <w:p>
-      <w:pPr>
-        <w:spacing w:after="80" w:before="160"/>
-      </w:pPr>
-      <w:r>
-        <w:rPr>
-          <w:b/>
-          <w:bCs/>
-          <w:i/>
-          <w:iCs/>
-          <w:color w:val="0E7A70"/>
-          <w:sz w:val="21"/>
-          <w:szCs w:val="21"/>
-        </w:rPr>
-        <w:t xml:space="preserve">Descripción</w:t>
-      </w:r>
-    </w:p>
-    <w:p>
-      <w:pPr>
-        <w:spacing w:after="160" w:line="276"/>
-      </w:pPr>
-      <w:r>
-        <w:rPr>
-          <w:color w:val="1F2937"/>
-          <w:sz w:val="21"/>
-          <w:szCs w:val="21"/>
-        </w:rPr>
-        <w:t xml:space="preserve">Permite registrar, editar, desactivar, reactivar y eliminar los ejercicios terapéuticos disponibles para asignar a los pacientes.</w:t>
-      </w:r>
-    </w:p>
-    <w:p>
-      <w:pPr>
-        <w:spacing w:after="80" w:before="160"/>
-      </w:pPr>
-      <w:r>
-        <w:rPr>
-          <w:b/>
-          <w:bCs/>
-          <w:i/>
-          <w:iCs/>
-          <w:color w:val="0E7A70"/>
-          <w:sz w:val="21"/>
-          <w:szCs w:val="21"/>
-        </w:rPr>
-        <w:t xml:space="preserve">Acceso</w:t>
-      </w:r>
-    </w:p>
-    <w:p>
-      <w:pPr>
-        <w:spacing w:after="160" w:line="276"/>
-      </w:pPr>
-      <w:r>
-        <w:rPr>
-          <w:color w:val="1F2937"/>
-          <w:sz w:val="21"/>
-          <w:szCs w:val="21"/>
-        </w:rPr>
-        <w:t xml:space="preserve">Menú lateral → Ejercicios.</w:t>
-      </w:r>
-    </w:p>
-    <w:p>
-      <w:pPr>
-        <w:spacing w:after="80" w:before="160"/>
-      </w:pPr>
-      <w:r>
-        <w:rPr>
-          <w:b/>
-          <w:bCs/>
-          <w:i/>
-          <w:iCs/>
-          <w:color w:val="0E7A70"/>
-          <w:sz w:val="21"/>
-          <w:szCs w:val="21"/>
-        </w:rPr>
-        <w:t xml:space="preserve">Procedimiento</w:t>
+        <w:t xml:space="preserve">Revisar la sección "Progreso por ejercicio", que agrupa el promedio de ejecución por cada ejercicio asignado.</w:t>
       </w:r>
     </w:p>
     <w:p>
@@ -5083,15 +4861,15 @@
           <w:sz w:val="21"/>
           <w:szCs w:val="21"/>
         </w:rPr>
-        <w:t xml:space="preserve">Paso 1: </w:t>
-      </w:r>
-      <w:r>
-        <w:rPr>
-          <w:color w:val="1F2937"/>
-          <w:sz w:val="21"/>
-          <w:szCs w:val="21"/>
-        </w:rPr>
-        <w:t xml:space="preserve">Seleccionar Ejercicios en el menú lateral para ver el catálogo completo.</w:t>
+        <w:t xml:space="preserve">Paso 4: </w:t>
+      </w:r>
+      <w:r>
+        <w:rPr>
+          <w:color w:val="1F2937"/>
+          <w:sz w:val="21"/>
+          <w:szCs w:val="21"/>
+        </w:rPr>
+        <w:t xml:space="preserve">Revisar la sección "Sesiones registradas"; cada sesión completada puede seleccionarse para ver su resultado detallado, y cuenta con un ícono directo para Registrar recomendación.</w:t>
       </w:r>
     </w:p>
     <w:p>
@@ -5106,75 +4884,6 @@
           <w:sz w:val="21"/>
           <w:szCs w:val="21"/>
         </w:rPr>
-        <w:t xml:space="preserve">Paso 2: </w:t>
-      </w:r>
-      <w:r>
-        <w:rPr>
-          <w:color w:val="1F2937"/>
-          <w:sz w:val="21"/>
-          <w:szCs w:val="21"/>
-        </w:rPr>
-        <w:t xml:space="preserve">Para registrar uno nuevo, presionar el ícono Registrar ejercicio.</w:t>
-      </w:r>
-    </w:p>
-    <w:p>
-      <w:pPr>
-        <w:spacing w:after="100" w:line="264"/>
-      </w:pPr>
-      <w:r>
-        <w:rPr>
-          <w:b/>
-          <w:bCs/>
-          <w:color w:val="0E7A70"/>
-          <w:sz w:val="21"/>
-          <w:szCs w:val="21"/>
-        </w:rPr>
-        <w:t xml:space="preserve">Paso 3: </w:t>
-      </w:r>
-      <w:r>
-        <w:rPr>
-          <w:color w:val="1F2937"/>
-          <w:sz w:val="21"/>
-          <w:szCs w:val="21"/>
-        </w:rPr>
-        <w:t xml:space="preserve">Completar la sección "Información básica": Nombre, Descripción, Categoría (Movilidad o Control motor), Duración por repetición (s) y Repeticiones.</w:t>
-      </w:r>
-    </w:p>
-    <w:p>
-      <w:pPr>
-        <w:spacing w:after="100" w:line="264"/>
-      </w:pPr>
-      <w:r>
-        <w:rPr>
-          <w:b/>
-          <w:bCs/>
-          <w:color w:val="0E7A70"/>
-          <w:sz w:val="21"/>
-          <w:szCs w:val="21"/>
-        </w:rPr>
-        <w:t xml:space="preserve">Paso 4: </w:t>
-      </w:r>
-      <w:r>
-        <w:rPr>
-          <w:color w:val="1F2937"/>
-          <w:sz w:val="21"/>
-          <w:szCs w:val="21"/>
-        </w:rPr>
-        <w:t xml:space="preserve">Opcionalmente, en "Ángulos de referencia por articulación", presionar Agregar articulación y definir el ángulo Mín. (°) y Máx. (°) esperado para cada articulación relevante.</w:t>
-      </w:r>
-    </w:p>
-    <w:p>
-      <w:pPr>
-        <w:spacing w:after="100" w:line="264"/>
-      </w:pPr>
-      <w:r>
-        <w:rPr>
-          <w:b/>
-          <w:bCs/>
-          <w:color w:val="0E7A70"/>
-          <w:sz w:val="21"/>
-          <w:szCs w:val="21"/>
-        </w:rPr>
         <w:t xml:space="preserve">Paso 5: </w:t>
       </w:r>
       <w:r>
@@ -5183,76 +4892,7 @@
           <w:sz w:val="21"/>
           <w:szCs w:val="21"/>
         </w:rPr>
-        <w:t xml:space="preserve">Opcionalmente, marcar los diagnósticos para los que este ejercicio se sugiere primero al asignar sesiones.</w:t>
-      </w:r>
-    </w:p>
-    <w:p>
-      <w:pPr>
-        <w:spacing w:after="100" w:line="264"/>
-      </w:pPr>
-      <w:r>
-        <w:rPr>
-          <w:b/>
-          <w:bCs/>
-          <w:color w:val="0E7A70"/>
-          <w:sz w:val="21"/>
-          <w:szCs w:val="21"/>
-        </w:rPr>
-        <w:t xml:space="preserve">Paso 6: </w:t>
-      </w:r>
-      <w:r>
-        <w:rPr>
-          <w:color w:val="1F2937"/>
-          <w:sz w:val="21"/>
-          <w:szCs w:val="21"/>
-        </w:rPr>
-        <w:t xml:space="preserve">Opcionalmente, seleccionar un archivo de imagen o video como material terapéutico.</w:t>
-      </w:r>
-    </w:p>
-    <w:p>
-      <w:pPr>
-        <w:spacing w:after="100" w:line="264"/>
-      </w:pPr>
-      <w:r>
-        <w:rPr>
-          <w:b/>
-          <w:bCs/>
-          <w:color w:val="0E7A70"/>
-          <w:sz w:val="21"/>
-          <w:szCs w:val="21"/>
-        </w:rPr>
-        <w:t xml:space="preserve">Paso 7: </w:t>
-      </w:r>
-      <w:r>
-        <w:rPr>
-          <w:color w:val="1F2937"/>
-          <w:sz w:val="21"/>
-          <w:szCs w:val="21"/>
-        </w:rPr>
-        <w:t xml:space="preserve">Presionar Guardar ejercicio.</w:t>
-      </w:r>
-    </w:p>
-    <w:p>
-      <w:pPr>
-        <w:spacing w:after="100" w:line="264"/>
-      </w:pPr>
-      <w:r>
-        <w:rPr>
-          <w:b/>
-          <w:bCs/>
-          <w:color w:val="0E7A70"/>
-          <w:sz w:val="21"/>
-          <w:szCs w:val="21"/>
-        </w:rPr>
-        <w:t xml:space="preserve">Paso 8: </w:t>
-      </w:r>
-      <w:r>
-        <w:rPr>
-          <w:color w:val="1F2937"/>
-          <w:sz w:val="21"/>
-          <w:szCs w:val="21"/>
-        </w:rPr>
-        <w:t xml:space="preserve">Para editar, desactivar/activar o eliminar un ejercicio existente, usar el menú "⋮" de su tarjeta en el catálogo.</w:t>
+        <w:t>Presionar el ícono superior Asignar sesión para asignarle un nuevo ejercicio (ver funcionalidad 7.14).</w:t>
       </w:r>
     </w:p>
     <w:p>
@@ -5290,7 +4930,7 @@
           <w:sz w:val="19"/>
           <w:szCs w:val="19"/>
         </w:rPr>
-        <w:t xml:space="preserve">Figura 11. Formulario de registro de ejercicio.</w:t>
+        <w:t>Figura 11. Detalle de un paciente.</w:t>
       </w:r>
     </w:p>
     <w:p>
@@ -5320,7 +4960,7 @@
           <w:sz w:val="21"/>
           <w:szCs w:val="21"/>
         </w:rPr>
-        <w:t xml:space="preserve">El ejercicio queda disponible (o se actualiza) en el catálogo para ser asignado a los pacientes.</w:t>
+        <w:t xml:space="preserve">El fisioterapeuta obtiene una visión completa del avance del paciente para decidir los siguientes pasos de su tratamiento.</w:t>
       </w:r>
     </w:p>
     <w:p>
@@ -5337,7 +4977,7 @@
           <w:sz w:val="21"/>
           <w:szCs w:val="21"/>
         </w:rPr>
-        <w:t xml:space="preserve">Validaciones</w:t>
+        <w:t xml:space="preserve">Mensajes del sistema</w:t>
       </w:r>
     </w:p>
     <w:p>
@@ -5355,24 +4995,7 @@
           <w:sz w:val="21"/>
           <w:szCs w:val="21"/>
         </w:rPr>
-        <w:t xml:space="preserve">"La duración debe ser un número de segundos mayor a cero."</w:t>
-      </w:r>
-    </w:p>
-    <w:p>
-      <w:pPr>
-        <w:spacing w:after="80" w:before="160"/>
-      </w:pPr>
-      <w:r>
-        <w:rPr>
-          <w:b/>
-          <w:bCs/>
-          <w:i/>
-          <w:iCs/>
-          <w:color w:val="0E7A70"/>
-          <w:sz w:val="21"/>
-          <w:szCs w:val="21"/>
-        </w:rPr>
-        <w:t xml:space="preserve">Mensajes del sistema</w:t>
+        <w:t xml:space="preserve">"Este paciente aún no tiene sesiones registradas."</w:t>
       </w:r>
     </w:p>
     <w:p>
@@ -5390,7 +5013,216 @@
           <w:sz w:val="21"/>
           <w:szCs w:val="21"/>
         </w:rPr>
-        <w:t xml:space="preserve">"Aún no hay ejercicios registrados."</w:t>
+        <w:t xml:space="preserve">"No hay sesiones en este período."</w:t>
+      </w:r>
+    </w:p>
+    <w:p>
+      <w:pPr>
+        <w:pStyle w:val="Heading3"/>
+        <w:spacing w:after="120" w:before="240"/>
+      </w:pPr>
+      <w:r>
+        <w:rPr>
+          <w:b/>
+          <w:bCs/>
+          <w:color w:val="1F2937"/>
+          <w:sz w:val="23"/>
+          <w:szCs w:val="23"/>
+        </w:rPr>
+        <w:t>7.11 Registrar y editar el diagnóstico de un paciente</w:t>
+      </w:r>
+    </w:p>
+    <w:p>
+      <w:pPr>
+        <w:spacing w:after="80" w:before="160"/>
+      </w:pPr>
+      <w:r>
+        <w:rPr>
+          <w:b/>
+          <w:bCs/>
+          <w:i/>
+          <w:iCs/>
+          <w:color w:val="0E7A70"/>
+          <w:sz w:val="21"/>
+          <w:szCs w:val="21"/>
+        </w:rPr>
+        <w:t xml:space="preserve">Descripción</w:t>
+      </w:r>
+    </w:p>
+    <w:p>
+      <w:pPr>
+        <w:spacing w:after="160" w:line="276"/>
+      </w:pPr>
+      <w:r>
+        <w:rPr>
+          <w:color w:val="1F2937"/>
+          <w:sz w:val="21"/>
+          <w:szCs w:val="21"/>
+        </w:rPr>
+        <w:t xml:space="preserve">Permite asociar uno o más diagnósticos, de un catálogo cerrado, al paciente.</w:t>
+      </w:r>
+    </w:p>
+    <w:p>
+      <w:pPr>
+        <w:spacing w:after="80" w:before="160"/>
+      </w:pPr>
+      <w:r>
+        <w:rPr>
+          <w:b/>
+          <w:bCs/>
+          <w:i/>
+          <w:iCs/>
+          <w:color w:val="0E7A70"/>
+          <w:sz w:val="21"/>
+          <w:szCs w:val="21"/>
+        </w:rPr>
+        <w:t xml:space="preserve">Acceso</w:t>
+      </w:r>
+    </w:p>
+    <w:p>
+      <w:pPr>
+        <w:spacing w:after="160" w:line="276"/>
+      </w:pPr>
+      <w:r>
+        <w:rPr>
+          <w:color w:val="1F2937"/>
+          <w:sz w:val="21"/>
+          <w:szCs w:val="21"/>
+        </w:rPr>
+        <w:t xml:space="preserve">Desde el detalle del paciente, sección "Diagnóstico(s)", ícono Editar diagnóstico.</w:t>
+      </w:r>
+    </w:p>
+    <w:p>
+      <w:pPr>
+        <w:spacing w:after="80" w:before="160"/>
+      </w:pPr>
+      <w:r>
+        <w:rPr>
+          <w:b/>
+          <w:bCs/>
+          <w:i/>
+          <w:iCs/>
+          <w:color w:val="0E7A70"/>
+          <w:sz w:val="21"/>
+          <w:szCs w:val="21"/>
+        </w:rPr>
+        <w:t xml:space="preserve">Procedimiento</w:t>
+      </w:r>
+    </w:p>
+    <w:p>
+      <w:pPr>
+        <w:spacing w:after="100" w:line="264"/>
+      </w:pPr>
+      <w:r>
+        <w:rPr>
+          <w:b/>
+          <w:bCs/>
+          <w:color w:val="0E7A70"/>
+          <w:sz w:val="21"/>
+          <w:szCs w:val="21"/>
+        </w:rPr>
+        <w:t xml:space="preserve">Paso 1: </w:t>
+      </w:r>
+      <w:r>
+        <w:rPr>
+          <w:color w:val="1F2937"/>
+          <w:sz w:val="21"/>
+          <w:szCs w:val="21"/>
+        </w:rPr>
+        <w:t xml:space="preserve">En el detalle del paciente, presionar el ícono Editar diagnóstico.</w:t>
+      </w:r>
+    </w:p>
+    <w:p>
+      <w:pPr>
+        <w:spacing w:after="100" w:line="264"/>
+      </w:pPr>
+      <w:r>
+        <w:rPr>
+          <w:b/>
+          <w:bCs/>
+          <w:color w:val="0E7A70"/>
+          <w:sz w:val="21"/>
+          <w:szCs w:val="21"/>
+        </w:rPr>
+        <w:t xml:space="preserve">Paso 2: </w:t>
+      </w:r>
+      <w:r>
+        <w:rPr>
+          <w:color w:val="1F2937"/>
+          <w:sz w:val="21"/>
+          <w:szCs w:val="21"/>
+        </w:rPr>
+        <w:t xml:space="preserve">Marcar uno o más diagnósticos del catálogo cerrado (agrupados por región del cuerpo: columna, rodilla u hombro).</w:t>
+      </w:r>
+    </w:p>
+    <w:p>
+      <w:pPr>
+        <w:spacing w:after="100" w:line="264"/>
+      </w:pPr>
+      <w:r>
+        <w:rPr>
+          <w:b/>
+          <w:bCs/>
+          <w:color w:val="0E7A70"/>
+          <w:sz w:val="21"/>
+          <w:szCs w:val="21"/>
+        </w:rPr>
+        <w:t xml:space="preserve">Paso 3: </w:t>
+      </w:r>
+      <w:r>
+        <w:rPr>
+          <w:color w:val="1F2937"/>
+          <w:sz w:val="21"/>
+          <w:szCs w:val="21"/>
+        </w:rPr>
+        <w:t xml:space="preserve">Presionar Guardar, o Cancelar para descartar los cambios.</w:t>
+      </w:r>
+    </w:p>
+    <w:p>
+      <w:pPr>
+        <w:spacing w:after="80" w:before="160"/>
+      </w:pPr>
+      <w:r>
+        <w:rPr>
+          <w:b/>
+          <w:bCs/>
+          <w:i/>
+          <w:iCs/>
+          <w:color w:val="0E7A70"/>
+          <w:sz w:val="21"/>
+          <w:szCs w:val="21"/>
+        </w:rPr>
+        <w:t xml:space="preserve">Resultado</w:t>
+      </w:r>
+    </w:p>
+    <w:p>
+      <w:pPr>
+        <w:spacing w:after="160" w:line="276"/>
+      </w:pPr>
+      <w:r>
+        <w:rPr>
+          <w:color w:val="1F2937"/>
+          <w:sz w:val="21"/>
+          <w:szCs w:val="21"/>
+        </w:rPr>
+        <w:t>El o los diagnósticos quedan asociados al paciente y se usan para sugerir ejercicios relacionados al momento de asignar una sesión (ver funcionalidad 7.14).</w:t>
+      </w:r>
+    </w:p>
+    <w:p>
+      <w:pPr>
+        <w:spacing w:after="80" w:before="160"/>
+      </w:pPr>
+      <w:r>
+        <w:rPr>
+          <w:b/>
+          <w:bCs/>
+          <w:i/>
+          <w:iCs/>
+          <w:color w:val="0E7A70"/>
+          <w:sz w:val="21"/>
+          <w:szCs w:val="21"/>
+        </w:rPr>
+        <w:t xml:space="preserve">Mensajes del sistema</w:t>
       </w:r>
     </w:p>
     <w:p>
@@ -5408,7 +5240,7 @@
           <w:sz w:val="21"/>
           <w:szCs w:val="21"/>
         </w:rPr>
-        <w:t xml:space="preserve">Cuadro de confirmación al eliminar: "¿Seguro que deseas eliminar '[nombre]'? Esta acción no se puede deshacer."</w:t>
+        <w:t xml:space="preserve">"Sin diagnóstico registrado." — se muestra si el paciente todavía no tiene ninguno.</w:t>
       </w:r>
     </w:p>
     <w:p>
@@ -5443,7 +5275,7 @@
           <w:sz w:val="21"/>
           <w:szCs w:val="21"/>
         </w:rPr>
-        <w:t xml:space="preserve">Un ejercicio con sesiones históricas asociadas conviene desactivarlo en lugar de eliminarlo: al desactivarlo, deja de aparecer como opción para nuevas asignaciones, pero conserva el historial de las sesiones ya registradas. Puede reactivarse en cualquier momento.</w:t>
+        <w:t xml:space="preserve">El diagnóstico se selecciona de una lista cerrada; no se redacta como texto libre. El sistema no diagnostica por sí mismo: solo registra lo que el fisioterapeuta indica.</w:t>
       </w:r>
     </w:p>
     <w:p>
@@ -5459,7 +5291,7 @@
           <w:sz w:val="23"/>
           <w:szCs w:val="23"/>
         </w:rPr>
-        <w:t xml:space="preserve">7.12 Calcular el rango de movimiento (ROM) automáticamente desde un video</w:t>
+        <w:t>7.12 Gestionar el catálogo de ejercicios</w:t>
       </w:r>
     </w:p>
     <w:p>
@@ -5489,7 +5321,7 @@
           <w:sz w:val="21"/>
           <w:szCs w:val="21"/>
         </w:rPr>
-        <w:t xml:space="preserve">Permite que el sistema analice un video ya cargado como material terapéutico y calcule por sí mismo el ángulo mínimo y máximo observado para la articulación seleccionada, en lugar de escribirlos a mano.</w:t>
+        <w:t xml:space="preserve">Permite registrar, editar, desactivar, reactivar y eliminar los ejercicios terapéuticos disponibles para asignar a los pacientes.</w:t>
       </w:r>
     </w:p>
     <w:p>
@@ -5519,7 +5351,7 @@
           <w:sz w:val="21"/>
           <w:szCs w:val="21"/>
         </w:rPr>
-        <w:t xml:space="preserve">Formulario de ejercicio, sección "Ángulos de referencia", tras seleccionar un video y al menos una articulación.</w:t>
+        <w:t xml:space="preserve">Menú lateral → Ejercicios.</w:t>
       </w:r>
     </w:p>
     <w:p>
@@ -5559,7 +5391,7 @@
           <w:sz w:val="21"/>
           <w:szCs w:val="21"/>
         </w:rPr>
-        <w:t xml:space="preserve">En el formulario de ejercicio, cargar un video como material terapéutico.</w:t>
+        <w:t xml:space="preserve">Seleccionar Ejercicios en el menú lateral para ver el catálogo completo.</w:t>
       </w:r>
     </w:p>
     <w:p>
@@ -5582,7 +5414,7 @@
           <w:sz w:val="21"/>
           <w:szCs w:val="21"/>
         </w:rPr>
-        <w:t xml:space="preserve">Agregar al menos una articulación de referencia.</w:t>
+        <w:t xml:space="preserve">Para registrar uno nuevo, presionar el ícono Registrar ejercicio.</w:t>
       </w:r>
     </w:p>
     <w:p>
@@ -5605,7 +5437,7 @@
           <w:sz w:val="21"/>
           <w:szCs w:val="21"/>
         </w:rPr>
-        <w:t xml:space="preserve">Presionar el botón Calcular rango automáticamente desde el video (mientras se procesa, el botón indica "Analizando video…").</w:t>
+        <w:t xml:space="preserve">Completar la sección "Información básica": Nombre, Descripción, Categoría (Movilidad o Control motor), Duración por repetición (s) y Repeticiones.</w:t>
       </w:r>
     </w:p>
     <w:p>
@@ -5628,7 +5460,7 @@
           <w:sz w:val="21"/>
           <w:szCs w:val="21"/>
         </w:rPr>
-        <w:t xml:space="preserve">El sistema completa los campos Mín. (°) y Máx. (°) con el resultado del análisis.</w:t>
+        <w:t xml:space="preserve">Opcionalmente, en "Ángulos de referencia por articulación", presionar Agregar articulación y definir el ángulo Mín. (°) y Máx. (°) esperado para cada articulación relevante.</w:t>
       </w:r>
     </w:p>
     <w:p>
@@ -5651,165 +5483,7 @@
           <w:sz w:val="21"/>
           <w:szCs w:val="21"/>
         </w:rPr>
-        <w:t xml:space="preserve">Revisar los valores y editarlos manualmente si se considera necesario.</w:t>
-      </w:r>
-    </w:p>
-    <w:p>
-      <w:pPr>
-        <w:spacing w:after="80" w:before="160"/>
-      </w:pPr>
-      <w:r>
-        <w:rPr>
-          <w:b/>
-          <w:bCs/>
-          <w:i/>
-          <w:iCs/>
-          <w:color w:val="0E7A70"/>
-          <w:sz w:val="21"/>
-          <w:szCs w:val="21"/>
-        </w:rPr>
-        <w:t xml:space="preserve">Resultado</w:t>
-      </w:r>
-    </w:p>
-    <w:p>
-      <w:pPr>
-        <w:spacing w:after="160" w:line="276"/>
-      </w:pPr>
-      <w:r>
-        <w:rPr>
-          <w:color w:val="1F2937"/>
-          <w:sz w:val="21"/>
-          <w:szCs w:val="21"/>
-        </w:rPr>
-        <w:t xml:space="preserve">El fisioterapeuta obtiene un punto de partida objetivo para el rango de movimiento del ejercicio, sin tener que medirlo a mano.</w:t>
-      </w:r>
-    </w:p>
-    <w:p>
-      <w:pPr>
-        <w:spacing w:after="80" w:before="160"/>
-      </w:pPr>
-      <w:r>
-        <w:rPr>
-          <w:b/>
-          <w:bCs/>
-          <w:i/>
-          <w:iCs/>
-          <w:color w:val="0E7A70"/>
-          <w:sz w:val="21"/>
-          <w:szCs w:val="21"/>
-        </w:rPr>
-        <w:t xml:space="preserve">Consideraciones</w:t>
-      </w:r>
-    </w:p>
-    <w:p>
-      <w:pPr>
-        <w:pStyle w:val="ListParagraph"/>
-        <w:numPr>
-          <w:ilvl w:val="0"/>
-          <w:numId w:val="1"/>
-        </w:numPr>
-        <w:spacing w:after="80" w:line="264"/>
-      </w:pPr>
-      <w:r>
-        <w:rPr>
-          <w:color w:val="1F2937"/>
-          <w:sz w:val="21"/>
-          <w:szCs w:val="21"/>
-        </w:rPr>
-        <w:t xml:space="preserve">El video se analiza dentro del propio dispositivo, sin subirlo a ningún servicio externo, igual que el monitoreo de los pacientes.</w:t>
-      </w:r>
-    </w:p>
-    <w:p>
-      <w:pPr>
-        <w:pStyle w:val="Heading3"/>
-        <w:spacing w:after="120" w:before="240"/>
-      </w:pPr>
-      <w:r>
-        <w:rPr>
-          <w:b/>
-          <w:bCs/>
-          <w:color w:val="1F2937"/>
-          <w:sz w:val="23"/>
-          <w:szCs w:val="23"/>
-        </w:rPr>
-        <w:t xml:space="preserve">7.13 Asignar una sesión terapéutica a un paciente</w:t>
-      </w:r>
-    </w:p>
-    <w:p>
-      <w:pPr>
-        <w:spacing w:after="80" w:before="160"/>
-      </w:pPr>
-      <w:r>
-        <w:rPr>
-          <w:b/>
-          <w:bCs/>
-          <w:i/>
-          <w:iCs/>
-          <w:color w:val="0E7A70"/>
-          <w:sz w:val="21"/>
-          <w:szCs w:val="21"/>
-        </w:rPr>
-        <w:t xml:space="preserve">Descripción</w:t>
-      </w:r>
-    </w:p>
-    <w:p>
-      <w:pPr>
-        <w:spacing w:after="160" w:line="276"/>
-      </w:pPr>
-      <w:r>
-        <w:rPr>
-          <w:color w:val="1F2937"/>
-          <w:sz w:val="21"/>
-          <w:szCs w:val="21"/>
-        </w:rPr>
-        <w:t xml:space="preserve">Permite asignar un ejercicio del catálogo a un paciente, con la posibilidad de ajustar sus parámetros solo para esa sesión.</w:t>
-      </w:r>
-    </w:p>
-    <w:p>
-      <w:pPr>
-        <w:spacing w:after="80" w:before="160"/>
-      </w:pPr>
-      <w:r>
-        <w:rPr>
-          <w:b/>
-          <w:bCs/>
-          <w:i/>
-          <w:iCs/>
-          <w:color w:val="0E7A70"/>
-          <w:sz w:val="21"/>
-          <w:szCs w:val="21"/>
-        </w:rPr>
-        <w:t xml:space="preserve">Acceso</w:t>
-      </w:r>
-    </w:p>
-    <w:p>
-      <w:pPr>
-        <w:spacing w:after="160" w:line="276"/>
-      </w:pPr>
-      <w:r>
-        <w:rPr>
-          <w:color w:val="1F2937"/>
-          <w:sz w:val="21"/>
-          <w:szCs w:val="21"/>
-        </w:rPr>
-        <w:t xml:space="preserve">Desde el detalle de un paciente, ícono Asignar sesión (o el mismo formulario para editar una sesión pendiente ya asignada).</w:t>
-      </w:r>
-    </w:p>
-    <w:p>
-      <w:pPr>
-        <w:spacing w:after="80" w:before="160"/>
-      </w:pPr>
-      <w:r>
-        <w:rPr>
-          <w:b/>
-          <w:bCs/>
-          <w:i/>
-          <w:iCs/>
-          <w:color w:val="0E7A70"/>
-          <w:sz w:val="21"/>
-          <w:szCs w:val="21"/>
-        </w:rPr>
-        <w:t xml:space="preserve">Procedimiento</w:t>
+        <w:t xml:space="preserve">Opcionalmente, marcar los diagnósticos para los que este ejercicio se sugiere primero al asignar sesiones.</w:t>
       </w:r>
     </w:p>
     <w:p>
@@ -5824,15 +5498,15 @@
           <w:sz w:val="21"/>
           <w:szCs w:val="21"/>
         </w:rPr>
-        <w:t xml:space="preserve">Paso 1: </w:t>
-      </w:r>
-      <w:r>
-        <w:rPr>
-          <w:color w:val="1F2937"/>
-          <w:sz w:val="21"/>
-          <w:szCs w:val="21"/>
-        </w:rPr>
-        <w:t xml:space="preserve">En el detalle del paciente, presionar Asignar sesión.</w:t>
+        <w:t xml:space="preserve">Paso 6: </w:t>
+      </w:r>
+      <w:r>
+        <w:rPr>
+          <w:color w:val="1F2937"/>
+          <w:sz w:val="21"/>
+          <w:szCs w:val="21"/>
+        </w:rPr>
+        <w:t xml:space="preserve">Opcionalmente, seleccionar un archivo de imagen o video como material terapéutico.</w:t>
       </w:r>
     </w:p>
     <w:p>
@@ -5847,15 +5521,15 @@
           <w:sz w:val="21"/>
           <w:szCs w:val="21"/>
         </w:rPr>
-        <w:t xml:space="preserve">Paso 2: </w:t>
-      </w:r>
-      <w:r>
-        <w:rPr>
-          <w:color w:val="1F2937"/>
-          <w:sz w:val="21"/>
-          <w:szCs w:val="21"/>
-        </w:rPr>
-        <w:t xml:space="preserve">En la sección "Ejercicio", seleccionar uno del listado desplegable (los sugeridos según el diagnóstico del paciente aparecen marcados con ★).</w:t>
+        <w:t xml:space="preserve">Paso 7: </w:t>
+      </w:r>
+      <w:r>
+        <w:rPr>
+          <w:color w:val="1F2937"/>
+          <w:sz w:val="21"/>
+          <w:szCs w:val="21"/>
+        </w:rPr>
+        <w:t xml:space="preserve">Presionar Guardar ejercicio.</w:t>
       </w:r>
     </w:p>
     <w:p>
@@ -5870,107 +5544,15 @@
           <w:sz w:val="21"/>
           <w:szCs w:val="21"/>
         </w:rPr>
-        <w:t xml:space="preserve">Paso 3: </w:t>
-      </w:r>
-      <w:r>
-        <w:rPr>
-          <w:color w:val="1F2937"/>
-          <w:sz w:val="21"/>
-          <w:szCs w:val="21"/>
-        </w:rPr>
-        <w:t xml:space="preserve">En "Fecha de asignación", seleccionar la fecha.</w:t>
-      </w:r>
-    </w:p>
-    <w:p>
-      <w:pPr>
-        <w:spacing w:after="100" w:line="264"/>
-      </w:pPr>
-      <w:r>
-        <w:rPr>
-          <w:b/>
-          <w:bCs/>
-          <w:color w:val="0E7A70"/>
-          <w:sz w:val="21"/>
-          <w:szCs w:val="21"/>
-        </w:rPr>
-        <w:t xml:space="preserve">Paso 4: </w:t>
-      </w:r>
-      <w:r>
-        <w:rPr>
-          <w:color w:val="1F2937"/>
-          <w:sz w:val="21"/>
-          <w:szCs w:val="21"/>
-        </w:rPr>
-        <w:t xml:space="preserve">En "Repeticiones", ajustar el número si se desea uno distinto al valor por defecto del ejercicio, y en Duración por repetición (s) ajustar la duración si corresponde. El sistema muestra la Duración estimada total de la sesión.</w:t>
-      </w:r>
-    </w:p>
-    <w:p>
-      <w:pPr>
-        <w:spacing w:after="100" w:line="264"/>
-      </w:pPr>
-      <w:r>
-        <w:rPr>
-          <w:b/>
-          <w:bCs/>
-          <w:color w:val="0E7A70"/>
-          <w:sz w:val="21"/>
-          <w:szCs w:val="21"/>
-        </w:rPr>
-        <w:t xml:space="preserve">Paso 5: </w:t>
-      </w:r>
-      <w:r>
-        <w:rPr>
-          <w:color w:val="1F2937"/>
-          <w:sz w:val="21"/>
-          <w:szCs w:val="21"/>
-        </w:rPr>
-        <w:t xml:space="preserve">Si se desea, marcar "Personalizar ángulo objetivo para este paciente" e indicar un Mínimo (°) y Máximo (°) distintos a los del ejercicio.</w:t>
-      </w:r>
-    </w:p>
-    <w:p>
-      <w:pPr>
-        <w:spacing w:after="100" w:line="264"/>
-      </w:pPr>
-      <w:r>
-        <w:rPr>
-          <w:b/>
-          <w:bCs/>
-          <w:color w:val="0E7A70"/>
-          <w:sz w:val="21"/>
-          <w:szCs w:val="21"/>
-        </w:rPr>
-        <w:t xml:space="preserve">Paso 6: </w:t>
-      </w:r>
-      <w:r>
-        <w:rPr>
-          <w:color w:val="1F2937"/>
-          <w:sz w:val="21"/>
-          <w:szCs w:val="21"/>
-        </w:rPr>
-        <w:t xml:space="preserve">Opcionalmente, escribir una nota en "Notas (opcional)" con indicaciones puntuales para esa sesión.</w:t>
-      </w:r>
-    </w:p>
-    <w:p>
-      <w:pPr>
-        <w:spacing w:after="100" w:line="264"/>
-      </w:pPr>
-      <w:r>
-        <w:rPr>
-          <w:b/>
-          <w:bCs/>
-          <w:color w:val="0E7A70"/>
-          <w:sz w:val="21"/>
-          <w:szCs w:val="21"/>
-        </w:rPr>
-        <w:t xml:space="preserve">Paso 7: </w:t>
-      </w:r>
-      <w:r>
-        <w:rPr>
-          <w:color w:val="1F2937"/>
-          <w:sz w:val="21"/>
-          <w:szCs w:val="21"/>
-        </w:rPr>
-        <w:t xml:space="preserve">Presionar Asignar sesión (o Guardar cambios si se está editando una ya existente).</w:t>
+        <w:t xml:space="preserve">Paso 8: </w:t>
+      </w:r>
+      <w:r>
+        <w:rPr>
+          <w:color w:val="1F2937"/>
+          <w:sz w:val="21"/>
+          <w:szCs w:val="21"/>
+        </w:rPr>
+        <w:t xml:space="preserve">Para editar, desactivar/activar o eliminar un ejercicio existente, usar el menú "⋮" de su tarjeta en el catálogo.</w:t>
       </w:r>
     </w:p>
     <w:p>
@@ -6008,7 +5590,7 @@
           <w:sz w:val="19"/>
           <w:szCs w:val="19"/>
         </w:rPr>
-        <w:t xml:space="preserve">Figura 12. Formulario "Asignar sesión".</w:t>
+        <w:t>Figura 12. Formulario de registro de ejercicio.</w:t>
       </w:r>
     </w:p>
     <w:p>
@@ -6038,7 +5620,7 @@
           <w:sz w:val="21"/>
           <w:szCs w:val="21"/>
         </w:rPr>
-        <w:t xml:space="preserve">La sesión queda disponible de inmediato en la pantalla "Ejercicios" del paciente correspondiente.</w:t>
+        <w:t xml:space="preserve">El ejercicio queda disponible (o se actualiza) en el catálogo para ser asignado a los pacientes.</w:t>
       </w:r>
     </w:p>
     <w:p>
@@ -6055,7 +5637,7 @@
           <w:sz w:val="21"/>
           <w:szCs w:val="21"/>
         </w:rPr>
-        <w:t xml:space="preserve">Mensajes del sistema</w:t>
+        <w:t xml:space="preserve">Validaciones</w:t>
       </w:r>
     </w:p>
     <w:p>
@@ -6073,7 +5655,7 @@
           <w:sz w:val="21"/>
           <w:szCs w:val="21"/>
         </w:rPr>
-        <w:t xml:space="preserve">"Sesión inválida, vuelve a iniciar sesión." — en caso de un problema al guardar.</w:t>
+        <w:t xml:space="preserve">"La duración debe ser un número de segundos mayor a cero."</w:t>
       </w:r>
     </w:p>
     <w:p>
@@ -6090,7 +5672,7 @@
           <w:sz w:val="21"/>
           <w:szCs w:val="21"/>
         </w:rPr>
-        <w:t xml:space="preserve">Consideraciones</w:t>
+        <w:t xml:space="preserve">Mensajes del sistema</w:t>
       </w:r>
     </w:p>
     <w:p>
@@ -6108,7 +5690,7 @@
           <w:sz w:val="21"/>
           <w:szCs w:val="21"/>
         </w:rPr>
-        <w:t xml:space="preserve">Los ajustes de repeticiones, duración y ángulo objetivo solo aplican a esa sesión puntual; no modifican el ejercicio original ni otras sesiones ya asignadas.</w:t>
+        <w:t xml:space="preserve">"Aún no hay ejercicios registrados."</w:t>
       </w:r>
     </w:p>
     <w:p>
@@ -6126,7 +5708,42 @@
           <w:sz w:val="21"/>
           <w:szCs w:val="21"/>
         </w:rPr>
-        <w:t xml:space="preserve">Si se personaliza el ángulo objetivo y existe una nota, el paciente verá un aviso antes de iniciar la sesión indicando que el ejercicio fue ajustado para su etapa actual.</w:t>
+        <w:t xml:space="preserve">Cuadro de confirmación al eliminar: "¿Seguro que deseas eliminar '[nombre]'? Esta acción no se puede deshacer."</w:t>
+      </w:r>
+    </w:p>
+    <w:p>
+      <w:pPr>
+        <w:spacing w:after="80" w:before="160"/>
+      </w:pPr>
+      <w:r>
+        <w:rPr>
+          <w:b/>
+          <w:bCs/>
+          <w:i/>
+          <w:iCs/>
+          <w:color w:val="0E7A70"/>
+          <w:sz w:val="21"/>
+          <w:szCs w:val="21"/>
+        </w:rPr>
+        <w:t xml:space="preserve">Consideraciones</w:t>
+      </w:r>
+    </w:p>
+    <w:p>
+      <w:pPr>
+        <w:pStyle w:val="ListParagraph"/>
+        <w:numPr>
+          <w:ilvl w:val="0"/>
+          <w:numId w:val="1"/>
+        </w:numPr>
+        <w:spacing w:after="80" w:line="264"/>
+      </w:pPr>
+      <w:r>
+        <w:rPr>
+          <w:color w:val="1F2937"/>
+          <w:sz w:val="21"/>
+          <w:szCs w:val="21"/>
+        </w:rPr>
+        <w:t xml:space="preserve">Un ejercicio con sesiones históricas asociadas conviene desactivarlo en lugar de eliminarlo: al desactivarlo, deja de aparecer como opción para nuevas asignaciones, pero conserva el historial de las sesiones ya registradas. Puede reactivarse en cualquier momento.</w:t>
       </w:r>
     </w:p>
     <w:p>
@@ -6142,7 +5759,7 @@
           <w:sz w:val="23"/>
           <w:szCs w:val="23"/>
         </w:rPr>
-        <w:t xml:space="preserve">7.14 Consultar los resultados de todos mis pacientes</w:t>
+        <w:t>7.13 Calcular el rango de movimiento (ROM) automáticamente desde un video</w:t>
       </w:r>
     </w:p>
     <w:p>
@@ -6172,7 +5789,7 @@
           <w:sz w:val="21"/>
           <w:szCs w:val="21"/>
         </w:rPr>
-        <w:t xml:space="preserve">Presenta, en una sola pantalla, todas las sesiones completadas de todos los pacientes del fisioterapeuta, con filtros.</w:t>
+        <w:t xml:space="preserve">Permite que el sistema analice un video ya cargado como material terapéutico y calcule por sí mismo el ángulo mínimo y máximo observado para la articulación seleccionada, en lugar de escribirlos a mano.</w:t>
       </w:r>
     </w:p>
     <w:p>
@@ -6202,7 +5819,7 @@
           <w:sz w:val="21"/>
           <w:szCs w:val="21"/>
         </w:rPr>
-        <w:t xml:space="preserve">Menú lateral → Resultados.</w:t>
+        <w:t xml:space="preserve">Formulario de ejercicio, sección "Ángulos de referencia", tras seleccionar un video y al menos una articulación.</w:t>
       </w:r>
     </w:p>
     <w:p>
@@ -6242,7 +5859,7 @@
           <w:sz w:val="21"/>
           <w:szCs w:val="21"/>
         </w:rPr>
-        <w:t xml:space="preserve">Seleccionar Resultados en el menú lateral.</w:t>
+        <w:t xml:space="preserve">En el formulario de ejercicio, cargar un video como material terapéutico.</w:t>
       </w:r>
     </w:p>
     <w:p>
@@ -6265,7 +5882,7 @@
           <w:sz w:val="21"/>
           <w:szCs w:val="21"/>
         </w:rPr>
-        <w:t xml:space="preserve">Usar el filtro por ejercicio (por defecto, "Todos los ejercicios") para acotar la lista a un ejercicio en particular.</w:t>
+        <w:t xml:space="preserve">Agregar al menos una articulación de referencia.</w:t>
       </w:r>
     </w:p>
     <w:p>
@@ -6288,7 +5905,7 @@
           <w:sz w:val="21"/>
           <w:szCs w:val="21"/>
         </w:rPr>
-        <w:t xml:space="preserve">Usar el filtro por período (Todos, Última semana o Último mes).</w:t>
+        <w:t xml:space="preserve">Presionar el botón Calcular rango automáticamente desde el video (mientras se procesa, el botón indica "Analizando video…").</w:t>
       </w:r>
     </w:p>
     <w:p>
@@ -6311,7 +5928,349 @@
           <w:sz w:val="21"/>
           <w:szCs w:val="21"/>
         </w:rPr>
-        <w:t xml:space="preserve">Seleccionar cualquier sesión de la lista para ver su detalle completo.</w:t>
+        <w:t xml:space="preserve">El sistema completa los campos Mín. (°) y Máx. (°) con el resultado del análisis.</w:t>
+      </w:r>
+    </w:p>
+    <w:p>
+      <w:pPr>
+        <w:spacing w:after="100" w:line="264"/>
+      </w:pPr>
+      <w:r>
+        <w:rPr>
+          <w:b/>
+          <w:bCs/>
+          <w:color w:val="0E7A70"/>
+          <w:sz w:val="21"/>
+          <w:szCs w:val="21"/>
+        </w:rPr>
+        <w:t xml:space="preserve">Paso 5: </w:t>
+      </w:r>
+      <w:r>
+        <w:rPr>
+          <w:color w:val="1F2937"/>
+          <w:sz w:val="21"/>
+          <w:szCs w:val="21"/>
+        </w:rPr>
+        <w:t xml:space="preserve">Revisar los valores y editarlos manualmente si se considera necesario.</w:t>
+      </w:r>
+    </w:p>
+    <w:p>
+      <w:pPr>
+        <w:spacing w:after="80" w:before="160"/>
+      </w:pPr>
+      <w:r>
+        <w:rPr>
+          <w:b/>
+          <w:bCs/>
+          <w:i/>
+          <w:iCs/>
+          <w:color w:val="0E7A70"/>
+          <w:sz w:val="21"/>
+          <w:szCs w:val="21"/>
+        </w:rPr>
+        <w:t xml:space="preserve">Resultado</w:t>
+      </w:r>
+    </w:p>
+    <w:p>
+      <w:pPr>
+        <w:spacing w:after="160" w:line="276"/>
+      </w:pPr>
+      <w:r>
+        <w:rPr>
+          <w:color w:val="1F2937"/>
+          <w:sz w:val="21"/>
+          <w:szCs w:val="21"/>
+        </w:rPr>
+        <w:t xml:space="preserve">El fisioterapeuta obtiene un punto de partida objetivo para el rango de movimiento del ejercicio, sin tener que medirlo a mano.</w:t>
+      </w:r>
+    </w:p>
+    <w:p>
+      <w:pPr>
+        <w:spacing w:after="80" w:before="160"/>
+      </w:pPr>
+      <w:r>
+        <w:rPr>
+          <w:b/>
+          <w:bCs/>
+          <w:i/>
+          <w:iCs/>
+          <w:color w:val="0E7A70"/>
+          <w:sz w:val="21"/>
+          <w:szCs w:val="21"/>
+        </w:rPr>
+        <w:t xml:space="preserve">Consideraciones</w:t>
+      </w:r>
+    </w:p>
+    <w:p>
+      <w:pPr>
+        <w:pStyle w:val="ListParagraph"/>
+        <w:numPr>
+          <w:ilvl w:val="0"/>
+          <w:numId w:val="1"/>
+        </w:numPr>
+        <w:spacing w:after="80" w:line="264"/>
+      </w:pPr>
+      <w:r>
+        <w:rPr>
+          <w:color w:val="1F2937"/>
+          <w:sz w:val="21"/>
+          <w:szCs w:val="21"/>
+        </w:rPr>
+        <w:t xml:space="preserve">El video se analiza dentro del propio dispositivo, sin subirlo a ningún servicio externo, igual que el monitoreo de los pacientes.</w:t>
+      </w:r>
+    </w:p>
+    <w:p>
+      <w:pPr>
+        <w:pStyle w:val="Heading3"/>
+        <w:spacing w:after="120" w:before="240"/>
+      </w:pPr>
+      <w:r>
+        <w:rPr>
+          <w:b/>
+          <w:bCs/>
+          <w:color w:val="1F2937"/>
+          <w:sz w:val="23"/>
+          <w:szCs w:val="23"/>
+        </w:rPr>
+        <w:t>7.14 Asignar una sesión terapéutica a un paciente</w:t>
+      </w:r>
+    </w:p>
+    <w:p>
+      <w:pPr>
+        <w:spacing w:after="80" w:before="160"/>
+      </w:pPr>
+      <w:r>
+        <w:rPr>
+          <w:b/>
+          <w:bCs/>
+          <w:i/>
+          <w:iCs/>
+          <w:color w:val="0E7A70"/>
+          <w:sz w:val="21"/>
+          <w:szCs w:val="21"/>
+        </w:rPr>
+        <w:t xml:space="preserve">Descripción</w:t>
+      </w:r>
+    </w:p>
+    <w:p>
+      <w:pPr>
+        <w:spacing w:after="160" w:line="276"/>
+      </w:pPr>
+      <w:r>
+        <w:rPr>
+          <w:color w:val="1F2937"/>
+          <w:sz w:val="21"/>
+          <w:szCs w:val="21"/>
+        </w:rPr>
+        <w:t xml:space="preserve">Permite asignar un ejercicio del catálogo a un paciente, con la posibilidad de ajustar sus parámetros solo para esa sesión.</w:t>
+      </w:r>
+    </w:p>
+    <w:p>
+      <w:pPr>
+        <w:spacing w:after="80" w:before="160"/>
+      </w:pPr>
+      <w:r>
+        <w:rPr>
+          <w:b/>
+          <w:bCs/>
+          <w:i/>
+          <w:iCs/>
+          <w:color w:val="0E7A70"/>
+          <w:sz w:val="21"/>
+          <w:szCs w:val="21"/>
+        </w:rPr>
+        <w:t xml:space="preserve">Acceso</w:t>
+      </w:r>
+    </w:p>
+    <w:p>
+      <w:pPr>
+        <w:spacing w:after="160" w:line="276"/>
+      </w:pPr>
+      <w:r>
+        <w:rPr>
+          <w:color w:val="1F2937"/>
+          <w:sz w:val="21"/>
+          <w:szCs w:val="21"/>
+        </w:rPr>
+        <w:t xml:space="preserve">Desde el detalle de un paciente, ícono Asignar sesión (o el mismo formulario para editar una sesión pendiente ya asignada).</w:t>
+      </w:r>
+    </w:p>
+    <w:p>
+      <w:pPr>
+        <w:spacing w:after="80" w:before="160"/>
+      </w:pPr>
+      <w:r>
+        <w:rPr>
+          <w:b/>
+          <w:bCs/>
+          <w:i/>
+          <w:iCs/>
+          <w:color w:val="0E7A70"/>
+          <w:sz w:val="21"/>
+          <w:szCs w:val="21"/>
+        </w:rPr>
+        <w:t xml:space="preserve">Procedimiento</w:t>
+      </w:r>
+    </w:p>
+    <w:p>
+      <w:pPr>
+        <w:spacing w:after="100" w:line="264"/>
+      </w:pPr>
+      <w:r>
+        <w:rPr>
+          <w:b/>
+          <w:bCs/>
+          <w:color w:val="0E7A70"/>
+          <w:sz w:val="21"/>
+          <w:szCs w:val="21"/>
+        </w:rPr>
+        <w:t xml:space="preserve">Paso 1: </w:t>
+      </w:r>
+      <w:r>
+        <w:rPr>
+          <w:color w:val="1F2937"/>
+          <w:sz w:val="21"/>
+          <w:szCs w:val="21"/>
+        </w:rPr>
+        <w:t xml:space="preserve">En el detalle del paciente, presionar Asignar sesión.</w:t>
+      </w:r>
+    </w:p>
+    <w:p>
+      <w:pPr>
+        <w:spacing w:after="100" w:line="264"/>
+      </w:pPr>
+      <w:r>
+        <w:rPr>
+          <w:b/>
+          <w:bCs/>
+          <w:color w:val="0E7A70"/>
+          <w:sz w:val="21"/>
+          <w:szCs w:val="21"/>
+        </w:rPr>
+        <w:t xml:space="preserve">Paso 2: </w:t>
+      </w:r>
+      <w:r>
+        <w:rPr>
+          <w:color w:val="1F2937"/>
+          <w:sz w:val="21"/>
+          <w:szCs w:val="21"/>
+        </w:rPr>
+        <w:t xml:space="preserve">En la sección "Ejercicio", seleccionar uno del listado desplegable (los sugeridos según el diagnóstico del paciente aparecen marcados con ★).</w:t>
+      </w:r>
+    </w:p>
+    <w:p>
+      <w:pPr>
+        <w:spacing w:after="100" w:line="264"/>
+      </w:pPr>
+      <w:r>
+        <w:rPr>
+          <w:b/>
+          <w:bCs/>
+          <w:color w:val="0E7A70"/>
+          <w:sz w:val="21"/>
+          <w:szCs w:val="21"/>
+        </w:rPr>
+        <w:t xml:space="preserve">Paso 3: </w:t>
+      </w:r>
+      <w:r>
+        <w:rPr>
+          <w:color w:val="1F2937"/>
+          <w:sz w:val="21"/>
+          <w:szCs w:val="21"/>
+        </w:rPr>
+        <w:t xml:space="preserve">En "Fecha de asignación", seleccionar la fecha.</w:t>
+      </w:r>
+    </w:p>
+    <w:p>
+      <w:pPr>
+        <w:spacing w:after="100" w:line="264"/>
+      </w:pPr>
+      <w:r>
+        <w:rPr>
+          <w:b/>
+          <w:bCs/>
+          <w:color w:val="0E7A70"/>
+          <w:sz w:val="21"/>
+          <w:szCs w:val="21"/>
+        </w:rPr>
+        <w:t xml:space="preserve">Paso 4: </w:t>
+      </w:r>
+      <w:r>
+        <w:rPr>
+          <w:color w:val="1F2937"/>
+          <w:sz w:val="21"/>
+          <w:szCs w:val="21"/>
+        </w:rPr>
+        <w:t xml:space="preserve">En "Repeticiones", ajustar el número si se desea uno distinto al valor por defecto del ejercicio, y en Duración por repetición (s) ajustar la duración si corresponde. El sistema muestra la Duración estimada total de la sesión.</w:t>
+      </w:r>
+    </w:p>
+    <w:p>
+      <w:pPr>
+        <w:spacing w:after="100" w:line="264"/>
+      </w:pPr>
+      <w:r>
+        <w:rPr>
+          <w:b/>
+          <w:bCs/>
+          <w:color w:val="0E7A70"/>
+          <w:sz w:val="21"/>
+          <w:szCs w:val="21"/>
+        </w:rPr>
+        <w:t xml:space="preserve">Paso 5: </w:t>
+      </w:r>
+      <w:r>
+        <w:rPr>
+          <w:color w:val="1F2937"/>
+          <w:sz w:val="21"/>
+          <w:szCs w:val="21"/>
+        </w:rPr>
+        <w:t xml:space="preserve">Si se desea, marcar "Personalizar ángulo objetivo para este paciente" e indicar un Mínimo (°) y Máximo (°) distintos a los del ejercicio.</w:t>
+      </w:r>
+    </w:p>
+    <w:p>
+      <w:pPr>
+        <w:spacing w:after="100" w:line="264"/>
+      </w:pPr>
+      <w:r>
+        <w:rPr>
+          <w:b/>
+          <w:bCs/>
+          <w:color w:val="0E7A70"/>
+          <w:sz w:val="21"/>
+          <w:szCs w:val="21"/>
+        </w:rPr>
+        <w:t xml:space="preserve">Paso 6: </w:t>
+      </w:r>
+      <w:r>
+        <w:rPr>
+          <w:color w:val="1F2937"/>
+          <w:sz w:val="21"/>
+          <w:szCs w:val="21"/>
+        </w:rPr>
+        <w:t xml:space="preserve">Opcionalmente, escribir una nota en "Notas (opcional)" con indicaciones puntuales para esa sesión.</w:t>
+      </w:r>
+    </w:p>
+    <w:p>
+      <w:pPr>
+        <w:spacing w:after="100" w:line="264"/>
+      </w:pPr>
+      <w:r>
+        <w:rPr>
+          <w:b/>
+          <w:bCs/>
+          <w:color w:val="0E7A70"/>
+          <w:sz w:val="21"/>
+          <w:szCs w:val="21"/>
+        </w:rPr>
+        <w:t xml:space="preserve">Paso 7: </w:t>
+      </w:r>
+      <w:r>
+        <w:rPr>
+          <w:color w:val="1F2937"/>
+          <w:sz w:val="21"/>
+          <w:szCs w:val="21"/>
+        </w:rPr>
+        <w:t xml:space="preserve">Presionar Asignar sesión (o Guardar cambios si se está editando una ya existente).</w:t>
       </w:r>
     </w:p>
     <w:p>
@@ -6349,7 +6308,7 @@
           <w:sz w:val="19"/>
           <w:szCs w:val="19"/>
         </w:rPr>
-        <w:t xml:space="preserve">Figura 13. Pantalla "Resultados".</w:t>
+        <w:t>Figura 13. Formulario "Asignar sesión".</w:t>
       </w:r>
     </w:p>
     <w:p>
@@ -6379,7 +6338,7 @@
           <w:sz w:val="21"/>
           <w:szCs w:val="21"/>
         </w:rPr>
-        <w:t xml:space="preserve">El fisioterapeuta obtiene una vista consolidada del desempeño de todos sus pacientes, sin tener que revisarlos uno por uno.</w:t>
+        <w:t xml:space="preserve">La sesión queda disponible de inmediato en la pantalla "Ejercicios" del paciente correspondiente.</w:t>
       </w:r>
     </w:p>
     <w:p>
@@ -6414,7 +6373,60 @@
           <w:sz w:val="21"/>
           <w:szCs w:val="21"/>
         </w:rPr>
-        <w:t xml:space="preserve">"No hay sesiones completadas que cumplan el filtro."</w:t>
+        <w:t xml:space="preserve">"Sesión inválida, vuelve a iniciar sesión." — en caso de un problema al guardar.</w:t>
+      </w:r>
+    </w:p>
+    <w:p>
+      <w:pPr>
+        <w:spacing w:after="80" w:before="160"/>
+      </w:pPr>
+      <w:r>
+        <w:rPr>
+          <w:b/>
+          <w:bCs/>
+          <w:i/>
+          <w:iCs/>
+          <w:color w:val="0E7A70"/>
+          <w:sz w:val="21"/>
+          <w:szCs w:val="21"/>
+        </w:rPr>
+        <w:t xml:space="preserve">Consideraciones</w:t>
+      </w:r>
+    </w:p>
+    <w:p>
+      <w:pPr>
+        <w:pStyle w:val="ListParagraph"/>
+        <w:numPr>
+          <w:ilvl w:val="0"/>
+          <w:numId w:val="1"/>
+        </w:numPr>
+        <w:spacing w:after="80" w:line="264"/>
+      </w:pPr>
+      <w:r>
+        <w:rPr>
+          <w:color w:val="1F2937"/>
+          <w:sz w:val="21"/>
+          <w:szCs w:val="21"/>
+        </w:rPr>
+        <w:t xml:space="preserve">Los ajustes de repeticiones, duración y ángulo objetivo solo aplican a esa sesión puntual; no modifican el ejercicio original ni otras sesiones ya asignadas.</w:t>
+      </w:r>
+    </w:p>
+    <w:p>
+      <w:pPr>
+        <w:pStyle w:val="ListParagraph"/>
+        <w:numPr>
+          <w:ilvl w:val="0"/>
+          <w:numId w:val="1"/>
+        </w:numPr>
+        <w:spacing w:after="80" w:line="264"/>
+      </w:pPr>
+      <w:r>
+        <w:rPr>
+          <w:color w:val="1F2937"/>
+          <w:sz w:val="21"/>
+          <w:szCs w:val="21"/>
+        </w:rPr>
+        <w:t xml:space="preserve">Si se personaliza el ángulo objetivo y existe una nota, el paciente verá un aviso antes de iniciar la sesión indicando que el ejercicio fue ajustado para su etapa actual.</w:t>
       </w:r>
     </w:p>
     <w:p>
@@ -6430,7 +6442,7 @@
           <w:sz w:val="23"/>
           <w:szCs w:val="23"/>
         </w:rPr>
-        <w:t xml:space="preserve">7.15 Consultar el detalle de resultado de una sesión (por repetición)</w:t>
+        <w:t xml:space="preserve">7.15 Consultar los resultados de mis pacientes</w:t>
       </w:r>
     </w:p>
     <w:p>
@@ -6460,7 +6472,7 @@
           <w:sz w:val="21"/>
           <w:szCs w:val="21"/>
         </w:rPr>
-        <w:t xml:space="preserve">Muestra el desglose completo de una sesión: precisión por repetición, ángulos detectados frente a los esperados y el detalle de cada repetición individual, como base para registrar una recomendación.</w:t>
+        <w:t xml:space="preserve">Permite recorrer los resultados por paciente: primero la lista de pacientes asignados y, al seleccionar uno, todas sus sesiones (completas, incompletas y por hacer).</w:t>
       </w:r>
     </w:p>
     <w:p>
@@ -6490,7 +6502,7 @@
           <w:sz w:val="21"/>
           <w:szCs w:val="21"/>
         </w:rPr>
-        <w:t xml:space="preserve">Desde "Resultados" o desde el detalle de un paciente, al seleccionar una sesión completada.</w:t>
+        <w:t xml:space="preserve">Menú lateral → Resultados.</w:t>
       </w:r>
     </w:p>
     <w:p>
@@ -6530,7 +6542,7 @@
           <w:sz w:val="21"/>
           <w:szCs w:val="21"/>
         </w:rPr>
-        <w:t xml:space="preserve">Seleccionar una sesión completada.</w:t>
+        <w:t xml:space="preserve">Seleccionar Resultados en el menú lateral; el sistema muestra la lista de pacientes asignados.</w:t>
       </w:r>
     </w:p>
     <w:p>
@@ -6553,7 +6565,7 @@
           <w:sz w:val="21"/>
           <w:szCs w:val="21"/>
         </w:rPr>
-        <w:t xml:space="preserve">Revisar el resumen (repeticiones completadas/asignadas, correctas, errores y desviación promedio) y el gráfico "Precisión por repetición".</w:t>
+        <w:t xml:space="preserve">Seleccionar un paciente; el sistema muestra todas sus sesiones con su estado: Completada, Incompleta (finalizada antes de tiempo) o Por hacer.</w:t>
       </w:r>
     </w:p>
     <w:p>
@@ -6576,7 +6588,7 @@
           <w:sz w:val="21"/>
           <w:szCs w:val="21"/>
         </w:rPr>
-        <w:t xml:space="preserve">Revisar "Detalle por repetición": se muestran las primeras repeticiones y, si hay más, el botón Ver más repeticiones abre el listado completo, incluyendo el ángulo detectado frente al esperado en cada error (por ejemplo, "Flexión incorrecta — 150° (esperado 120°)").</w:t>
+        <w:t xml:space="preserve">Si se desea, usar el filtro por período (Todos, Última semana o Último mes) y el filtro por ejercicio para acotar la lista.</w:t>
       </w:r>
     </w:p>
     <w:p>
@@ -6599,30 +6611,7 @@
           <w:sz w:val="21"/>
           <w:szCs w:val="21"/>
         </w:rPr>
-        <w:t xml:space="preserve">Revisar "Ángulos por articulación".</w:t>
-      </w:r>
-    </w:p>
-    <w:p>
-      <w:pPr>
-        <w:spacing w:after="100" w:line="264"/>
-      </w:pPr>
-      <w:r>
-        <w:rPr>
-          <w:b/>
-          <w:bCs/>
-          <w:color w:val="0E7A70"/>
-          <w:sz w:val="21"/>
-          <w:szCs w:val="21"/>
-        </w:rPr>
-        <w:t xml:space="preserve">Paso 5: </w:t>
-      </w:r>
-      <w:r>
-        <w:rPr>
-          <w:color w:val="1F2937"/>
-          <w:sz w:val="21"/>
-          <w:szCs w:val="21"/>
-        </w:rPr>
-        <w:t xml:space="preserve">Presionar Ver video de la sesión para reproducir la grabación del ejercicio realizada por el paciente y presionar Cerrar al terminar.</w:t>
+        <w:t xml:space="preserve">Seleccionar cualquier sesión para abrir su detalle (funcionalidad 7.16).</w:t>
       </w:r>
     </w:p>
     <w:p>
@@ -6660,7 +6649,7 @@
           <w:sz w:val="19"/>
           <w:szCs w:val="19"/>
         </w:rPr>
-        <w:t xml:space="preserve">Figura 14. Detalle de resultado de sesión (vista del fisioterapeuta).</w:t>
+        <w:t xml:space="preserve">Figura 14. Resultados de un paciente: sus sesiones y estados.</w:t>
       </w:r>
     </w:p>
     <w:p>
@@ -6690,7 +6679,7 @@
           <w:sz w:val="21"/>
           <w:szCs w:val="21"/>
         </w:rPr>
-        <w:t xml:space="preserve">El fisioterapeuta cuenta con evidencia objetiva y detallada para decidir qué recomendación registrar.</w:t>
+        <w:t xml:space="preserve">El fisioterapeuta revisa paciente por paciente cómo va cada sesión, sin mezclar resultados de personas distintas.</w:t>
       </w:r>
     </w:p>
     <w:p>
@@ -6725,7 +6714,7 @@
           <w:sz w:val="21"/>
           <w:szCs w:val="21"/>
         </w:rPr>
-        <w:t xml:space="preserve">"No se encontró el resultado de esta sesión."</w:t>
+        <w:t xml:space="preserve">"No hay sesiones que cumplan el filtro."</w:t>
       </w:r>
     </w:p>
     <w:p>
@@ -6741,7 +6730,7 @@
           <w:sz w:val="23"/>
           <w:szCs w:val="23"/>
         </w:rPr>
-        <w:t xml:space="preserve">7.16 Registrar y gestionar recomendaciones terapéuticas</w:t>
+        <w:t xml:space="preserve">7.16 Consultar el detalle de resultado de una sesión (por repetición)</w:t>
       </w:r>
     </w:p>
     <w:p>
@@ -6771,7 +6760,7 @@
           <w:sz w:val="21"/>
           <w:szCs w:val="21"/>
         </w:rPr>
-        <w:t xml:space="preserve">Permite dejar observaciones dirigidas al paciente a partir del resultado de una sesión ya realizada.</w:t>
+        <w:t xml:space="preserve">Muestra el desglose de una sesión: repeticiones completas, promedio, precisión por repetición y el detalle de los errores, como base para registrar una recomendación.</w:t>
       </w:r>
     </w:p>
     <w:p>
@@ -6801,7 +6790,7 @@
           <w:sz w:val="21"/>
           <w:szCs w:val="21"/>
         </w:rPr>
-        <w:t xml:space="preserve">Desde el detalle de resultado de una sesión, sección "Recomendación para el paciente" (registro rápido), o Ver todas las recomendaciones para gestionar el historial completo.</w:t>
+        <w:t xml:space="preserve">Desde "Resultados" o desde el detalle de un paciente, al seleccionar una sesión.</w:t>
       </w:r>
     </w:p>
     <w:p>
@@ -6841,7 +6830,7 @@
           <w:sz w:val="21"/>
           <w:szCs w:val="21"/>
         </w:rPr>
-        <w:t xml:space="preserve">Desde el detalle de resultado de una sesión, escribir el texto en el campo "Escribe una recomendación según lo observado..." y presionar Guardar recomendación.</w:t>
+        <w:t xml:space="preserve">Seleccionar una sesión del paciente.</w:t>
       </w:r>
     </w:p>
     <w:p>
@@ -6864,7 +6853,7 @@
           <w:sz w:val="21"/>
           <w:szCs w:val="21"/>
         </w:rPr>
-        <w:t xml:space="preserve">Para revisar, editar o eliminar recomendaciones anteriores de esa sesión, presionar Ver todas las recomendaciones.</w:t>
+        <w:t xml:space="preserve">Revisar las tarjetas Repeticiones completas y Promedio correcto.</w:t>
       </w:r>
     </w:p>
     <w:p>
@@ -6887,7 +6876,7 @@
           <w:sz w:val="21"/>
           <w:szCs w:val="21"/>
         </w:rPr>
-        <w:t xml:space="preserve">En la pantalla "Recomendaciones", presionar Nueva recomendación (o seleccionar Editar desde el menú "⋮" de una existente), completar el campo Recomendación y presionar Registrar (o Guardar cambios).</w:t>
+        <w:t xml:space="preserve">En "Detalle por repetición", alternar entre Mostrar lista y Mostrar gráfico. La lista muestra solo las repeticiones con algún error, indicando el segundo en que ocurrió y el ángulo detectado frente al esperado (por ejemplo, "Segundo 15 — ángulo incorrecto: 120° (esperado 90°)"); las repeticiones sin error se resumen en una sola línea.</w:t>
       </w:r>
     </w:p>
     <w:p>
@@ -6910,7 +6899,53 @@
           <w:sz w:val="21"/>
           <w:szCs w:val="21"/>
         </w:rPr>
-        <w:t xml:space="preserve">Para eliminar una recomendación, usar Eliminar en su menú "⋮" y confirmar en el cuadro de diálogo.</w:t>
+        <w:t xml:space="preserve">Presionar Ver más repeticiones para abrir el listado completo en una ventana.</w:t>
+      </w:r>
+    </w:p>
+    <w:p>
+      <w:pPr>
+        <w:spacing w:after="100" w:line="264"/>
+      </w:pPr>
+      <w:r>
+        <w:rPr>
+          <w:b/>
+          <w:bCs/>
+          <w:color w:val="0E7A70"/>
+          <w:sz w:val="21"/>
+          <w:szCs w:val="21"/>
+        </w:rPr>
+        <w:t xml:space="preserve">Paso 5: </w:t>
+      </w:r>
+      <w:r>
+        <w:rPr>
+          <w:color w:val="1F2937"/>
+          <w:sz w:val="21"/>
+          <w:szCs w:val="21"/>
+        </w:rPr>
+        <w:t xml:space="preserve">Presionar Ver video de la sesión para reproducir la grabación del ejercicio realizada por el paciente.</w:t>
+      </w:r>
+    </w:p>
+    <w:p>
+      <w:pPr>
+        <w:spacing w:after="100" w:line="264"/>
+      </w:pPr>
+      <w:r>
+        <w:rPr>
+          <w:b/>
+          <w:bCs/>
+          <w:color w:val="0E7A70"/>
+          <w:sz w:val="21"/>
+          <w:szCs w:val="21"/>
+        </w:rPr>
+        <w:t xml:space="preserve">Paso 6: </w:t>
+      </w:r>
+      <w:r>
+        <w:rPr>
+          <w:color w:val="1F2937"/>
+          <w:sz w:val="21"/>
+          <w:szCs w:val="21"/>
+        </w:rPr>
+        <w:t xml:space="preserve">Escribir la recomendación en el campo de la parte inferior (funcionalidad 7.17).</w:t>
       </w:r>
     </w:p>
     <w:p>
@@ -6948,7 +6983,7 @@
           <w:sz w:val="19"/>
           <w:szCs w:val="19"/>
         </w:rPr>
-        <w:t xml:space="preserve">Figura 15. Pantalla "Recomendaciones" de una sesión.</w:t>
+        <w:t xml:space="preserve">Figura 15. Detalle de resultado de sesión (vista del fisioterapeuta).</w:t>
       </w:r>
     </w:p>
     <w:p>
@@ -6978,7 +7013,7 @@
           <w:sz w:val="21"/>
           <w:szCs w:val="21"/>
         </w:rPr>
-        <w:t xml:space="preserve">La recomendación queda visible de inmediato para el paciente, en el resultado de esa misma sesión.</w:t>
+        <w:t xml:space="preserve">El fisioterapeuta cuenta con evidencia objetiva y detallada, incluido el video, para decidir qué recomendación registrar.</w:t>
       </w:r>
     </w:p>
     <w:p>
@@ -7013,7 +7048,7 @@
           <w:sz w:val="21"/>
           <w:szCs w:val="21"/>
         </w:rPr>
-        <w:t xml:space="preserve">"Recomendación guardada. El paciente la verá en 'Mis resultados'."</w:t>
+        <w:t xml:space="preserve">"No se encontró el resultado de esta sesión."</w:t>
       </w:r>
     </w:p>
     <w:p>
@@ -7031,7 +7066,24 @@
           <w:sz w:val="21"/>
           <w:szCs w:val="21"/>
         </w:rPr>
-        <w:t xml:space="preserve">"Todavía no hay recomendaciones para esta sesión."</w:t>
+        <w:t xml:space="preserve">"Video no disponible aún." — si el paciente todavía no subió la grabación.</w:t>
+      </w:r>
+    </w:p>
+    <w:p>
+      <w:pPr>
+        <w:spacing w:after="80" w:before="160"/>
+      </w:pPr>
+      <w:r>
+        <w:rPr>
+          <w:b/>
+          <w:bCs/>
+          <w:i/>
+          <w:iCs/>
+          <w:color w:val="0E7A70"/>
+          <w:sz w:val="21"/>
+          <w:szCs w:val="21"/>
+        </w:rPr>
+        <w:t xml:space="preserve">Consideraciones</w:t>
       </w:r>
     </w:p>
     <w:p>
@@ -7049,7 +7101,7 @@
           <w:sz w:val="21"/>
           <w:szCs w:val="21"/>
         </w:rPr>
-        <w:t xml:space="preserve">Cuadro de confirmación al eliminar: "¿Seguro que deseas eliminarla? Esta acción no se puede deshacer."</w:t>
+        <w:t xml:space="preserve">El video se sube cuando el paciente tiene conexión; puede tardar unos instantes en estar disponible.</w:t>
       </w:r>
     </w:p>
     <w:p>
@@ -7065,7 +7117,7 @@
           <w:sz w:val="23"/>
           <w:szCs w:val="23"/>
         </w:rPr>
-        <w:t xml:space="preserve">7.17 Consultar y editar mi perfil / Cerrar sesión</w:t>
+        <w:t>7.17 Registrar y gestionar recomendaciones terapéuticas</w:t>
       </w:r>
     </w:p>
     <w:p>
@@ -7095,7 +7147,7 @@
           <w:sz w:val="21"/>
           <w:szCs w:val="21"/>
         </w:rPr>
-        <w:t xml:space="preserve">Permite al fisioterapeuta ver su información registrada, actualizar su nombre y cerrar sesión.</w:t>
+        <w:t xml:space="preserve">Permite dejar observaciones dirigidas al paciente a partir del resultado de una sesión ya realizada.</w:t>
       </w:r>
     </w:p>
     <w:p>
@@ -7125,7 +7177,7 @@
           <w:sz w:val="21"/>
           <w:szCs w:val="21"/>
         </w:rPr>
-        <w:t xml:space="preserve">Menú lateral → Perfil.</w:t>
+        <w:t xml:space="preserve">Desde el detalle de resultado de una sesión, sección "Recomendación para el paciente" (registro rápido), o Ver todas las recomendaciones para gestionar el historial completo.</w:t>
       </w:r>
     </w:p>
     <w:p>
@@ -7165,7 +7217,7 @@
           <w:sz w:val="21"/>
           <w:szCs w:val="21"/>
         </w:rPr>
-        <w:t xml:space="preserve">Seleccionar Perfil en el menú lateral.</w:t>
+        <w:t xml:space="preserve">Desde el detalle de resultado de una sesión, escribir el texto en el campo "Escribe una recomendación según lo observado..." y presionar Guardar recomendación.</w:t>
       </w:r>
     </w:p>
     <w:p>
@@ -7188,7 +7240,7 @@
           <w:sz w:val="21"/>
           <w:szCs w:val="21"/>
         </w:rPr>
-        <w:t xml:space="preserve">En "Datos de la cuenta", editar el campo Nombre si se desea y presionar Guardar cambios.</w:t>
+        <w:t xml:space="preserve">Para revisar, editar o eliminar recomendaciones anteriores de esa sesión, presionar Ver todas las recomendaciones.</w:t>
       </w:r>
     </w:p>
     <w:p>
@@ -7211,7 +7263,7 @@
           <w:sz w:val="21"/>
           <w:szCs w:val="21"/>
         </w:rPr>
-        <w:t xml:space="preserve">En "Información de contacto", revisar en modo de solo lectura la edad, el género, el número de contacto, la especialidad y el número de colegiatura.</w:t>
+        <w:t xml:space="preserve">En la pantalla "Recomendaciones", presionar Nueva recomendación (o seleccionar Editar desde el menú "⋮" de una existente), completar el campo Recomendación y presionar Registrar (o Guardar cambios).</w:t>
       </w:r>
     </w:p>
     <w:p>
@@ -7234,331 +7286,7 @@
           <w:sz w:val="21"/>
           <w:szCs w:val="21"/>
         </w:rPr>
-        <w:t xml:space="preserve">Para salir del sistema, presionar Cerrar sesión y confirmar en el cuadro de diálogo.</w:t>
-      </w:r>
-    </w:p>
-    <w:p>
-      <w:pPr>
-        <w:spacing w:after="80" w:before="160"/>
-      </w:pPr>
-      <w:r>
-        <w:rPr>
-          <w:b/>
-          <w:bCs/>
-          <w:i/>
-          <w:iCs/>
-          <w:color w:val="0E7A70"/>
-          <w:sz w:val="21"/>
-          <w:szCs w:val="21"/>
-        </w:rPr>
-        <w:t xml:space="preserve">Resultado</w:t>
-      </w:r>
-    </w:p>
-    <w:p>
-      <w:pPr>
-        <w:spacing w:after="160" w:line="276"/>
-      </w:pPr>
-      <w:r>
-        <w:rPr>
-          <w:color w:val="1F2937"/>
-          <w:sz w:val="21"/>
-          <w:szCs w:val="21"/>
-        </w:rPr>
-        <w:t xml:space="preserve">El fisioterapeuta mantiene actualizado su nombre y puede finalizar su sesión de forma segura.</w:t>
-      </w:r>
-    </w:p>
-    <w:p>
-      <w:pPr>
-        <w:spacing w:after="80" w:before="160"/>
-      </w:pPr>
-      <w:r>
-        <w:rPr>
-          <w:b/>
-          <w:bCs/>
-          <w:i/>
-          <w:iCs/>
-          <w:color w:val="0E7A70"/>
-          <w:sz w:val="21"/>
-          <w:szCs w:val="21"/>
-        </w:rPr>
-        <w:t xml:space="preserve">Mensajes del sistema</w:t>
-      </w:r>
-    </w:p>
-    <w:p>
-      <w:pPr>
-        <w:pStyle w:val="ListParagraph"/>
-        <w:numPr>
-          <w:ilvl w:val="0"/>
-          <w:numId w:val="1"/>
-        </w:numPr>
-        <w:spacing w:after="80" w:line="264"/>
-      </w:pPr>
-      <w:r>
-        <w:rPr>
-          <w:color w:val="1F2937"/>
-          <w:sz w:val="21"/>
-          <w:szCs w:val="21"/>
-        </w:rPr>
-        <w:t xml:space="preserve">"Nombre actualizado."</w:t>
-      </w:r>
-    </w:p>
-    <w:p>
-      <w:pPr>
-        <w:pStyle w:val="ListParagraph"/>
-        <w:numPr>
-          <w:ilvl w:val="0"/>
-          <w:numId w:val="1"/>
-        </w:numPr>
-        <w:spacing w:after="80" w:line="264"/>
-      </w:pPr>
-      <w:r>
-        <w:rPr>
-          <w:color w:val="1F2937"/>
-          <w:sz w:val="21"/>
-          <w:szCs w:val="21"/>
-        </w:rPr>
-        <w:t xml:space="preserve">"No se pudo actualizar el nombre."</w:t>
-      </w:r>
-    </w:p>
-    <w:p>
-      <w:pPr>
-        <w:spacing w:after="80" w:before="160"/>
-      </w:pPr>
-      <w:r>
-        <w:rPr>
-          <w:b/>
-          <w:bCs/>
-          <w:i/>
-          <w:iCs/>
-          <w:color w:val="0E7A70"/>
-          <w:sz w:val="21"/>
-          <w:szCs w:val="21"/>
-        </w:rPr>
-        <w:t xml:space="preserve">Consideraciones</w:t>
-      </w:r>
-    </w:p>
-    <w:p>
-      <w:pPr>
-        <w:pStyle w:val="ListParagraph"/>
-        <w:numPr>
-          <w:ilvl w:val="0"/>
-          <w:numId w:val="1"/>
-        </w:numPr>
-        <w:spacing w:after="80" w:line="264"/>
-      </w:pPr>
-      <w:r>
-        <w:rPr>
-          <w:color w:val="1F2937"/>
-          <w:sz w:val="21"/>
-          <w:szCs w:val="21"/>
-        </w:rPr>
-        <w:t xml:space="preserve">Al igual que en el rol Paciente, Perfil es la única pantalla desde la que el fisioterapeuta puede cerrar sesión.</w:t>
-      </w:r>
-    </w:p>
-    <w:p>
-      <w:r>
-        <w:br w:type="page"/>
-      </w:r>
-    </w:p>
-    <w:p>
-      <w:pPr>
-        <w:pStyle w:val="Heading2"/>
-        <w:spacing w:after="160" w:before="360"/>
-      </w:pPr>
-      <w:r>
-        <w:rPr>
-          <w:b/>
-          <w:bCs/>
-          <w:color w:val="0E7A70"/>
-          <w:sz w:val="26"/>
-          <w:szCs w:val="26"/>
-        </w:rPr>
-        <w:t xml:space="preserve">7.C Funcionalidades del rol Administrador</w:t>
-      </w:r>
-    </w:p>
-    <w:p>
-      <w:pPr>
-        <w:pStyle w:val="Heading3"/>
-        <w:spacing w:after="120" w:before="240"/>
-      </w:pPr>
-      <w:r>
-        <w:rPr>
-          <w:b/>
-          <w:bCs/>
-          <w:color w:val="1F2937"/>
-          <w:sz w:val="23"/>
-          <w:szCs w:val="23"/>
-        </w:rPr>
-        <w:t xml:space="preserve">7.18 Consultar el panel general (Dashboard)</w:t>
-      </w:r>
-    </w:p>
-    <w:p>
-      <w:pPr>
-        <w:spacing w:after="80" w:before="160"/>
-      </w:pPr>
-      <w:r>
-        <w:rPr>
-          <w:b/>
-          <w:bCs/>
-          <w:i/>
-          <w:iCs/>
-          <w:color w:val="0E7A70"/>
-          <w:sz w:val="21"/>
-          <w:szCs w:val="21"/>
-        </w:rPr>
-        <w:t xml:space="preserve">Descripción</w:t>
-      </w:r>
-    </w:p>
-    <w:p>
-      <w:pPr>
-        <w:spacing w:after="160" w:line="276"/>
-      </w:pPr>
-      <w:r>
-        <w:rPr>
-          <w:color w:val="1F2937"/>
-          <w:sz w:val="21"/>
-          <w:szCs w:val="21"/>
-        </w:rPr>
-        <w:t xml:space="preserve">Presenta un resumen ejecutivo del estado general de la clínica: pacientes y fisioterapeutas activos, adherencia terapéutica global, calidad promedio de ejecución y adherencia por fisioterapeuta.</w:t>
-      </w:r>
-    </w:p>
-    <w:p>
-      <w:pPr>
-        <w:spacing w:after="80" w:before="160"/>
-      </w:pPr>
-      <w:r>
-        <w:rPr>
-          <w:b/>
-          <w:bCs/>
-          <w:i/>
-          <w:iCs/>
-          <w:color w:val="0E7A70"/>
-          <w:sz w:val="21"/>
-          <w:szCs w:val="21"/>
-        </w:rPr>
-        <w:t xml:space="preserve">Acceso</w:t>
-      </w:r>
-    </w:p>
-    <w:p>
-      <w:pPr>
-        <w:spacing w:after="160" w:line="276"/>
-      </w:pPr>
-      <w:r>
-        <w:rPr>
-          <w:color w:val="1F2937"/>
-          <w:sz w:val="21"/>
-          <w:szCs w:val="21"/>
-        </w:rPr>
-        <w:t xml:space="preserve">Menú lateral → Dashboard (pantalla de inicio del administrador).</w:t>
-      </w:r>
-    </w:p>
-    <w:p>
-      <w:pPr>
-        <w:spacing w:after="80" w:before="160"/>
-      </w:pPr>
-      <w:r>
-        <w:rPr>
-          <w:b/>
-          <w:bCs/>
-          <w:i/>
-          <w:iCs/>
-          <w:color w:val="0E7A70"/>
-          <w:sz w:val="21"/>
-          <w:szCs w:val="21"/>
-        </w:rPr>
-        <w:t xml:space="preserve">Procedimiento</w:t>
-      </w:r>
-    </w:p>
-    <w:p>
-      <w:pPr>
-        <w:spacing w:after="100" w:line="264"/>
-      </w:pPr>
-      <w:r>
-        <w:rPr>
-          <w:b/>
-          <w:bCs/>
-          <w:color w:val="0E7A70"/>
-          <w:sz w:val="21"/>
-          <w:szCs w:val="21"/>
-        </w:rPr>
-        <w:t xml:space="preserve">Paso 1: </w:t>
-      </w:r>
-      <w:r>
-        <w:rPr>
-          <w:color w:val="1F2937"/>
-          <w:sz w:val="21"/>
-          <w:szCs w:val="21"/>
-        </w:rPr>
-        <w:t xml:space="preserve">Iniciar sesión como administrador; el sistema abre directamente la pantalla "Dashboard".</w:t>
-      </w:r>
-    </w:p>
-    <w:p>
-      <w:pPr>
-        <w:spacing w:after="100" w:line="264"/>
-      </w:pPr>
-      <w:r>
-        <w:rPr>
-          <w:b/>
-          <w:bCs/>
-          <w:color w:val="0E7A70"/>
-          <w:sz w:val="21"/>
-          <w:szCs w:val="21"/>
-        </w:rPr>
-        <w:t xml:space="preserve">Paso 2: </w:t>
-      </w:r>
-      <w:r>
-        <w:rPr>
-          <w:color w:val="1F2937"/>
-          <w:sz w:val="21"/>
-          <w:szCs w:val="21"/>
-        </w:rPr>
-        <w:t xml:space="preserve">Revisar las cuatro tarjetas de estadísticas: Pacientes activos, Fisios activos, Adherencia global y Calidad promedio.</w:t>
-      </w:r>
-    </w:p>
-    <w:p>
-      <w:pPr>
-        <w:spacing w:after="100" w:line="264"/>
-      </w:pPr>
-      <w:r>
-        <w:rPr>
-          <w:b/>
-          <w:bCs/>
-          <w:color w:val="0E7A70"/>
-          <w:sz w:val="21"/>
-          <w:szCs w:val="21"/>
-        </w:rPr>
-        <w:t xml:space="preserve">Paso 3: </w:t>
-      </w:r>
-      <w:r>
-        <w:rPr>
-          <w:color w:val="1F2937"/>
-          <w:sz w:val="21"/>
-          <w:szCs w:val="21"/>
-        </w:rPr>
-        <w:t xml:space="preserve">Revisar el total de sesiones completadas sobre el total asignado.</w:t>
-      </w:r>
-    </w:p>
-    <w:p>
-      <w:pPr>
-        <w:spacing w:after="100" w:line="264"/>
-      </w:pPr>
-      <w:r>
-        <w:rPr>
-          <w:b/>
-          <w:bCs/>
-          <w:color w:val="0E7A70"/>
-          <w:sz w:val="21"/>
-          <w:szCs w:val="21"/>
-        </w:rPr>
-        <w:t xml:space="preserve">Paso 4: </w:t>
-      </w:r>
-      <w:r>
-        <w:rPr>
-          <w:color w:val="1F2937"/>
-          <w:sz w:val="21"/>
-          <w:szCs w:val="21"/>
-        </w:rPr>
-        <w:t xml:space="preserve">Revisar la sección "Adherencia por fisioterapeuta", con el gráfico de barras y el detalle de cada uno.</w:t>
+        <w:t xml:space="preserve">Para eliminar una recomendación, usar Eliminar en su menú "⋮" y confirmar en el cuadro de diálogo.</w:t>
       </w:r>
     </w:p>
     <w:p>
@@ -7596,7 +7324,7 @@
           <w:sz w:val="19"/>
           <w:szCs w:val="19"/>
         </w:rPr>
-        <w:t xml:space="preserve">Figura 16. Dashboard del administrador.</w:t>
+        <w:t>Figura 16. Pantalla "Recomendaciones" de una sesión.</w:t>
       </w:r>
     </w:p>
     <w:p>
@@ -7626,7 +7354,7 @@
           <w:sz w:val="21"/>
           <w:szCs w:val="21"/>
         </w:rPr>
-        <w:t xml:space="preserve">El administrador obtiene, de un solo vistazo, una visión general del funcionamiento de la clínica.</w:t>
+        <w:t xml:space="preserve">La recomendación queda visible de inmediato para el paciente, en el resultado de esa misma sesión.</w:t>
       </w:r>
     </w:p>
     <w:p>
@@ -7661,7 +7389,43 @@
           <w:sz w:val="21"/>
           <w:szCs w:val="21"/>
         </w:rPr>
-        <w:t xml:space="preserve">"Aún no hay sesiones asignadas para calcular adherencia por fisioterapeuta."</w:t>
+        <w:t xml:space="preserve">"Recomendación guardada. El paciente la verá en 'Mis resultados'."</w:t>
+      </w:r>
+    </w:p>
+    <w:p>
+      <w:pPr>
+        <w:pStyle w:val="ListParagraph"/>
+        <w:numPr>
+          <w:ilvl w:val="0"/>
+          <w:numId w:val="1"/>
+        </w:numPr>
+        <w:spacing w:after="80" w:line="264"/>
+      </w:pPr>
+      <w:r>
+        <w:rPr>
+          <w:color w:val="1F2937"/>
+          <w:sz w:val="21"/>
+          <w:szCs w:val="21"/>
+        </w:rPr>
+        <w:t xml:space="preserve">"Todavía no hay recomendaciones para esta sesión."</w:t>
+      </w:r>
+    </w:p>
+    <w:p>
+      <w:pPr>
+        <w:pStyle w:val="ListParagraph"/>
+        <w:numPr>
+          <w:ilvl w:val="0"/>
+          <w:numId w:val="1"/>
+        </w:numPr>
+        <w:spacing w:after="80" w:line="264"/>
+      </w:pPr>
+      <w:r>
+        <w:rPr>
+          <w:color w:val="1F2937"/>
+          <w:sz w:val="21"/>
+          <w:szCs w:val="21"/>
+        </w:rPr>
+        <w:t xml:space="preserve">Cuadro de confirmación al eliminar: "¿Seguro que deseas eliminarla? Esta acción no se puede deshacer."</w:t>
       </w:r>
     </w:p>
     <w:p>
@@ -7677,7 +7441,7 @@
           <w:sz w:val="23"/>
           <w:szCs w:val="23"/>
         </w:rPr>
-        <w:t xml:space="preserve">7.19 Gestionar cuentas de pacientes</w:t>
+        <w:t>7.18 Consultar y editar mi perfil / Cerrar sesión</w:t>
       </w:r>
     </w:p>
     <w:p>
@@ -7707,7 +7471,7 @@
           <w:sz w:val="21"/>
           <w:szCs w:val="21"/>
         </w:rPr>
-        <w:t xml:space="preserve">Permite registrar, editar, activar/desactivar, eliminar y asignar el fisioterapeuta de cada cuenta de paciente.</w:t>
+        <w:t xml:space="preserve">Permite al fisioterapeuta ver su información registrada, actualizar su nombre y cerrar sesión.</w:t>
       </w:r>
     </w:p>
     <w:p>
@@ -7737,7 +7501,7 @@
           <w:sz w:val="21"/>
           <w:szCs w:val="21"/>
         </w:rPr>
-        <w:t xml:space="preserve">Menú lateral → Pacientes.</w:t>
+        <w:t xml:space="preserve">Menú lateral → Perfil.</w:t>
       </w:r>
     </w:p>
     <w:p>
@@ -7777,7 +7541,7 @@
           <w:sz w:val="21"/>
           <w:szCs w:val="21"/>
         </w:rPr>
-        <w:t xml:space="preserve">Seleccionar Pacientes en el menú lateral.</w:t>
+        <w:t xml:space="preserve">Seleccionar Perfil en el menú lateral.</w:t>
       </w:r>
     </w:p>
     <w:p>
@@ -7800,7 +7564,7 @@
           <w:sz w:val="21"/>
           <w:szCs w:val="21"/>
         </w:rPr>
-        <w:t xml:space="preserve">Para registrar uno nuevo, presionar el ícono Registrar paciente y completar Nombre completo, Correo electrónico, Contraseña, DNI, Edad, Género, Número de contacto, Lado afectado y el o los Diagnóstico(s).</w:t>
+        <w:t xml:space="preserve">En "Datos de la cuenta", editar el campo Nombre si se desea y presionar Guardar cambios.</w:t>
       </w:r>
     </w:p>
     <w:p>
@@ -7823,7 +7587,7 @@
           <w:sz w:val="21"/>
           <w:szCs w:val="21"/>
         </w:rPr>
-        <w:t xml:space="preserve">Presionar Crear cuenta (o Guardar cambios si se está editando).</w:t>
+        <w:t xml:space="preserve">En "Información de contacto", revisar en modo de solo lectura la edad, el género, el número de contacto, la especialidad y el número de colegiatura.</w:t>
       </w:r>
     </w:p>
     <w:p>
@@ -7846,7 +7610,239 @@
           <w:sz w:val="21"/>
           <w:szCs w:val="21"/>
         </w:rPr>
-        <w:t xml:space="preserve">Para asignar el fisioterapeuta de un paciente sin uno asignado, presionar Asignar fisioterapeuta en su tarjeta y seleccionarlo de la lista.</w:t>
+        <w:t xml:space="preserve">Para salir del sistema, presionar Cerrar sesión y confirmar en el cuadro de diálogo.</w:t>
+      </w:r>
+    </w:p>
+    <w:p>
+      <w:pPr>
+        <w:spacing w:after="80" w:before="160"/>
+      </w:pPr>
+      <w:r>
+        <w:rPr>
+          <w:b/>
+          <w:bCs/>
+          <w:i/>
+          <w:iCs/>
+          <w:color w:val="0E7A70"/>
+          <w:sz w:val="21"/>
+          <w:szCs w:val="21"/>
+        </w:rPr>
+        <w:t xml:space="preserve">Resultado</w:t>
+      </w:r>
+    </w:p>
+    <w:p>
+      <w:pPr>
+        <w:spacing w:after="160" w:line="276"/>
+      </w:pPr>
+      <w:r>
+        <w:rPr>
+          <w:color w:val="1F2937"/>
+          <w:sz w:val="21"/>
+          <w:szCs w:val="21"/>
+        </w:rPr>
+        <w:t xml:space="preserve">El fisioterapeuta mantiene actualizado su nombre y puede finalizar su sesión de forma segura.</w:t>
+      </w:r>
+    </w:p>
+    <w:p>
+      <w:pPr>
+        <w:spacing w:after="80" w:before="160"/>
+      </w:pPr>
+      <w:r>
+        <w:rPr>
+          <w:b/>
+          <w:bCs/>
+          <w:i/>
+          <w:iCs/>
+          <w:color w:val="0E7A70"/>
+          <w:sz w:val="21"/>
+          <w:szCs w:val="21"/>
+        </w:rPr>
+        <w:t xml:space="preserve">Mensajes del sistema</w:t>
+      </w:r>
+    </w:p>
+    <w:p>
+      <w:pPr>
+        <w:pStyle w:val="ListParagraph"/>
+        <w:numPr>
+          <w:ilvl w:val="0"/>
+          <w:numId w:val="1"/>
+        </w:numPr>
+        <w:spacing w:after="80" w:line="264"/>
+      </w:pPr>
+      <w:r>
+        <w:rPr>
+          <w:color w:val="1F2937"/>
+          <w:sz w:val="21"/>
+          <w:szCs w:val="21"/>
+        </w:rPr>
+        <w:t xml:space="preserve">"Nombre actualizado."</w:t>
+      </w:r>
+    </w:p>
+    <w:p>
+      <w:pPr>
+        <w:pStyle w:val="ListParagraph"/>
+        <w:numPr>
+          <w:ilvl w:val="0"/>
+          <w:numId w:val="1"/>
+        </w:numPr>
+        <w:spacing w:after="80" w:line="264"/>
+      </w:pPr>
+      <w:r>
+        <w:rPr>
+          <w:color w:val="1F2937"/>
+          <w:sz w:val="21"/>
+          <w:szCs w:val="21"/>
+        </w:rPr>
+        <w:t xml:space="preserve">"No se pudo actualizar el nombre."</w:t>
+      </w:r>
+    </w:p>
+    <w:p>
+      <w:pPr>
+        <w:spacing w:after="80" w:before="160"/>
+      </w:pPr>
+      <w:r>
+        <w:rPr>
+          <w:b/>
+          <w:bCs/>
+          <w:i/>
+          <w:iCs/>
+          <w:color w:val="0E7A70"/>
+          <w:sz w:val="21"/>
+          <w:szCs w:val="21"/>
+        </w:rPr>
+        <w:t xml:space="preserve">Consideraciones</w:t>
+      </w:r>
+    </w:p>
+    <w:p>
+      <w:pPr>
+        <w:pStyle w:val="ListParagraph"/>
+        <w:numPr>
+          <w:ilvl w:val="0"/>
+          <w:numId w:val="1"/>
+        </w:numPr>
+        <w:spacing w:after="80" w:line="264"/>
+      </w:pPr>
+      <w:r>
+        <w:rPr>
+          <w:color w:val="1F2937"/>
+          <w:sz w:val="21"/>
+          <w:szCs w:val="21"/>
+        </w:rPr>
+        <w:t xml:space="preserve">Al igual que en el rol Paciente, Perfil es la única pantalla desde la que el fisioterapeuta puede cerrar sesión.</w:t>
+      </w:r>
+    </w:p>
+    <w:p>
+      <w:r>
+        <w:br w:type="page"/>
+      </w:r>
+    </w:p>
+    <w:p>
+      <w:pPr>
+        <w:pStyle w:val="Heading2"/>
+        <w:spacing w:after="160" w:before="360"/>
+      </w:pPr>
+      <w:r>
+        <w:rPr>
+          <w:b/>
+          <w:bCs/>
+          <w:color w:val="0E7A70"/>
+          <w:sz w:val="26"/>
+          <w:szCs w:val="26"/>
+        </w:rPr>
+        <w:t xml:space="preserve">7.C Funcionalidades del rol Administrador</w:t>
+      </w:r>
+    </w:p>
+    <w:p>
+      <w:pPr>
+        <w:pStyle w:val="Heading3"/>
+        <w:spacing w:after="120" w:before="240"/>
+      </w:pPr>
+      <w:r>
+        <w:rPr>
+          <w:b/>
+          <w:bCs/>
+          <w:color w:val="1F2937"/>
+          <w:sz w:val="23"/>
+          <w:szCs w:val="23"/>
+        </w:rPr>
+        <w:t xml:space="preserve">7.19 Consultar el dashboard de progreso de un paciente</w:t>
+      </w:r>
+    </w:p>
+    <w:p>
+      <w:pPr>
+        <w:spacing w:after="80" w:before="160"/>
+      </w:pPr>
+      <w:r>
+        <w:rPr>
+          <w:b/>
+          <w:bCs/>
+          <w:i/>
+          <w:iCs/>
+          <w:color w:val="0E7A70"/>
+          <w:sz w:val="21"/>
+          <w:szCs w:val="21"/>
+        </w:rPr>
+        <w:t xml:space="preserve">Descripción</w:t>
+      </w:r>
+    </w:p>
+    <w:p>
+      <w:pPr>
+        <w:spacing w:after="160" w:line="276"/>
+      </w:pPr>
+      <w:r>
+        <w:rPr>
+          <w:color w:val="1F2937"/>
+          <w:sz w:val="21"/>
+          <w:szCs w:val="21"/>
+        </w:rPr>
+        <w:t xml:space="preserve">El Dashboard lista a los pacientes de la clínica; al seleccionar uno, el administrador ve su progreso: sesiones ejecutadas, precisión promedio y el detalle de cada sesión, en lista o en gráficos.</w:t>
+      </w:r>
+    </w:p>
+    <w:p>
+      <w:pPr>
+        <w:spacing w:after="80" w:before="160"/>
+      </w:pPr>
+      <w:r>
+        <w:rPr>
+          <w:b/>
+          <w:bCs/>
+          <w:i/>
+          <w:iCs/>
+          <w:color w:val="0E7A70"/>
+          <w:sz w:val="21"/>
+          <w:szCs w:val="21"/>
+        </w:rPr>
+        <w:t xml:space="preserve">Acceso</w:t>
+      </w:r>
+    </w:p>
+    <w:p>
+      <w:pPr>
+        <w:spacing w:after="160" w:line="276"/>
+      </w:pPr>
+      <w:r>
+        <w:rPr>
+          <w:color w:val="1F2937"/>
+          <w:sz w:val="21"/>
+          <w:szCs w:val="21"/>
+        </w:rPr>
+        <w:t xml:space="preserve">Menú lateral → Dashboard (pantalla de inicio del administrador).</w:t>
+      </w:r>
+    </w:p>
+    <w:p>
+      <w:pPr>
+        <w:spacing w:after="80" w:before="160"/>
+      </w:pPr>
+      <w:r>
+        <w:rPr>
+          <w:b/>
+          <w:bCs/>
+          <w:i/>
+          <w:iCs/>
+          <w:color w:val="0E7A70"/>
+          <w:sz w:val="21"/>
+          <w:szCs w:val="21"/>
+        </w:rPr>
+        <w:t xml:space="preserve">Procedimiento</w:t>
       </w:r>
     </w:p>
     <w:p>
@@ -7861,6 +7857,98 @@
           <w:sz w:val="21"/>
           <w:szCs w:val="21"/>
         </w:rPr>
+        <w:t xml:space="preserve">Paso 1: </w:t>
+      </w:r>
+      <w:r>
+        <w:rPr>
+          <w:color w:val="1F2937"/>
+          <w:sz w:val="21"/>
+          <w:szCs w:val="21"/>
+        </w:rPr>
+        <w:t xml:space="preserve">Iniciar sesión como administrador; el sistema abre la pantalla "Dashboard" con la lista de pacientes.</w:t>
+      </w:r>
+    </w:p>
+    <w:p>
+      <w:pPr>
+        <w:spacing w:after="100" w:line="264"/>
+      </w:pPr>
+      <w:r>
+        <w:rPr>
+          <w:b/>
+          <w:bCs/>
+          <w:color w:val="0E7A70"/>
+          <w:sz w:val="21"/>
+          <w:szCs w:val="21"/>
+        </w:rPr>
+        <w:t xml:space="preserve">Paso 2: </w:t>
+      </w:r>
+      <w:r>
+        <w:rPr>
+          <w:color w:val="1F2937"/>
+          <w:sz w:val="21"/>
+          <w:szCs w:val="21"/>
+        </w:rPr>
+        <w:t xml:space="preserve">Seleccionar un paciente; el sistema abre su "Dashboard de paciente".</w:t>
+      </w:r>
+    </w:p>
+    <w:p>
+      <w:pPr>
+        <w:spacing w:after="100" w:line="264"/>
+      </w:pPr>
+      <w:r>
+        <w:rPr>
+          <w:b/>
+          <w:bCs/>
+          <w:color w:val="0E7A70"/>
+          <w:sz w:val="21"/>
+          <w:szCs w:val="21"/>
+        </w:rPr>
+        <w:t xml:space="preserve">Paso 3: </w:t>
+      </w:r>
+      <w:r>
+        <w:rPr>
+          <w:color w:val="1F2937"/>
+          <w:sz w:val="21"/>
+          <w:szCs w:val="21"/>
+        </w:rPr>
+        <w:t xml:space="preserve">Revisar las tarjetas Sesiones ejecutadas y Precisión prom. (promedio de los porcentajes de todas sus sesiones).</w:t>
+      </w:r>
+    </w:p>
+    <w:p>
+      <w:pPr>
+        <w:spacing w:after="100" w:line="264"/>
+      </w:pPr>
+      <w:r>
+        <w:rPr>
+          <w:b/>
+          <w:bCs/>
+          <w:color w:val="0E7A70"/>
+          <w:sz w:val="21"/>
+          <w:szCs w:val="21"/>
+        </w:rPr>
+        <w:t xml:space="preserve">Paso 4: </w:t>
+      </w:r>
+      <w:r>
+        <w:rPr>
+          <w:color w:val="1F2937"/>
+          <w:sz w:val="21"/>
+          <w:szCs w:val="21"/>
+        </w:rPr>
+        <w:t xml:space="preserve">En "Detalle por sesión", revisar la lista: cada sesión indica el ejercicio, la fecha, el porcentaje de repeticiones correctas y el porcentaje completado.</w:t>
+      </w:r>
+    </w:p>
+    <w:p>
+      <w:pPr>
+        <w:spacing w:after="100" w:line="264"/>
+      </w:pPr>
+      <w:r>
+        <w:rPr>
+          <w:b/>
+          <w:bCs/>
+          <w:color w:val="0E7A70"/>
+          <w:sz w:val="21"/>
+          <w:szCs w:val="21"/>
+        </w:rPr>
         <w:t xml:space="preserve">Paso 5: </w:t>
       </w:r>
       <w:r>
@@ -7869,7 +7957,7 @@
           <w:sz w:val="21"/>
           <w:szCs w:val="21"/>
         </w:rPr>
-        <w:t xml:space="preserve">Para desactivar, activar o eliminar una cuenta, usar el menú "⋮" de la tarjeta del paciente y confirmar la acción en el cuadro de diálogo.</w:t>
+        <w:t xml:space="preserve">Presionar Mostrar gráfico para ver la "Tendencia de precisión" (línea, con el número de sesión en el eje horizontal y el porcentaje en el vertical) y el "% completado por sesión" (barras). Presionar Mostrar lista para volver.</w:t>
       </w:r>
     </w:p>
     <w:p>
@@ -7907,7 +7995,7 @@
           <w:sz w:val="19"/>
           <w:szCs w:val="19"/>
         </w:rPr>
-        <w:t xml:space="preserve">Figura 17. Pantalla "Pacientes" del administrador.</w:t>
+        <w:t xml:space="preserve">Figura 17. Dashboard de progreso de un paciente.</w:t>
       </w:r>
     </w:p>
     <w:p>
@@ -7937,7 +8025,7 @@
           <w:sz w:val="21"/>
           <w:szCs w:val="21"/>
         </w:rPr>
-        <w:t xml:space="preserve">La cuenta del paciente queda creada, actualizada o con el estado (activo/inactivo) correspondiente.</w:t>
+        <w:t xml:space="preserve">El administrador conoce el avance real de cada paciente a partir de las sesiones que ejecutó.</w:t>
       </w:r>
     </w:p>
     <w:p>
@@ -7954,7 +8042,7 @@
           <w:sz w:val="21"/>
           <w:szCs w:val="21"/>
         </w:rPr>
-        <w:t xml:space="preserve">Validaciones</w:t>
+        <w:t xml:space="preserve">Mensajes del sistema</w:t>
       </w:r>
     </w:p>
     <w:p>
@@ -7972,7 +8060,7 @@
           <w:sz w:val="21"/>
           <w:szCs w:val="21"/>
         </w:rPr>
-        <w:t xml:space="preserve">"Completa todos los campos requeridos."</w:t>
+        <w:t xml:space="preserve">"Este paciente todavía no ejecutó ninguna sesión."</w:t>
       </w:r>
     </w:p>
     <w:p>
@@ -7989,7 +8077,7 @@
           <w:sz w:val="21"/>
           <w:szCs w:val="21"/>
         </w:rPr>
-        <w:t xml:space="preserve">Mensajes del sistema</w:t>
+        <w:t xml:space="preserve">Consideraciones</w:t>
       </w:r>
     </w:p>
     <w:p>
@@ -8007,132 +8095,7 @@
           <w:sz w:val="21"/>
           <w:szCs w:val="21"/>
         </w:rPr>
-        <w:t xml:space="preserve">"Paciente creado." / "Paciente actualizado."</w:t>
-      </w:r>
-    </w:p>
-    <w:p>
-      <w:pPr>
-        <w:pStyle w:val="ListParagraph"/>
-        <w:numPr>
-          <w:ilvl w:val="0"/>
-          <w:numId w:val="1"/>
-        </w:numPr>
-        <w:spacing w:after="80" w:line="264"/>
-      </w:pPr>
-      <w:r>
-        <w:rPr>
-          <w:color w:val="1F2937"/>
-          <w:sz w:val="21"/>
-          <w:szCs w:val="21"/>
-        </w:rPr>
-        <w:t xml:space="preserve">"Aún no hay pacientes registrados."</w:t>
-      </w:r>
-    </w:p>
-    <w:p>
-      <w:pPr>
-        <w:pStyle w:val="ListParagraph"/>
-        <w:numPr>
-          <w:ilvl w:val="0"/>
-          <w:numId w:val="1"/>
-        </w:numPr>
-        <w:spacing w:after="80" w:line="264"/>
-      </w:pPr>
-      <w:r>
-        <w:rPr>
-          <w:color w:val="1F2937"/>
-          <w:sz w:val="21"/>
-          <w:szCs w:val="21"/>
-        </w:rPr>
-        <w:t xml:space="preserve">"¿Seguro que deseas eliminar la cuenta de '[nombre]'?"</w:t>
-      </w:r>
-    </w:p>
-    <w:p>
-      <w:pPr>
-        <w:pStyle w:val="ListParagraph"/>
-        <w:numPr>
-          <w:ilvl w:val="0"/>
-          <w:numId w:val="1"/>
-        </w:numPr>
-        <w:spacing w:after="80" w:line="264"/>
-      </w:pPr>
-      <w:r>
-        <w:rPr>
-          <w:color w:val="1F2937"/>
-          <w:sz w:val="21"/>
-          <w:szCs w:val="21"/>
-        </w:rPr>
-        <w:t xml:space="preserve">"¿Seguro que deseas desactivar la cuenta de '[nombre]'? No podrá iniciar sesión hasta que la actives de nuevo."</w:t>
-      </w:r>
-    </w:p>
-    <w:p>
-      <w:pPr>
-        <w:pStyle w:val="ListParagraph"/>
-        <w:numPr>
-          <w:ilvl w:val="0"/>
-          <w:numId w:val="1"/>
-        </w:numPr>
-        <w:spacing w:after="80" w:line="264"/>
-      </w:pPr>
-      <w:r>
-        <w:rPr>
-          <w:color w:val="1F2937"/>
-          <w:sz w:val="21"/>
-          <w:szCs w:val="21"/>
-        </w:rPr>
-        <w:t xml:space="preserve">"¿Seguro que deseas activar la cuenta de '[nombre]'? Podrá volver a iniciar sesión."</w:t>
-      </w:r>
-    </w:p>
-    <w:p>
-      <w:pPr>
-        <w:spacing w:after="80" w:before="160"/>
-      </w:pPr>
-      <w:r>
-        <w:rPr>
-          <w:b/>
-          <w:bCs/>
-          <w:i/>
-          <w:iCs/>
-          <w:color w:val="0E7A70"/>
-          <w:sz w:val="21"/>
-          <w:szCs w:val="21"/>
-        </w:rPr>
-        <w:t xml:space="preserve">Consideraciones</w:t>
-      </w:r>
-    </w:p>
-    <w:p>
-      <w:pPr>
-        <w:pStyle w:val="ListParagraph"/>
-        <w:numPr>
-          <w:ilvl w:val="0"/>
-          <w:numId w:val="1"/>
-        </w:numPr>
-        <w:spacing w:after="80" w:line="264"/>
-      </w:pPr>
-      <w:r>
-        <w:rPr>
-          <w:color w:val="1F2937"/>
-          <w:sz w:val="21"/>
-          <w:szCs w:val="21"/>
-        </w:rPr>
-        <w:t xml:space="preserve">Un paciente ya asignado a un fisioterapeuta no puede reasignarse a otro desde esta pantalla; el sistema asume un solo fisioterapeuta por paciente.</w:t>
-      </w:r>
-    </w:p>
-    <w:p>
-      <w:pPr>
-        <w:pStyle w:val="ListParagraph"/>
-        <w:numPr>
-          <w:ilvl w:val="0"/>
-          <w:numId w:val="1"/>
-        </w:numPr>
-        <w:spacing w:after="80" w:line="264"/>
-      </w:pPr>
-      <w:r>
-        <w:rPr>
-          <w:color w:val="1F2937"/>
-          <w:sz w:val="21"/>
-          <w:szCs w:val="21"/>
-        </w:rPr>
-        <w:t xml:space="preserve">Desactivar una cuenta es reversible y distinto de eliminarla: una cuenta desactivada conserva su historial de sesiones y resultados, pero no puede iniciar sesión hasta reactivarse.</w:t>
+        <w:t xml:space="preserve">Solo se cuentan las sesiones ejecutadas; las sesiones asignadas que aún están por hacer no entran en el promedio.</w:t>
       </w:r>
     </w:p>
     <w:p>
@@ -8148,7 +8111,7 @@
           <w:sz w:val="23"/>
           <w:szCs w:val="23"/>
         </w:rPr>
-        <w:t xml:space="preserve">7.20 Gestionar cuentas de fisioterapeutas</w:t>
+        <w:t>7.20 Gestionar cuentas de pacientes</w:t>
       </w:r>
     </w:p>
     <w:p>
@@ -8178,7 +8141,7 @@
           <w:sz w:val="21"/>
           <w:szCs w:val="21"/>
         </w:rPr>
-        <w:t xml:space="preserve">Permite registrar, editar, activar/desactivar y eliminar las cuentas de los fisioterapeutas de la clínica.</w:t>
+        <w:t xml:space="preserve">Permite registrar, editar, activar/desactivar, eliminar y asignar el fisioterapeuta de cada cuenta de paciente.</w:t>
       </w:r>
     </w:p>
     <w:p>
@@ -8208,7 +8171,7 @@
           <w:sz w:val="21"/>
           <w:szCs w:val="21"/>
         </w:rPr>
-        <w:t xml:space="preserve">Menú lateral → Fisioterapeutas.</w:t>
+        <w:t xml:space="preserve">Menú lateral → Pacientes.</w:t>
       </w:r>
     </w:p>
     <w:p>
@@ -8248,7 +8211,7 @@
           <w:sz w:val="21"/>
           <w:szCs w:val="21"/>
         </w:rPr>
-        <w:t xml:space="preserve">Seleccionar Fisioterapeutas en el menú lateral.</w:t>
+        <w:t xml:space="preserve">Seleccionar Pacientes en el menú lateral.</w:t>
       </w:r>
     </w:p>
     <w:p>
@@ -8271,7 +8234,7 @@
           <w:sz w:val="21"/>
           <w:szCs w:val="21"/>
         </w:rPr>
-        <w:t xml:space="preserve">Para registrar uno nuevo, presionar el ícono Registrar fisioterapeuta y completar Nombre completo, Correo electrónico, Contraseña, Edad, Género, Número de contacto y, opcionalmente, Especialidad y Número de colegiatura.</w:t>
+        <w:t xml:space="preserve">Para registrar uno nuevo, presionar el ícono Registrar paciente y completar Nombre completo, Correo electrónico, Contraseña, DNI, Edad, Género, Número de contacto, Lado afectado y el o los Diagnóstico(s).</w:t>
       </w:r>
     </w:p>
     <w:p>
@@ -8317,7 +8280,30 @@
           <w:sz w:val="21"/>
           <w:szCs w:val="21"/>
         </w:rPr>
-        <w:t xml:space="preserve">Para desactivar, activar o eliminar una cuenta, usar el menú "⋮" de la tarjeta correspondiente y confirmar en el cuadro de diálogo.</w:t>
+        <w:t xml:space="preserve">Para asignar el fisioterapeuta de un paciente sin uno asignado, presionar Asignar fisioterapeuta en su tarjeta y seleccionarlo de la lista.</w:t>
+      </w:r>
+    </w:p>
+    <w:p>
+      <w:pPr>
+        <w:spacing w:after="100" w:line="264"/>
+      </w:pPr>
+      <w:r>
+        <w:rPr>
+          <w:b/>
+          <w:bCs/>
+          <w:color w:val="0E7A70"/>
+          <w:sz w:val="21"/>
+          <w:szCs w:val="21"/>
+        </w:rPr>
+        <w:t xml:space="preserve">Paso 5: </w:t>
+      </w:r>
+      <w:r>
+        <w:rPr>
+          <w:color w:val="1F2937"/>
+          <w:sz w:val="21"/>
+          <w:szCs w:val="21"/>
+        </w:rPr>
+        <w:t xml:space="preserve">Para desactivar, activar o eliminar una cuenta, usar el menú "⋮" de la tarjeta del paciente y confirmar la acción en el cuadro de diálogo.</w:t>
       </w:r>
     </w:p>
     <w:p>
@@ -8355,7 +8341,7 @@
           <w:sz w:val="19"/>
           <w:szCs w:val="19"/>
         </w:rPr>
-        <w:t xml:space="preserve">Figura 18. Pantalla "Fisioterapeutas" del administrador.</w:t>
+        <w:t>Figura 18. Pantalla "Pacientes" del administrador.</w:t>
       </w:r>
     </w:p>
     <w:p>
@@ -8385,7 +8371,7 @@
           <w:sz w:val="21"/>
           <w:szCs w:val="21"/>
         </w:rPr>
-        <w:t xml:space="preserve">La cuenta del fisioterapeuta queda creada, actualizada o con el estado correspondiente. Cada tarjeta muestra además cuántos pacientes tiene asignados.</w:t>
+        <w:t xml:space="preserve">La cuenta del paciente queda creada, actualizada o con el estado (activo/inactivo) correspondiente.</w:t>
       </w:r>
     </w:p>
     <w:p>
@@ -8455,7 +8441,7 @@
           <w:sz w:val="21"/>
           <w:szCs w:val="21"/>
         </w:rPr>
-        <w:t xml:space="preserve">"Fisioterapeuta creado." / "Fisioterapeuta actualizado."</w:t>
+        <w:t xml:space="preserve">"Paciente creado." / "Paciente actualizado."</w:t>
       </w:r>
     </w:p>
     <w:p>
@@ -8473,7 +8459,114 @@
           <w:sz w:val="21"/>
           <w:szCs w:val="21"/>
         </w:rPr>
-        <w:t xml:space="preserve">"Aún no hay fisioterapeutas registrados."</w:t>
+        <w:t xml:space="preserve">"Aún no hay pacientes registrados."</w:t>
+      </w:r>
+    </w:p>
+    <w:p>
+      <w:pPr>
+        <w:pStyle w:val="ListParagraph"/>
+        <w:numPr>
+          <w:ilvl w:val="0"/>
+          <w:numId w:val="1"/>
+        </w:numPr>
+        <w:spacing w:after="80" w:line="264"/>
+      </w:pPr>
+      <w:r>
+        <w:rPr>
+          <w:color w:val="1F2937"/>
+          <w:sz w:val="21"/>
+          <w:szCs w:val="21"/>
+        </w:rPr>
+        <w:t xml:space="preserve">"¿Seguro que deseas eliminar la cuenta de '[nombre]'?"</w:t>
+      </w:r>
+    </w:p>
+    <w:p>
+      <w:pPr>
+        <w:pStyle w:val="ListParagraph"/>
+        <w:numPr>
+          <w:ilvl w:val="0"/>
+          <w:numId w:val="1"/>
+        </w:numPr>
+        <w:spacing w:after="80" w:line="264"/>
+      </w:pPr>
+      <w:r>
+        <w:rPr>
+          <w:color w:val="1F2937"/>
+          <w:sz w:val="21"/>
+          <w:szCs w:val="21"/>
+        </w:rPr>
+        <w:t xml:space="preserve">"¿Seguro que deseas desactivar la cuenta de '[nombre]'? No podrá iniciar sesión hasta que la actives de nuevo."</w:t>
+      </w:r>
+    </w:p>
+    <w:p>
+      <w:pPr>
+        <w:pStyle w:val="ListParagraph"/>
+        <w:numPr>
+          <w:ilvl w:val="0"/>
+          <w:numId w:val="1"/>
+        </w:numPr>
+        <w:spacing w:after="80" w:line="264"/>
+      </w:pPr>
+      <w:r>
+        <w:rPr>
+          <w:color w:val="1F2937"/>
+          <w:sz w:val="21"/>
+          <w:szCs w:val="21"/>
+        </w:rPr>
+        <w:t xml:space="preserve">"¿Seguro que deseas activar la cuenta de '[nombre]'? Podrá volver a iniciar sesión."</w:t>
+      </w:r>
+    </w:p>
+    <w:p>
+      <w:pPr>
+        <w:spacing w:after="80" w:before="160"/>
+      </w:pPr>
+      <w:r>
+        <w:rPr>
+          <w:b/>
+          <w:bCs/>
+          <w:i/>
+          <w:iCs/>
+          <w:color w:val="0E7A70"/>
+          <w:sz w:val="21"/>
+          <w:szCs w:val="21"/>
+        </w:rPr>
+        <w:t xml:space="preserve">Consideraciones</w:t>
+      </w:r>
+    </w:p>
+    <w:p>
+      <w:pPr>
+        <w:pStyle w:val="ListParagraph"/>
+        <w:numPr>
+          <w:ilvl w:val="0"/>
+          <w:numId w:val="1"/>
+        </w:numPr>
+        <w:spacing w:after="80" w:line="264"/>
+      </w:pPr>
+      <w:r>
+        <w:rPr>
+          <w:color w:val="1F2937"/>
+          <w:sz w:val="21"/>
+          <w:szCs w:val="21"/>
+        </w:rPr>
+        <w:t xml:space="preserve">Un paciente ya asignado a un fisioterapeuta no puede reasignarse a otro desde esta pantalla; el sistema asume un solo fisioterapeuta por paciente.</w:t>
+      </w:r>
+    </w:p>
+    <w:p>
+      <w:pPr>
+        <w:pStyle w:val="ListParagraph"/>
+        <w:numPr>
+          <w:ilvl w:val="0"/>
+          <w:numId w:val="1"/>
+        </w:numPr>
+        <w:spacing w:after="80" w:line="264"/>
+      </w:pPr>
+      <w:r>
+        <w:rPr>
+          <w:color w:val="1F2937"/>
+          <w:sz w:val="21"/>
+          <w:szCs w:val="21"/>
+        </w:rPr>
+        <w:t xml:space="preserve">Desactivar una cuenta es reversible y distinto de eliminarla: una cuenta desactivada conserva su historial de sesiones y resultados, pero no puede iniciar sesión hasta reactivarse.</w:t>
       </w:r>
     </w:p>
     <w:p>
@@ -8489,7 +8582,348 @@
           <w:sz w:val="23"/>
           <w:szCs w:val="23"/>
         </w:rPr>
-        <w:t xml:space="preserve">7.21 Cerrar sesión</w:t>
+        <w:t>7.21 Gestionar cuentas de fisioterapeutas</w:t>
+      </w:r>
+    </w:p>
+    <w:p>
+      <w:pPr>
+        <w:spacing w:after="80" w:before="160"/>
+      </w:pPr>
+      <w:r>
+        <w:rPr>
+          <w:b/>
+          <w:bCs/>
+          <w:i/>
+          <w:iCs/>
+          <w:color w:val="0E7A70"/>
+          <w:sz w:val="21"/>
+          <w:szCs w:val="21"/>
+        </w:rPr>
+        <w:t xml:space="preserve">Descripción</w:t>
+      </w:r>
+    </w:p>
+    <w:p>
+      <w:pPr>
+        <w:spacing w:after="160" w:line="276"/>
+      </w:pPr>
+      <w:r>
+        <w:rPr>
+          <w:color w:val="1F2937"/>
+          <w:sz w:val="21"/>
+          <w:szCs w:val="21"/>
+        </w:rPr>
+        <w:t xml:space="preserve">Permite registrar, editar, activar/desactivar y eliminar las cuentas de los fisioterapeutas de la clínica.</w:t>
+      </w:r>
+    </w:p>
+    <w:p>
+      <w:pPr>
+        <w:spacing w:after="80" w:before="160"/>
+      </w:pPr>
+      <w:r>
+        <w:rPr>
+          <w:b/>
+          <w:bCs/>
+          <w:i/>
+          <w:iCs/>
+          <w:color w:val="0E7A70"/>
+          <w:sz w:val="21"/>
+          <w:szCs w:val="21"/>
+        </w:rPr>
+        <w:t xml:space="preserve">Acceso</w:t>
+      </w:r>
+    </w:p>
+    <w:p>
+      <w:pPr>
+        <w:spacing w:after="160" w:line="276"/>
+      </w:pPr>
+      <w:r>
+        <w:rPr>
+          <w:color w:val="1F2937"/>
+          <w:sz w:val="21"/>
+          <w:szCs w:val="21"/>
+        </w:rPr>
+        <w:t xml:space="preserve">Menú lateral → Fisioterapeutas.</w:t>
+      </w:r>
+    </w:p>
+    <w:p>
+      <w:pPr>
+        <w:spacing w:after="80" w:before="160"/>
+      </w:pPr>
+      <w:r>
+        <w:rPr>
+          <w:b/>
+          <w:bCs/>
+          <w:i/>
+          <w:iCs/>
+          <w:color w:val="0E7A70"/>
+          <w:sz w:val="21"/>
+          <w:szCs w:val="21"/>
+        </w:rPr>
+        <w:t xml:space="preserve">Procedimiento</w:t>
+      </w:r>
+    </w:p>
+    <w:p>
+      <w:pPr>
+        <w:spacing w:after="100" w:line="264"/>
+      </w:pPr>
+      <w:r>
+        <w:rPr>
+          <w:b/>
+          <w:bCs/>
+          <w:color w:val="0E7A70"/>
+          <w:sz w:val="21"/>
+          <w:szCs w:val="21"/>
+        </w:rPr>
+        <w:t xml:space="preserve">Paso 1: </w:t>
+      </w:r>
+      <w:r>
+        <w:rPr>
+          <w:color w:val="1F2937"/>
+          <w:sz w:val="21"/>
+          <w:szCs w:val="21"/>
+        </w:rPr>
+        <w:t xml:space="preserve">Seleccionar Fisioterapeutas en el menú lateral.</w:t>
+      </w:r>
+    </w:p>
+    <w:p>
+      <w:pPr>
+        <w:spacing w:after="100" w:line="264"/>
+      </w:pPr>
+      <w:r>
+        <w:rPr>
+          <w:b/>
+          <w:bCs/>
+          <w:color w:val="0E7A70"/>
+          <w:sz w:val="21"/>
+          <w:szCs w:val="21"/>
+        </w:rPr>
+        <w:t xml:space="preserve">Paso 2: </w:t>
+      </w:r>
+      <w:r>
+        <w:rPr>
+          <w:color w:val="1F2937"/>
+          <w:sz w:val="21"/>
+          <w:szCs w:val="21"/>
+        </w:rPr>
+        <w:t xml:space="preserve">Para registrar uno nuevo, presionar el ícono Registrar fisioterapeuta y completar Nombre completo, Correo electrónico, Contraseña, Edad, Género, Número de contacto y, opcionalmente, Especialidad y Número de colegiatura.</w:t>
+      </w:r>
+    </w:p>
+    <w:p>
+      <w:pPr>
+        <w:spacing w:after="100" w:line="264"/>
+      </w:pPr>
+      <w:r>
+        <w:rPr>
+          <w:b/>
+          <w:bCs/>
+          <w:color w:val="0E7A70"/>
+          <w:sz w:val="21"/>
+          <w:szCs w:val="21"/>
+        </w:rPr>
+        <w:t xml:space="preserve">Paso 3: </w:t>
+      </w:r>
+      <w:r>
+        <w:rPr>
+          <w:color w:val="1F2937"/>
+          <w:sz w:val="21"/>
+          <w:szCs w:val="21"/>
+        </w:rPr>
+        <w:t xml:space="preserve">Presionar Crear cuenta (o Guardar cambios si se está editando).</w:t>
+      </w:r>
+    </w:p>
+    <w:p>
+      <w:pPr>
+        <w:spacing w:after="100" w:line="264"/>
+      </w:pPr>
+      <w:r>
+        <w:rPr>
+          <w:b/>
+          <w:bCs/>
+          <w:color w:val="0E7A70"/>
+          <w:sz w:val="21"/>
+          <w:szCs w:val="21"/>
+        </w:rPr>
+        <w:t xml:space="preserve">Paso 4: </w:t>
+      </w:r>
+      <w:r>
+        <w:rPr>
+          <w:color w:val="1F2937"/>
+          <w:sz w:val="21"/>
+          <w:szCs w:val="21"/>
+        </w:rPr>
+        <w:t xml:space="preserve">Para desactivar, activar o eliminar una cuenta, usar el menú "⋮" de la tarjeta correspondiente y confirmar en el cuadro de diálogo.</w:t>
+      </w:r>
+    </w:p>
+    <w:p>
+      <w:pPr>
+        <w:pBdr>
+          <w:top w:val="dashed" w:color="AAAAAA" w:sz="4" w:space="4"/>
+          <w:bottom w:val="dashed" w:color="AAAAAA" w:sz="4" w:space="4"/>
+          <w:left w:val="dashed" w:color="AAAAAA" w:sz="4" w:space="4"/>
+          <w:right w:val="dashed" w:color="AAAAAA" w:sz="4" w:space="4"/>
+        </w:pBdr>
+        <w:spacing w:after="60" w:before="120"/>
+        <w:jc w:val="center"/>
+      </w:pPr>
+      <w:r>
+        <w:rPr>
+          <w:i/>
+          <w:iCs/>
+          <w:color w:val="6B7280"/>
+          <w:sz w:val="20"/>
+          <w:szCs w:val="20"/>
+        </w:rPr>
+        <w:t xml:space="preserve">[INSERTAR CAPTURA DE PANTALLA]</w:t>
+      </w:r>
+    </w:p>
+    <w:p>
+      <w:pPr>
+        <w:spacing w:after="200"/>
+        <w:jc w:val="center"/>
+      </w:pPr>
+      <w:r>
+        <w:rPr>
+          <w:i/>
+          <w:iCs/>
+          <w:color w:val="6B7280"/>
+          <w:sz w:val="19"/>
+          <w:szCs w:val="19"/>
+        </w:rPr>
+        <w:t>Figura 19. Pantalla "Fisioterapeutas" del administrador.</w:t>
+      </w:r>
+    </w:p>
+    <w:p>
+      <w:pPr>
+        <w:spacing w:after="80" w:before="160"/>
+      </w:pPr>
+      <w:r>
+        <w:rPr>
+          <w:b/>
+          <w:bCs/>
+          <w:i/>
+          <w:iCs/>
+          <w:color w:val="0E7A70"/>
+          <w:sz w:val="21"/>
+          <w:szCs w:val="21"/>
+        </w:rPr>
+        <w:t xml:space="preserve">Resultado</w:t>
+      </w:r>
+    </w:p>
+    <w:p>
+      <w:pPr>
+        <w:spacing w:after="160" w:line="276"/>
+      </w:pPr>
+      <w:r>
+        <w:rPr>
+          <w:color w:val="1F2937"/>
+          <w:sz w:val="21"/>
+          <w:szCs w:val="21"/>
+        </w:rPr>
+        <w:t xml:space="preserve">La cuenta del fisioterapeuta queda creada, actualizada o con el estado correspondiente. Cada tarjeta muestra además cuántos pacientes tiene asignados.</w:t>
+      </w:r>
+    </w:p>
+    <w:p>
+      <w:pPr>
+        <w:spacing w:after="80" w:before="160"/>
+      </w:pPr>
+      <w:r>
+        <w:rPr>
+          <w:b/>
+          <w:bCs/>
+          <w:i/>
+          <w:iCs/>
+          <w:color w:val="0E7A70"/>
+          <w:sz w:val="21"/>
+          <w:szCs w:val="21"/>
+        </w:rPr>
+        <w:t xml:space="preserve">Validaciones</w:t>
+      </w:r>
+    </w:p>
+    <w:p>
+      <w:pPr>
+        <w:pStyle w:val="ListParagraph"/>
+        <w:numPr>
+          <w:ilvl w:val="0"/>
+          <w:numId w:val="1"/>
+        </w:numPr>
+        <w:spacing w:after="80" w:line="264"/>
+      </w:pPr>
+      <w:r>
+        <w:rPr>
+          <w:color w:val="1F2937"/>
+          <w:sz w:val="21"/>
+          <w:szCs w:val="21"/>
+        </w:rPr>
+        <w:t xml:space="preserve">"Completa todos los campos requeridos."</w:t>
+      </w:r>
+    </w:p>
+    <w:p>
+      <w:pPr>
+        <w:spacing w:after="80" w:before="160"/>
+      </w:pPr>
+      <w:r>
+        <w:rPr>
+          <w:b/>
+          <w:bCs/>
+          <w:i/>
+          <w:iCs/>
+          <w:color w:val="0E7A70"/>
+          <w:sz w:val="21"/>
+          <w:szCs w:val="21"/>
+        </w:rPr>
+        <w:t xml:space="preserve">Mensajes del sistema</w:t>
+      </w:r>
+    </w:p>
+    <w:p>
+      <w:pPr>
+        <w:pStyle w:val="ListParagraph"/>
+        <w:numPr>
+          <w:ilvl w:val="0"/>
+          <w:numId w:val="1"/>
+        </w:numPr>
+        <w:spacing w:after="80" w:line="264"/>
+      </w:pPr>
+      <w:r>
+        <w:rPr>
+          <w:color w:val="1F2937"/>
+          <w:sz w:val="21"/>
+          <w:szCs w:val="21"/>
+        </w:rPr>
+        <w:t xml:space="preserve">"Fisioterapeuta creado." / "Fisioterapeuta actualizado."</w:t>
+      </w:r>
+    </w:p>
+    <w:p>
+      <w:pPr>
+        <w:pStyle w:val="ListParagraph"/>
+        <w:numPr>
+          <w:ilvl w:val="0"/>
+          <w:numId w:val="1"/>
+        </w:numPr>
+        <w:spacing w:after="80" w:line="264"/>
+      </w:pPr>
+      <w:r>
+        <w:rPr>
+          <w:color w:val="1F2937"/>
+          <w:sz w:val="21"/>
+          <w:szCs w:val="21"/>
+        </w:rPr>
+        <w:t xml:space="preserve">"Aún no hay fisioterapeutas registrados."</w:t>
+      </w:r>
+    </w:p>
+    <w:p>
+      <w:pPr>
+        <w:pStyle w:val="Heading3"/>
+        <w:spacing w:after="120" w:before="240"/>
+      </w:pPr>
+      <w:r>
+        <w:rPr>
+          <w:b/>
+          <w:bCs/>
+          <w:color w:val="1F2937"/>
+          <w:sz w:val="23"/>
+          <w:szCs w:val="23"/>
+        </w:rPr>
+        <w:t>7.22 Cerrar sesión</w:t>
       </w:r>
     </w:p>
     <w:p>
@@ -9259,7 +9693,7 @@
                 <w:sz w:val="19"/>
                 <w:szCs w:val="19"/>
               </w:rPr>
-              <w:t xml:space="preserve">Consultar resultado de una sesión propia</w:t>
+              <w:t>Ver el resultado al terminar una sesión</w:t>
             </w:r>
           </w:p>
         </w:tc>
@@ -9337,6 +9771,100 @@
         <w:tc>
           <w:tcPr>
             <w:tcW w:type="dxa" w:w="4680"/>
+            <w:shd w:fill="FFFFFF" w:color="auto" w:val="clear"/>
+            <w:tcMar>
+              <w:top w:type="dxa" w:w="100"/>
+              <w:left w:type="dxa" w:w="120"/>
+              <w:bottom w:type="dxa" w:w="100"/>
+              <w:right w:type="dxa" w:w="120"/>
+            </w:tcMar>
+            <w:vAlign w:val="center"/>
+          </w:tcPr>
+          <w:p>
+            <w:r>
+              <w:rPr>
+                <w:color w:val="1F2937"/>
+                <w:sz w:val="19"/>
+                <w:szCs w:val="19"/>
+              </w:rPr>
+              <w:t>Consultar mis resultados y recomendaciones ("Mis resultados")</w:t>
+            </w:r>
+          </w:p>
+        </w:tc>
+        <w:tc>
+          <w:tcPr>
+            <w:tcW w:type="dxa" w:w="1600"/>
+            <w:shd w:fill="FFFFFF" w:color="auto" w:val="clear"/>
+            <w:tcMar>
+              <w:top w:type="dxa" w:w="100"/>
+              <w:left w:type="dxa" w:w="120"/>
+              <w:bottom w:type="dxa" w:w="100"/>
+              <w:right w:type="dxa" w:w="120"/>
+            </w:tcMar>
+            <w:vAlign w:val="center"/>
+          </w:tcPr>
+          <w:p>
+            <w:r>
+              <w:rPr>
+                <w:color w:val="1F2937"/>
+                <w:sz w:val="19"/>
+                <w:szCs w:val="19"/>
+              </w:rPr>
+              <w:t xml:space="preserve">Sí</w:t>
+            </w:r>
+          </w:p>
+        </w:tc>
+        <w:tc>
+          <w:tcPr>
+            <w:tcW w:type="dxa" w:w="1900"/>
+            <w:shd w:fill="FFFFFF" w:color="auto" w:val="clear"/>
+            <w:tcMar>
+              <w:top w:type="dxa" w:w="100"/>
+              <w:left w:type="dxa" w:w="120"/>
+              <w:bottom w:type="dxa" w:w="100"/>
+              <w:right w:type="dxa" w:w="120"/>
+            </w:tcMar>
+            <w:vAlign w:val="center"/>
+          </w:tcPr>
+          <w:p>
+            <w:r>
+              <w:rPr>
+                <w:color w:val="1F2937"/>
+                <w:sz w:val="19"/>
+                <w:szCs w:val="19"/>
+              </w:rPr>
+              <w:t xml:space="preserve">No</w:t>
+            </w:r>
+          </w:p>
+        </w:tc>
+        <w:tc>
+          <w:tcPr>
+            <w:tcW w:type="dxa" w:w="1900"/>
+            <w:shd w:fill="FFFFFF" w:color="auto" w:val="clear"/>
+            <w:tcMar>
+              <w:top w:type="dxa" w:w="100"/>
+              <w:left w:type="dxa" w:w="120"/>
+              <w:bottom w:type="dxa" w:w="100"/>
+              <w:right w:type="dxa" w:w="120"/>
+            </w:tcMar>
+            <w:vAlign w:val="center"/>
+          </w:tcPr>
+          <w:p>
+            <w:r>
+              <w:rPr>
+                <w:color w:val="1F2937"/>
+                <w:sz w:val="19"/>
+                <w:szCs w:val="19"/>
+              </w:rPr>
+              <w:t xml:space="preserve">No</w:t>
+            </w:r>
+          </w:p>
+        </w:tc>
+      </w:tr>
+      <w:tr>
+        <w:tc>
+          <w:tcPr>
+            <w:tcW w:type="dxa" w:w="4680"/>
             <w:shd w:fill="EAF7F5" w:color="auto" w:val="clear"/>
             <w:tcMar>
               <w:top w:type="dxa" w:w="100"/>
@@ -9353,7 +9881,7 @@
                 <w:sz w:val="19"/>
                 <w:szCs w:val="19"/>
               </w:rPr>
-              <w:t xml:space="preserve">Consultar progreso e historial propio</w:t>
+              <w:t>Consultar mi progreso (gráfico de evolución)</w:t>
             </w:r>
           </w:p>
         </w:tc>
@@ -10011,7 +10539,7 @@
                 <w:sz w:val="19"/>
                 <w:szCs w:val="19"/>
               </w:rPr>
-              <w:t xml:space="preserve">Consultar resultados de todos sus pacientes</w:t>
+              <w:t>Consultar resultados por paciente</w:t>
             </w:r>
           </w:p>
         </w:tc>
@@ -10293,7 +10821,7 @@
                 <w:sz w:val="19"/>
                 <w:szCs w:val="19"/>
               </w:rPr>
-              <w:t xml:space="preserve">Consultar Dashboard general</w:t>
+              <w:t>Consultar el dashboard de progreso de un paciente</w:t>
             </w:r>
           </w:p>
         </w:tc>
@@ -10712,7 +11240,7 @@
           <w:sz w:val="21"/>
           <w:szCs w:val="21"/>
         </w:rPr>
-        <w:t xml:space="preserve">Paciente: menú Ejercicios (asignados) o Progreso (historial y resultados).</w:t>
+        <w:t>Paciente: menú Ejercicios (asignados), Resultados (sesiones y recomendaciones) o Progreso (gráfico de evolución).</w:t>
       </w:r>
     </w:p>
     <w:p>
@@ -10730,7 +11258,7 @@
           <w:sz w:val="21"/>
           <w:szCs w:val="21"/>
         </w:rPr>
-        <w:t xml:space="preserve">Fisioterapeuta: menú Pacientes (detalle por paciente) o Resultados (todas las sesiones).</w:t>
+        <w:t>Fisioterapeuta: menú Pacientes (detalle por paciente) o Resultados (paciente → sus sesiones → detalle).</w:t>
       </w:r>
     </w:p>
     <w:p>
@@ -10748,7 +11276,7 @@
           <w:sz w:val="21"/>
           <w:szCs w:val="21"/>
         </w:rPr>
-        <w:t xml:space="preserve">Administrador: Dashboard (estadísticas generales) o Pacientes/Fisioterapeutas (listado de cuentas).</w:t>
+        <w:t>Administrador: Dashboard (progreso de cada paciente) o Pacientes/Fisioterapeutas (listado de cuentas).</w:t>
       </w:r>
     </w:p>
     <w:p>
@@ -10868,7 +11396,7 @@
           <w:sz w:val="21"/>
           <w:szCs w:val="21"/>
         </w:rPr>
-        <w:t xml:space="preserve">Fisioterapeuta: filtros por ejercicio y por período en la pantalla "Resultados".</w:t>
+        <w:t>Fisioterapeuta: campo Buscar paciente... en la pantalla "Pacientes" y filtros por ejercicio y período en "Resultados".</w:t>
       </w:r>
     </w:p>
     <w:p>
@@ -10886,7 +11414,7 @@
           <w:sz w:val="21"/>
           <w:szCs w:val="21"/>
         </w:rPr>
-        <w:t xml:space="preserve">Paciente/Fisioterapeuta: filtro por período en las pantallas de progreso e historial.</w:t>
+        <w:t>Fisioterapeuta: filtros por período y por ejercicio en las sesiones de cada paciente (pantalla "Resultados").</w:t>
       </w:r>
     </w:p>
     <w:p>
@@ -13239,6 +13767,100 @@
                 <w:szCs w:val="19"/>
               </w:rPr>
               <w:t xml:space="preserve">Adrián Castro</w:t>
+            </w:r>
+          </w:p>
+        </w:tc>
+      </w:tr>
+      <w:tr>
+        <w:tc>
+          <w:tcPr>
+            <w:tcW w:type="dxa" w:w="1600"/>
+            <w:shd w:fill="FFFFFF" w:color="auto" w:val="clear"/>
+            <w:tcMar>
+              <w:top w:type="dxa" w:w="100"/>
+              <w:left w:type="dxa" w:w="120"/>
+              <w:bottom w:type="dxa" w:w="100"/>
+              <w:right w:type="dxa" w:w="120"/>
+            </w:tcMar>
+            <w:vAlign w:val="center"/>
+          </w:tcPr>
+          <w:p>
+            <w:r>
+              <w:rPr>
+                <w:color w:val="1F2937"/>
+                <w:sz w:val="19"/>
+                <w:szCs w:val="19"/>
+              </w:rPr>
+              <w:t>1.1</w:t>
+            </w:r>
+          </w:p>
+        </w:tc>
+        <w:tc>
+          <w:tcPr>
+            <w:tcW w:type="dxa" w:w="1800"/>
+            <w:shd w:fill="FFFFFF" w:color="auto" w:val="clear"/>
+            <w:tcMar>
+              <w:top w:type="dxa" w:w="100"/>
+              <w:left w:type="dxa" w:w="120"/>
+              <w:bottom w:type="dxa" w:w="100"/>
+              <w:right w:type="dxa" w:w="120"/>
+            </w:tcMar>
+            <w:vAlign w:val="center"/>
+          </w:tcPr>
+          <w:p>
+            <w:r>
+              <w:rPr>
+                <w:color w:val="1F2937"/>
+                <w:sz w:val="19"/>
+                <w:szCs w:val="19"/>
+              </w:rPr>
+              <w:t>18/09/2026</w:t>
+            </w:r>
+          </w:p>
+        </w:tc>
+        <w:tc>
+          <w:tcPr>
+            <w:tcW w:type="dxa" w:w="4680"/>
+            <w:shd w:fill="FFFFFF" w:color="auto" w:val="clear"/>
+            <w:tcMar>
+              <w:top w:type="dxa" w:w="100"/>
+              <w:left w:type="dxa" w:w="120"/>
+              <w:bottom w:type="dxa" w:w="100"/>
+              <w:right w:type="dxa" w:w="120"/>
+            </w:tcMar>
+            <w:vAlign w:val="center"/>
+          </w:tcPr>
+          <w:p>
+            <w:r>
+              <w:rPr>
+                <w:color w:val="1F2937"/>
+                <w:sz w:val="19"/>
+                <w:szCs w:val="19"/>
+              </w:rPr>
+              <w:t>Se actualizan las pantallas del paciente (detalle del ejercicio, resultado al terminar, Mis resultados, Mi progreso, menú de 4 opciones), Resultados del fisioterapeuta (paciente → sesiones → detalle) y el dashboard por paciente del administrador; se corrigen las referencias entre secciones.</w:t>
+            </w:r>
+          </w:p>
+        </w:tc>
+        <w:tc>
+          <w:tcPr>
+            <w:tcW w:type="dxa" w:w="2000"/>
+            <w:shd w:fill="FFFFFF" w:color="auto" w:val="clear"/>
+            <w:tcMar>
+              <w:top w:type="dxa" w:w="100"/>
+              <w:left w:type="dxa" w:w="120"/>
+              <w:bottom w:type="dxa" w:w="100"/>
+              <w:right w:type="dxa" w:w="120"/>
+            </w:tcMar>
+            <w:vAlign w:val="center"/>
+          </w:tcPr>
+          <w:p>
+            <w:r>
+              <w:rPr>
+                <w:color w:val="1F2937"/>
+                <w:sz w:val="19"/>
+                <w:szCs w:val="19"/>
+              </w:rPr>
+              <w:t>Adrián Castro</w:t>
             </w:r>
           </w:p>
         </w:tc>

</xml_diff>

<commit_message>
Mis resultados: lista de tarjetas de sesiones y detalle en pantalla aparte; HU13, nota de Epica 04 y manual ajustados
</commit_message>
<xml_diff>
--- a/docs/Manual_Usuario_SANNA.docx
+++ b/docs/Manual_Usuario_SANNA.docx
@@ -3380,7 +3380,7 @@
           <w:sz w:val="21"/>
           <w:szCs w:val="21"/>
         </w:rPr>
-        <w:t xml:space="preserve">Muestra la lista de sesiones realizadas, de la más reciente a la más antigua, y el detalle de la sesión seleccionada: repeticiones, promedio, porcentaje de cada repetición y la recomendación que dejó el fisioterapeuta.</w:t>
+        <w:t>Muestra la lista de sesiones realizadas, de la más reciente a la más antigua; al seleccionar una se abre su detalle: repeticiones, promedio, porcentaje de cada repetición y la recomendación que dejó el fisioterapeuta.</w:t>
       </w:r>
     </w:p>
     <w:p>
@@ -3473,7 +3473,7 @@
           <w:sz w:val="21"/>
           <w:szCs w:val="21"/>
         </w:rPr>
-        <w:t xml:space="preserve">En "Sesiones realizadas", revisar la lista; la sesión más reciente aparece seleccionada al abrir la pantalla.</w:t>
+        <w:t>Revisar la lista de "Sesiones realizadas": cada sesión aparece en una tarjeta con el ejercicio, la fecha y el porcentaje de ejecución, de la más reciente a la más antigua.</w:t>
       </w:r>
     </w:p>
     <w:p>
@@ -3496,7 +3496,7 @@
           <w:sz w:val="21"/>
           <w:szCs w:val="21"/>
         </w:rPr>
-        <w:t xml:space="preserve">Seleccionar otra sesión para ver su detalle debajo: tarjetas Repeticiones y Promedio y el "Detalle por repetición".</w:t>
+        <w:t>Seleccionar una tarjeta; el sistema abre el detalle de esa sesión en otra pantalla, con las tarjetas Repeticiones y Promedio y el "Detalle por repetición". Usar la flecha atrás para volver a la lista.</w:t>
       </w:r>
     </w:p>
     <w:p>
@@ -3519,7 +3519,7 @@
           <w:sz w:val="21"/>
           <w:szCs w:val="21"/>
         </w:rPr>
-        <w:t xml:space="preserve">Alternar entre Mostrar gráfico y Mostrar lista para ver la precisión de cada repetición como barras o como filas.</w:t>
+        <w:t>En el detalle, alternar entre Mostrar gráfico y Mostrar lista para ver la precisión de cada repetición como barras o como filas.</w:t>
       </w:r>
     </w:p>
     <w:p>

</xml_diff>

<commit_message>
Progreso: grafico de barras por sesion debajo de la evolucion (paciente) y mismo bloque en el detalle de paciente del fisio
</commit_message>
<xml_diff>
--- a/docs/Manual_Usuario_SANNA.docx
+++ b/docs/Manual_Usuario_SANNA.docx
@@ -3865,6 +3865,29 @@
     </w:p>
     <w:p>
       <w:pPr>
+        <w:spacing w:after="100" w:line="264"/>
+      </w:pPr>
+      <w:r>
+        <w:rPr>
+          <w:b/>
+          <w:bCs/>
+          <w:color w:val="0E7A70"/>
+          <w:sz w:val="21"/>
+          <w:szCs w:val="21"/>
+        </w:rPr>
+        <w:t xml:space="preserve">Paso 4: </w:t>
+      </w:r>
+      <w:r>
+        <w:rPr>
+          <w:color w:val="1F2937"/>
+          <w:sz w:val="21"/>
+          <w:szCs w:val="21"/>
+        </w:rPr>
+        <w:t>Revisar debajo el gráfico de barras "Precisión por sesión": una barra por sesión, en verde si alcanzó 75 % o más y en ámbar si no.</w:t>
+      </w:r>
+    </w:p>
+    <w:p>
+      <w:pPr>
         <w:pBdr>
           <w:top w:val="dashed" w:color="AAAAAA" w:sz="4" w:space="4"/>
           <w:bottom w:val="dashed" w:color="AAAAAA" w:sz="4" w:space="4"/>
@@ -4846,6 +4869,29 @@
           <w:sz w:val="21"/>
           <w:szCs w:val="21"/>
         </w:rPr>
+        <w:t>Revisar "Evolución por sesión" (línea) y "Precisión por sesión" (barras): muestran el porcentaje de cada sesión completada del paciente, de la más antigua a la más reciente.</w:t>
+      </w:r>
+    </w:p>
+    <w:p>
+      <w:pPr>
+        <w:spacing w:after="100" w:line="264"/>
+      </w:pPr>
+      <w:r>
+        <w:rPr>
+          <w:b/>
+          <w:bCs/>
+          <w:color w:val="0E7A70"/>
+          <w:sz w:val="21"/>
+          <w:szCs w:val="21"/>
+        </w:rPr>
+        <w:t xml:space="preserve">Paso 4: </w:t>
+      </w:r>
+      <w:r>
+        <w:rPr>
+          <w:color w:val="1F2937"/>
+          <w:sz w:val="21"/>
+          <w:szCs w:val="21"/>
+        </w:rPr>
         <w:t xml:space="preserve">Revisar la sección "Progreso por ejercicio", que agrupa el promedio de ejecución por cada ejercicio asignado.</w:t>
       </w:r>
     </w:p>
@@ -4861,7 +4907,7 @@
           <w:sz w:val="21"/>
           <w:szCs w:val="21"/>
         </w:rPr>
-        <w:t xml:space="preserve">Paso 4: </w:t>
+        <w:t xml:space="preserve">Paso 5: </w:t>
       </w:r>
       <w:r>
         <w:rPr>
@@ -4884,7 +4930,7 @@
           <w:sz w:val="21"/>
           <w:szCs w:val="21"/>
         </w:rPr>
-        <w:t xml:space="preserve">Paso 5: </w:t>
+        <w:t xml:space="preserve">Paso 6: </w:t>
       </w:r>
       <w:r>
         <w:rPr>

</xml_diff>

<commit_message>
Analisis del sistema: pantallas, HUs actualizadas, backlog y contenido del manual; corrige mensajes del manual
</commit_message>
<xml_diff>
--- a/docs/Manual_Usuario_SANNA.docx
+++ b/docs/Manual_Usuario_SANNA.docx
@@ -3650,6 +3650,23 @@
     </w:p>
     <w:p>
       <w:pPr>
+        <w:spacing w:after="80" w:before="160"/>
+      </w:pPr>
+      <w:r>
+        <w:rPr>
+          <w:b/>
+          <w:bCs/>
+          <w:i/>
+          <w:iCs/>
+          <w:color w:val="0E7A70"/>
+          <w:sz w:val="21"/>
+          <w:szCs w:val="21"/>
+        </w:rPr>
+        <w:t xml:space="preserve">Consideraciones</w:t>
+      </w:r>
+    </w:p>
+    <w:p>
+      <w:pPr>
         <w:pStyle w:val="ListParagraph"/>
         <w:numPr>
           <w:ilvl w:val="0"/>
@@ -3663,42 +3680,7 @@
           <w:sz w:val="21"/>
           <w:szCs w:val="21"/>
         </w:rPr>
-        <w:t xml:space="preserve">"Tu fisioterapeuta aún no registró recomendaciones para esta sesión."</w:t>
-      </w:r>
-    </w:p>
-    <w:p>
-      <w:pPr>
-        <w:spacing w:after="80" w:before="160"/>
-      </w:pPr>
-      <w:r>
-        <w:rPr>
-          <w:b/>
-          <w:bCs/>
-          <w:i/>
-          <w:iCs/>
-          <w:color w:val="0E7A70"/>
-          <w:sz w:val="21"/>
-          <w:szCs w:val="21"/>
-        </w:rPr>
-        <w:t xml:space="preserve">Consideraciones</w:t>
-      </w:r>
-    </w:p>
-    <w:p>
-      <w:pPr>
-        <w:pStyle w:val="ListParagraph"/>
-        <w:numPr>
-          <w:ilvl w:val="0"/>
-          <w:numId w:val="1"/>
-        </w:numPr>
-        <w:spacing w:after="80" w:line="264"/>
-      </w:pPr>
-      <w:r>
-        <w:rPr>
-          <w:color w:val="1F2937"/>
-          <w:sz w:val="21"/>
-          <w:szCs w:val="21"/>
-        </w:rPr>
-        <w:t xml:space="preserve">Solo aparecen las recomendaciones que el fisioterapeuta ya guardó; si registra una nueva, se muestra de inmediato.</w:t>
+        <w:t>Solo aparecen las recomendaciones que el fisioterapeuta ya guardó; si la sesión no tiene ninguna, el bloque de recomendación simplemente no se muestra.</w:t>
       </w:r>
     </w:p>
     <w:p>
@@ -6760,7 +6742,7 @@
           <w:sz w:val="21"/>
           <w:szCs w:val="21"/>
         </w:rPr>
-        <w:t xml:space="preserve">"No hay sesiones que cumplan el filtro."</w:t>
+        <w:t>"Este paciente no tiene sesiones que cumplan el filtro."</w:t>
       </w:r>
     </w:p>
     <w:p>

</xml_diff>